<commit_message>
docs: rebuild lab 1 report in the ITiVP structure
</commit_message>
<xml_diff>
--- a/airp/lab1/report/Отчет_ЛР1.docx
+++ b/airp/lab1/report/Отчет_ЛР1.docx
@@ -142,6 +142,15 @@
     <w:p>
       <w:pPr>
         <w:keepLines/>
+        <w:jc w:val="center"/>
+      </w:pPr>
+      <w:r>
+        <w:t>Вариант 2</w:t>
+      </w:r>
+    </w:p>
+    <w:p>
+      <w:pPr>
+        <w:keepLines/>
       </w:pPr>
     </w:p>
     <w:p>
@@ -188,7 +197,7 @@
       </w:pPr>
       <w:r>
         <w:tab/>
-        <w:t>К. А. Хаджинова</w:t>
+        <w:t>К.А. Хаджинова</w:t>
       </w:r>
     </w:p>
     <w:p>
@@ -213,7 +222,7 @@
       </w:r>
       <w:r>
         <w:tab/>
-        <w:t>Ю. О. Герман</w:t>
+        <w:t>Ю.О. Герман</w:t>
       </w:r>
     </w:p>
     <w:p>
@@ -297,13 +306,13 @@
       <w:r>
         <w:fldChar w:fldCharType="separate"/>
       </w:r>
-      <w:hyperlink w:anchor="_Toc242385922" w:history="1">
+      <w:hyperlink w:anchor="_Toc242612903" w:history="1">
         <w:r>
           <w:rPr>
             <w:rStyle w:val="aff8"/>
             <w:noProof/>
           </w:rPr>
-          <w:t>1 ЦЕЛЬ РАБОТЫ</w:t>
+          <w:t>1 Цель работы</w:t>
         </w:r>
         <w:r>
           <w:rPr>
@@ -324,7 +333,7 @@
             <w:noProof/>
             <w:webHidden/>
           </w:rPr>
-          <w:instrText xml:space="preserve"> PAGEREF _Toc242385922 \h </w:instrText>
+          <w:instrText xml:space="preserve"> PAGEREF _Toc242612903 \h </w:instrText>
         </w:r>
         <w:r>
           <w:rPr>
@@ -370,13 +379,13 @@
           <w14:ligatures w14:val="standardContextual"/>
         </w:rPr>
       </w:pPr>
-      <w:hyperlink w:anchor="_Toc242385923" w:history="1">
+      <w:hyperlink w:anchor="_Toc242612904" w:history="1">
         <w:r>
           <w:rPr>
             <w:rStyle w:val="aff8"/>
             <w:noProof/>
           </w:rPr>
-          <w:t>2 ТЕОРЕТИЧЕСКИЕ СВЕДЕНИЯ</w:t>
+          <w:t>2 Ход работы</w:t>
         </w:r>
         <w:r>
           <w:rPr>
@@ -397,7 +406,7 @@
             <w:noProof/>
             <w:webHidden/>
           </w:rPr>
-          <w:instrText xml:space="preserve"> PAGEREF _Toc242385923 \h </w:instrText>
+          <w:instrText xml:space="preserve"> PAGEREF _Toc242612904 \h </w:instrText>
         </w:r>
         <w:r>
           <w:rPr>
@@ -430,7 +439,7 @@
     </w:p>
     <w:p>
       <w:pPr>
-        <w:pStyle w:val="14"/>
+        <w:pStyle w:val="2c"/>
         <w:tabs>
           <w:tab w:val="right" w:leader="dot" w:pos="9345"/>
         </w:tabs>
@@ -443,13 +452,13 @@
           <w14:ligatures w14:val="standardContextual"/>
         </w:rPr>
       </w:pPr>
-      <w:hyperlink w:anchor="_Toc242385924" w:history="1">
+      <w:hyperlink w:anchor="_Toc242612905" w:history="1">
         <w:r>
           <w:rPr>
             <w:rStyle w:val="aff8"/>
             <w:noProof/>
           </w:rPr>
-          <w:t>3 ВЫПОЛНЕНИЕ РАБОТЫ</w:t>
+          <w:t>2.1 Постановка задачи</w:t>
         </w:r>
         <w:r>
           <w:rPr>
@@ -470,7 +479,226 @@
             <w:noProof/>
             <w:webHidden/>
           </w:rPr>
-          <w:instrText xml:space="preserve"> PAGEREF _Toc242385924 \h </w:instrText>
+          <w:instrText xml:space="preserve"> PAGEREF _Toc242612905 \h </w:instrText>
+        </w:r>
+        <w:r>
+          <w:rPr>
+            <w:noProof/>
+            <w:webHidden/>
+          </w:rPr>
+        </w:r>
+        <w:r>
+          <w:rPr>
+            <w:noProof/>
+            <w:webHidden/>
+          </w:rPr>
+          <w:fldChar w:fldCharType="separate"/>
+        </w:r>
+        <w:r>
+          <w:rPr>
+            <w:noProof/>
+            <w:webHidden/>
+          </w:rPr>
+          <w:t>4</w:t>
+        </w:r>
+        <w:r>
+          <w:rPr>
+            <w:noProof/>
+            <w:webHidden/>
+          </w:rPr>
+          <w:fldChar w:fldCharType="end"/>
+        </w:r>
+      </w:hyperlink>
+    </w:p>
+    <w:p>
+      <w:pPr>
+        <w:pStyle w:val="2c"/>
+        <w:tabs>
+          <w:tab w:val="right" w:leader="dot" w:pos="9345"/>
+        </w:tabs>
+        <w:rPr>
+          <w:rFonts w:asciiTheme="minorHAnsi" w:eastAsiaTheme="minorEastAsia" w:hAnsiTheme="minorHAnsi"/>
+          <w:noProof/>
+          <w:kern w:val="2"/>
+          <w:sz w:val="24"/>
+          <w:szCs w:val="24"/>
+          <w14:ligatures w14:val="standardContextual"/>
+        </w:rPr>
+      </w:pPr>
+      <w:hyperlink w:anchor="_Toc242612906" w:history="1">
+        <w:r>
+          <w:rPr>
+            <w:rStyle w:val="aff8"/>
+            <w:noProof/>
+          </w:rPr>
+          <w:t>2.2 Теоретические сведения</w:t>
+        </w:r>
+        <w:r>
+          <w:rPr>
+            <w:noProof/>
+            <w:webHidden/>
+          </w:rPr>
+          <w:tab/>
+        </w:r>
+        <w:r>
+          <w:rPr>
+            <w:noProof/>
+            <w:webHidden/>
+          </w:rPr>
+          <w:fldChar w:fldCharType="begin"/>
+        </w:r>
+        <w:r>
+          <w:rPr>
+            <w:noProof/>
+            <w:webHidden/>
+          </w:rPr>
+          <w:instrText xml:space="preserve"> PAGEREF _Toc242612906 \h </w:instrText>
+        </w:r>
+        <w:r>
+          <w:rPr>
+            <w:noProof/>
+            <w:webHidden/>
+          </w:rPr>
+        </w:r>
+        <w:r>
+          <w:rPr>
+            <w:noProof/>
+            <w:webHidden/>
+          </w:rPr>
+          <w:fldChar w:fldCharType="separate"/>
+        </w:r>
+        <w:r>
+          <w:rPr>
+            <w:noProof/>
+            <w:webHidden/>
+          </w:rPr>
+          <w:t>4</w:t>
+        </w:r>
+        <w:r>
+          <w:rPr>
+            <w:noProof/>
+            <w:webHidden/>
+          </w:rPr>
+          <w:fldChar w:fldCharType="end"/>
+        </w:r>
+      </w:hyperlink>
+    </w:p>
+    <w:p>
+      <w:pPr>
+        <w:pStyle w:val="2c"/>
+        <w:tabs>
+          <w:tab w:val="right" w:leader="dot" w:pos="9345"/>
+        </w:tabs>
+        <w:rPr>
+          <w:rFonts w:asciiTheme="minorHAnsi" w:eastAsiaTheme="minorEastAsia" w:hAnsiTheme="minorHAnsi"/>
+          <w:noProof/>
+          <w:kern w:val="2"/>
+          <w:sz w:val="24"/>
+          <w:szCs w:val="24"/>
+          <w14:ligatures w14:val="standardContextual"/>
+        </w:rPr>
+      </w:pPr>
+      <w:hyperlink w:anchor="_Toc242612907" w:history="1">
+        <w:r>
+          <w:rPr>
+            <w:rStyle w:val="aff8"/>
+            <w:noProof/>
+          </w:rPr>
+          <w:t>2.3 Подготовка среды</w:t>
+        </w:r>
+        <w:r>
+          <w:rPr>
+            <w:noProof/>
+            <w:webHidden/>
+          </w:rPr>
+          <w:tab/>
+        </w:r>
+        <w:r>
+          <w:rPr>
+            <w:noProof/>
+            <w:webHidden/>
+          </w:rPr>
+          <w:fldChar w:fldCharType="begin"/>
+        </w:r>
+        <w:r>
+          <w:rPr>
+            <w:noProof/>
+            <w:webHidden/>
+          </w:rPr>
+          <w:instrText xml:space="preserve"> PAGEREF _Toc242612907 \h </w:instrText>
+        </w:r>
+        <w:r>
+          <w:rPr>
+            <w:noProof/>
+            <w:webHidden/>
+          </w:rPr>
+        </w:r>
+        <w:r>
+          <w:rPr>
+            <w:noProof/>
+            <w:webHidden/>
+          </w:rPr>
+          <w:fldChar w:fldCharType="separate"/>
+        </w:r>
+        <w:r>
+          <w:rPr>
+            <w:noProof/>
+            <w:webHidden/>
+          </w:rPr>
+          <w:t>4</w:t>
+        </w:r>
+        <w:r>
+          <w:rPr>
+            <w:noProof/>
+            <w:webHidden/>
+          </w:rPr>
+          <w:fldChar w:fldCharType="end"/>
+        </w:r>
+      </w:hyperlink>
+    </w:p>
+    <w:p>
+      <w:pPr>
+        <w:pStyle w:val="2c"/>
+        <w:tabs>
+          <w:tab w:val="right" w:leader="dot" w:pos="9345"/>
+        </w:tabs>
+        <w:rPr>
+          <w:rFonts w:asciiTheme="minorHAnsi" w:eastAsiaTheme="minorEastAsia" w:hAnsiTheme="minorHAnsi"/>
+          <w:noProof/>
+          <w:kern w:val="2"/>
+          <w:sz w:val="24"/>
+          <w:szCs w:val="24"/>
+          <w14:ligatures w14:val="standardContextual"/>
+        </w:rPr>
+      </w:pPr>
+      <w:hyperlink w:anchor="_Toc242612908" w:history="1">
+        <w:r>
+          <w:rPr>
+            <w:rStyle w:val="aff8"/>
+            <w:noProof/>
+          </w:rPr>
+          <w:t>2.4 Индивидуальное задание и исходные данные</w:t>
+        </w:r>
+        <w:r>
+          <w:rPr>
+            <w:noProof/>
+            <w:webHidden/>
+          </w:rPr>
+          <w:tab/>
+        </w:r>
+        <w:r>
+          <w:rPr>
+            <w:noProof/>
+            <w:webHidden/>
+          </w:rPr>
+          <w:fldChar w:fldCharType="begin"/>
+        </w:r>
+        <w:r>
+          <w:rPr>
+            <w:noProof/>
+            <w:webHidden/>
+          </w:rPr>
+          <w:instrText xml:space="preserve"> PAGEREF _Toc242612908 \h </w:instrText>
         </w:r>
         <w:r>
           <w:rPr>
@@ -516,13 +744,13 @@
           <w14:ligatures w14:val="standardContextual"/>
         </w:rPr>
       </w:pPr>
-      <w:hyperlink w:anchor="_Toc242385925" w:history="1">
+      <w:hyperlink w:anchor="_Toc242612909" w:history="1">
         <w:r>
           <w:rPr>
             <w:rStyle w:val="aff8"/>
             <w:noProof/>
           </w:rPr>
-          <w:t>3.1 Подготовка среды</w:t>
+          <w:t>2.5 Программа</w:t>
         </w:r>
         <w:r>
           <w:rPr>
@@ -543,7 +771,7 @@
             <w:noProof/>
             <w:webHidden/>
           </w:rPr>
-          <w:instrText xml:space="preserve"> PAGEREF _Toc242385925 \h </w:instrText>
+          <w:instrText xml:space="preserve"> PAGEREF _Toc242612909 \h </w:instrText>
         </w:r>
         <w:r>
           <w:rPr>
@@ -589,13 +817,13 @@
           <w14:ligatures w14:val="standardContextual"/>
         </w:rPr>
       </w:pPr>
-      <w:hyperlink w:anchor="_Toc242385926" w:history="1">
+      <w:hyperlink w:anchor="_Toc242612910" w:history="1">
         <w:r>
           <w:rPr>
             <w:rStyle w:val="aff8"/>
             <w:noProof/>
           </w:rPr>
-          <w:t>3.2 Индивидуальное задание и исходные данные</w:t>
+          <w:t>2.6 Результаты работы</w:t>
         </w:r>
         <w:r>
           <w:rPr>
@@ -616,7 +844,7 @@
             <w:noProof/>
             <w:webHidden/>
           </w:rPr>
-          <w:instrText xml:space="preserve"> PAGEREF _Toc242385926 \h </w:instrText>
+          <w:instrText xml:space="preserve"> PAGEREF _Toc242612910 \h </w:instrText>
         </w:r>
         <w:r>
           <w:rPr>
@@ -636,7 +864,7 @@
             <w:noProof/>
             <w:webHidden/>
           </w:rPr>
-          <w:t>5</w:t>
+          <w:t>6</w:t>
         </w:r>
         <w:r>
           <w:rPr>
@@ -649,7 +877,7 @@
     </w:p>
     <w:p>
       <w:pPr>
-        <w:pStyle w:val="2c"/>
+        <w:pStyle w:val="14"/>
         <w:tabs>
           <w:tab w:val="right" w:leader="dot" w:pos="9345"/>
         </w:tabs>
@@ -662,13 +890,13 @@
           <w14:ligatures w14:val="standardContextual"/>
         </w:rPr>
       </w:pPr>
-      <w:hyperlink w:anchor="_Toc242385927" w:history="1">
+      <w:hyperlink w:anchor="_Toc242612911" w:history="1">
         <w:r>
           <w:rPr>
             <w:rStyle w:val="aff8"/>
             <w:noProof/>
           </w:rPr>
-          <w:t>3.3 Программа</w:t>
+          <w:t>3 Ответы на контрольные вопросы</w:t>
         </w:r>
         <w:r>
           <w:rPr>
@@ -689,7 +917,7 @@
             <w:noProof/>
             <w:webHidden/>
           </w:rPr>
-          <w:instrText xml:space="preserve"> PAGEREF _Toc242385927 \h </w:instrText>
+          <w:instrText xml:space="preserve"> PAGEREF _Toc242612911 \h </w:instrText>
         </w:r>
         <w:r>
           <w:rPr>
@@ -709,7 +937,7 @@
             <w:noProof/>
             <w:webHidden/>
           </w:rPr>
-          <w:t>5</w:t>
+          <w:t>9</w:t>
         </w:r>
         <w:r>
           <w:rPr>
@@ -722,7 +950,7 @@
     </w:p>
     <w:p>
       <w:pPr>
-        <w:pStyle w:val="2c"/>
+        <w:pStyle w:val="14"/>
         <w:tabs>
           <w:tab w:val="right" w:leader="dot" w:pos="9345"/>
         </w:tabs>
@@ -735,13 +963,13 @@
           <w14:ligatures w14:val="standardContextual"/>
         </w:rPr>
       </w:pPr>
-      <w:hyperlink w:anchor="_Toc242385928" w:history="1">
+      <w:hyperlink w:anchor="_Toc242612912" w:history="1">
         <w:r>
           <w:rPr>
             <w:rStyle w:val="aff8"/>
             <w:noProof/>
           </w:rPr>
-          <w:t>3.4 Результаты работы</w:t>
+          <w:t>Выводы</w:t>
         </w:r>
         <w:r>
           <w:rPr>
@@ -762,7 +990,7 @@
             <w:noProof/>
             <w:webHidden/>
           </w:rPr>
-          <w:instrText xml:space="preserve"> PAGEREF _Toc242385928 \h </w:instrText>
+          <w:instrText xml:space="preserve"> PAGEREF _Toc242612912 \h </w:instrText>
         </w:r>
         <w:r>
           <w:rPr>
@@ -782,7 +1010,7 @@
             <w:noProof/>
             <w:webHidden/>
           </w:rPr>
-          <w:t>7</w:t>
+          <w:t>10</w:t>
         </w:r>
         <w:r>
           <w:rPr>
@@ -808,13 +1036,13 @@
           <w14:ligatures w14:val="standardContextual"/>
         </w:rPr>
       </w:pPr>
-      <w:hyperlink w:anchor="_Toc242385929" w:history="1">
+      <w:hyperlink w:anchor="_Toc242612913" w:history="1">
         <w:r>
           <w:rPr>
             <w:rStyle w:val="aff8"/>
             <w:noProof/>
           </w:rPr>
-          <w:t>4 КОНТРОЛЬНЫЕ ВОПРОСЫ</w:t>
+          <w:t>Приложение А (обязательное) Листинги программного кода</w:t>
         </w:r>
         <w:r>
           <w:rPr>
@@ -835,7 +1063,7 @@
             <w:noProof/>
             <w:webHidden/>
           </w:rPr>
-          <w:instrText xml:space="preserve"> PAGEREF _Toc242385929 \h </w:instrText>
+          <w:instrText xml:space="preserve"> PAGEREF _Toc242612913 \h </w:instrText>
         </w:r>
         <w:r>
           <w:rPr>
@@ -867,394 +1095,6 @@
       </w:hyperlink>
     </w:p>
     <w:p>
-      <w:pPr>
-        <w:pStyle w:val="2c"/>
-        <w:tabs>
-          <w:tab w:val="right" w:leader="dot" w:pos="9345"/>
-        </w:tabs>
-        <w:rPr>
-          <w:rFonts w:asciiTheme="minorHAnsi" w:eastAsiaTheme="minorEastAsia" w:hAnsiTheme="minorHAnsi"/>
-          <w:noProof/>
-          <w:kern w:val="2"/>
-          <w:sz w:val="24"/>
-          <w:szCs w:val="24"/>
-          <w14:ligatures w14:val="standardContextual"/>
-        </w:rPr>
-      </w:pPr>
-      <w:hyperlink w:anchor="_Toc242385930" w:history="1">
-        <w:r>
-          <w:rPr>
-            <w:rStyle w:val="aff8"/>
-            <w:noProof/>
-          </w:rPr>
-          <w:t xml:space="preserve">4.1 Что такое </w:t>
-        </w:r>
-        <w:r>
-          <w:rPr>
-            <w:rStyle w:val="aff8"/>
-            <w:i/>
-            <w:noProof/>
-          </w:rPr>
-          <w:t>URL</w:t>
-        </w:r>
-        <w:r>
-          <w:rPr>
-            <w:noProof/>
-            <w:webHidden/>
-          </w:rPr>
-          <w:tab/>
-        </w:r>
-        <w:r>
-          <w:rPr>
-            <w:noProof/>
-            <w:webHidden/>
-          </w:rPr>
-          <w:fldChar w:fldCharType="begin"/>
-        </w:r>
-        <w:r>
-          <w:rPr>
-            <w:noProof/>
-            <w:webHidden/>
-          </w:rPr>
-          <w:instrText xml:space="preserve"> PAGEREF _Toc242385930 \h </w:instrText>
-        </w:r>
-        <w:r>
-          <w:rPr>
-            <w:noProof/>
-            <w:webHidden/>
-          </w:rPr>
-        </w:r>
-        <w:r>
-          <w:rPr>
-            <w:noProof/>
-            <w:webHidden/>
-          </w:rPr>
-          <w:fldChar w:fldCharType="separate"/>
-        </w:r>
-        <w:r>
-          <w:rPr>
-            <w:noProof/>
-            <w:webHidden/>
-          </w:rPr>
-          <w:t>11</w:t>
-        </w:r>
-        <w:r>
-          <w:rPr>
-            <w:noProof/>
-            <w:webHidden/>
-          </w:rPr>
-          <w:fldChar w:fldCharType="end"/>
-        </w:r>
-      </w:hyperlink>
-    </w:p>
-    <w:p>
-      <w:pPr>
-        <w:pStyle w:val="2c"/>
-        <w:tabs>
-          <w:tab w:val="right" w:leader="dot" w:pos="9345"/>
-        </w:tabs>
-        <w:rPr>
-          <w:rFonts w:asciiTheme="minorHAnsi" w:eastAsiaTheme="minorEastAsia" w:hAnsiTheme="minorHAnsi"/>
-          <w:noProof/>
-          <w:kern w:val="2"/>
-          <w:sz w:val="24"/>
-          <w:szCs w:val="24"/>
-          <w14:ligatures w14:val="standardContextual"/>
-        </w:rPr>
-      </w:pPr>
-      <w:hyperlink w:anchor="_Toc242385931" w:history="1">
-        <w:r>
-          <w:rPr>
-            <w:rStyle w:val="aff8"/>
-            <w:noProof/>
-          </w:rPr>
-          <w:t>4.2 Как программно получить список всех файлов в папке</w:t>
-        </w:r>
-        <w:r>
-          <w:rPr>
-            <w:noProof/>
-            <w:webHidden/>
-          </w:rPr>
-          <w:tab/>
-        </w:r>
-        <w:r>
-          <w:rPr>
-            <w:noProof/>
-            <w:webHidden/>
-          </w:rPr>
-          <w:fldChar w:fldCharType="begin"/>
-        </w:r>
-        <w:r>
-          <w:rPr>
-            <w:noProof/>
-            <w:webHidden/>
-          </w:rPr>
-          <w:instrText xml:space="preserve"> PAGEREF _Toc242385931 \h </w:instrText>
-        </w:r>
-        <w:r>
-          <w:rPr>
-            <w:noProof/>
-            <w:webHidden/>
-          </w:rPr>
-        </w:r>
-        <w:r>
-          <w:rPr>
-            <w:noProof/>
-            <w:webHidden/>
-          </w:rPr>
-          <w:fldChar w:fldCharType="separate"/>
-        </w:r>
-        <w:r>
-          <w:rPr>
-            <w:noProof/>
-            <w:webHidden/>
-          </w:rPr>
-          <w:t>11</w:t>
-        </w:r>
-        <w:r>
-          <w:rPr>
-            <w:noProof/>
-            <w:webHidden/>
-          </w:rPr>
-          <w:fldChar w:fldCharType="end"/>
-        </w:r>
-      </w:hyperlink>
-    </w:p>
-    <w:p>
-      <w:pPr>
-        <w:pStyle w:val="2c"/>
-        <w:tabs>
-          <w:tab w:val="right" w:leader="dot" w:pos="9345"/>
-        </w:tabs>
-        <w:rPr>
-          <w:rFonts w:asciiTheme="minorHAnsi" w:eastAsiaTheme="minorEastAsia" w:hAnsiTheme="minorHAnsi"/>
-          <w:noProof/>
-          <w:kern w:val="2"/>
-          <w:sz w:val="24"/>
-          <w:szCs w:val="24"/>
-          <w14:ligatures w14:val="standardContextual"/>
-        </w:rPr>
-      </w:pPr>
-      <w:hyperlink w:anchor="_Toc242385932" w:history="1">
-        <w:r>
-          <w:rPr>
-            <w:rStyle w:val="aff8"/>
-            <w:noProof/>
-          </w:rPr>
-          <w:t xml:space="preserve">4.3 Как программно запустить браузер и открыть </w:t>
-        </w:r>
-        <w:r>
-          <w:rPr>
-            <w:rStyle w:val="aff8"/>
-            <w:i/>
-            <w:noProof/>
-          </w:rPr>
-          <w:t>html</w:t>
-        </w:r>
-        <w:r>
-          <w:rPr>
-            <w:rStyle w:val="aff8"/>
-            <w:noProof/>
-          </w:rPr>
-          <w:t>-файл</w:t>
-        </w:r>
-        <w:r>
-          <w:rPr>
-            <w:noProof/>
-            <w:webHidden/>
-          </w:rPr>
-          <w:tab/>
-        </w:r>
-        <w:r>
-          <w:rPr>
-            <w:noProof/>
-            <w:webHidden/>
-          </w:rPr>
-          <w:fldChar w:fldCharType="begin"/>
-        </w:r>
-        <w:r>
-          <w:rPr>
-            <w:noProof/>
-            <w:webHidden/>
-          </w:rPr>
-          <w:instrText xml:space="preserve"> PAGEREF _Toc242385932 \h </w:instrText>
-        </w:r>
-        <w:r>
-          <w:rPr>
-            <w:noProof/>
-            <w:webHidden/>
-          </w:rPr>
-        </w:r>
-        <w:r>
-          <w:rPr>
-            <w:noProof/>
-            <w:webHidden/>
-          </w:rPr>
-          <w:fldChar w:fldCharType="separate"/>
-        </w:r>
-        <w:r>
-          <w:rPr>
-            <w:noProof/>
-            <w:webHidden/>
-          </w:rPr>
-          <w:t>11</w:t>
-        </w:r>
-        <w:r>
-          <w:rPr>
-            <w:noProof/>
-            <w:webHidden/>
-          </w:rPr>
-          <w:fldChar w:fldCharType="end"/>
-        </w:r>
-      </w:hyperlink>
-    </w:p>
-    <w:p>
-      <w:pPr>
-        <w:pStyle w:val="2c"/>
-        <w:tabs>
-          <w:tab w:val="right" w:leader="dot" w:pos="9345"/>
-        </w:tabs>
-        <w:rPr>
-          <w:rFonts w:asciiTheme="minorHAnsi" w:eastAsiaTheme="minorEastAsia" w:hAnsiTheme="minorHAnsi"/>
-          <w:noProof/>
-          <w:kern w:val="2"/>
-          <w:sz w:val="24"/>
-          <w:szCs w:val="24"/>
-          <w14:ligatures w14:val="standardContextual"/>
-        </w:rPr>
-      </w:pPr>
-      <w:hyperlink w:anchor="_Toc242385933" w:history="1">
-        <w:r>
-          <w:rPr>
-            <w:rStyle w:val="aff8"/>
-            <w:noProof/>
-          </w:rPr>
-          <w:t>4.4 Использование потоковых классов в приложении</w:t>
-        </w:r>
-        <w:r>
-          <w:rPr>
-            <w:noProof/>
-            <w:webHidden/>
-          </w:rPr>
-          <w:tab/>
-        </w:r>
-        <w:r>
-          <w:rPr>
-            <w:noProof/>
-            <w:webHidden/>
-          </w:rPr>
-          <w:fldChar w:fldCharType="begin"/>
-        </w:r>
-        <w:r>
-          <w:rPr>
-            <w:noProof/>
-            <w:webHidden/>
-          </w:rPr>
-          <w:instrText xml:space="preserve"> PAGEREF _Toc242385933 \h </w:instrText>
-        </w:r>
-        <w:r>
-          <w:rPr>
-            <w:noProof/>
-            <w:webHidden/>
-          </w:rPr>
-        </w:r>
-        <w:r>
-          <w:rPr>
-            <w:noProof/>
-            <w:webHidden/>
-          </w:rPr>
-          <w:fldChar w:fldCharType="separate"/>
-        </w:r>
-        <w:r>
-          <w:rPr>
-            <w:noProof/>
-            <w:webHidden/>
-          </w:rPr>
-          <w:t>11</w:t>
-        </w:r>
-        <w:r>
-          <w:rPr>
-            <w:noProof/>
-            <w:webHidden/>
-          </w:rPr>
-          <w:fldChar w:fldCharType="end"/>
-        </w:r>
-      </w:hyperlink>
-    </w:p>
-    <w:p>
-      <w:pPr>
-        <w:pStyle w:val="14"/>
-        <w:tabs>
-          <w:tab w:val="right" w:leader="dot" w:pos="9345"/>
-        </w:tabs>
-        <w:rPr>
-          <w:rFonts w:asciiTheme="minorHAnsi" w:eastAsiaTheme="minorEastAsia" w:hAnsiTheme="minorHAnsi"/>
-          <w:noProof/>
-          <w:kern w:val="2"/>
-          <w:sz w:val="24"/>
-          <w:szCs w:val="24"/>
-          <w14:ligatures w14:val="standardContextual"/>
-        </w:rPr>
-      </w:pPr>
-      <w:hyperlink w:anchor="_Toc242385934" w:history="1">
-        <w:r>
-          <w:rPr>
-            <w:rStyle w:val="aff8"/>
-            <w:noProof/>
-          </w:rPr>
-          <w:t>ЗАКЛЮЧЕНИЕ</w:t>
-        </w:r>
-        <w:r>
-          <w:rPr>
-            <w:noProof/>
-            <w:webHidden/>
-          </w:rPr>
-          <w:tab/>
-        </w:r>
-        <w:r>
-          <w:rPr>
-            <w:noProof/>
-            <w:webHidden/>
-          </w:rPr>
-          <w:fldChar w:fldCharType="begin"/>
-        </w:r>
-        <w:r>
-          <w:rPr>
-            <w:noProof/>
-            <w:webHidden/>
-          </w:rPr>
-          <w:instrText xml:space="preserve"> PAGEREF _Toc242385934 \h </w:instrText>
-        </w:r>
-        <w:r>
-          <w:rPr>
-            <w:noProof/>
-            <w:webHidden/>
-          </w:rPr>
-        </w:r>
-        <w:r>
-          <w:rPr>
-            <w:noProof/>
-            <w:webHidden/>
-          </w:rPr>
-          <w:fldChar w:fldCharType="separate"/>
-        </w:r>
-        <w:r>
-          <w:rPr>
-            <w:noProof/>
-            <w:webHidden/>
-          </w:rPr>
-          <w:t>12</w:t>
-        </w:r>
-        <w:r>
-          <w:rPr>
-            <w:noProof/>
-            <w:webHidden/>
-          </w:rPr>
-          <w:fldChar w:fldCharType="end"/>
-        </w:r>
-      </w:hyperlink>
-    </w:p>
-    <w:p>
       <w:r>
         <w:fldChar w:fldCharType="end"/>
       </w:r>
@@ -1269,13 +1109,13 @@
         <w:pStyle w:val="1"/>
         <w:ind w:firstLine="709"/>
       </w:pPr>
-      <w:bookmarkStart w:id="0" w:name="_Toc242385922"/>
+      <w:bookmarkStart w:id="0" w:name="_Toc242612903"/>
       <w:r>
         <w:rPr>
           <w:rFonts w:ascii="Times New Roman" w:hAnsi="Times New Roman"/>
         </w:rPr>
         <w:lastRenderedPageBreak/>
-        <w:t>1 ЦЕЛЬ РАБОТЫ</w:t>
+        <w:t>1 Цель работы</w:t>
       </w:r>
       <w:bookmarkEnd w:id="0"/>
     </w:p>
@@ -1285,7 +1125,25 @@
         <w:jc w:val="both"/>
       </w:pPr>
       <w:r>
-        <w:t xml:space="preserve">Познакомиться с возможностями поиска информации в удаленных </w:t>
+        <w:t xml:space="preserve">Изучить механизмы работы с </w:t>
+      </w:r>
+      <w:r>
+        <w:rPr>
+          <w:i/>
+        </w:rPr>
+        <w:t>Web</w:t>
+      </w:r>
+      <w:r>
+        <w:t xml:space="preserve">-ресурсами в языке </w:t>
+      </w:r>
+      <w:r>
+        <w:rPr>
+          <w:i/>
+        </w:rPr>
+        <w:t>Java</w:t>
+      </w:r>
+      <w:r>
+        <w:t xml:space="preserve">: получение содержимого ресурса по </w:t>
       </w:r>
       <w:r>
         <w:rPr>
@@ -1294,7 +1152,16 @@
         <w:t>URL</w:t>
       </w:r>
       <w:r>
-        <w:t>-ресурсах.</w:t>
+        <w:t xml:space="preserve"> с помощью потоковых классов, программный запуск браузера, получение списка файлов каталога и построение оконного приложения на основе библиотеки </w:t>
+      </w:r>
+      <w:r>
+        <w:rPr>
+          <w:i/>
+        </w:rPr>
+        <w:t>AWT</w:t>
+      </w:r>
+      <w:r>
+        <w:t>. Научиться выполнять индивидуальное задание варианта 2 – поиск названия лекарства по симптомам в файле-справочнике.</w:t>
       </w:r>
     </w:p>
     <w:p>
@@ -1307,13 +1174,13 @@
         <w:pStyle w:val="1"/>
         <w:ind w:firstLine="709"/>
       </w:pPr>
-      <w:bookmarkStart w:id="1" w:name="_Toc242385923"/>
+      <w:bookmarkStart w:id="1" w:name="_Toc242612904"/>
       <w:r>
         <w:rPr>
           <w:rFonts w:ascii="Times New Roman" w:hAnsi="Times New Roman"/>
         </w:rPr>
         <w:lastRenderedPageBreak/>
-        <w:t>2 ТЕОРЕТИЧЕСКИЕ СВЕДЕНИЯ</w:t>
+        <w:t>2 Ход работы</w:t>
       </w:r>
       <w:bookmarkEnd w:id="1"/>
     </w:p>
@@ -1323,7 +1190,76 @@
         <w:jc w:val="both"/>
       </w:pPr>
       <w:r>
-        <w:t xml:space="preserve">Работа посвящена поиску информационных документов по набору ключевых слов. Приложение вводит ключевые слова, находит документ, соответствующий (релевантный) введенному набору, и открывает его в браузере. Источником данных служат ресурсы, адресуемые </w:t>
+        <w:t xml:space="preserve">Работа выполнена на языке </w:t>
+      </w:r>
+      <w:r>
+        <w:rPr>
+          <w:i/>
+        </w:rPr>
+        <w:t>Java</w:t>
+      </w:r>
+      <w:r>
+        <w:t xml:space="preserve"> 17 с использованием библиотеки </w:t>
+      </w:r>
+      <w:r>
+        <w:rPr>
+          <w:i/>
+        </w:rPr>
+        <w:t>AWT</w:t>
+      </w:r>
+      <w:r>
+        <w:t>. Полный текст программы приведен в приложении А. Ниже последовательно описаны постановка задачи, теоретическая основа, реализация заданий и результаты проверки.</w:t>
+      </w:r>
+    </w:p>
+    <w:p>
+      <w:pPr>
+        <w:pStyle w:val="21"/>
+        <w:spacing w:before="360"/>
+        <w:ind w:firstLine="709"/>
+      </w:pPr>
+      <w:bookmarkStart w:id="2" w:name="_Toc242612905"/>
+      <w:r>
+        <w:rPr>
+          <w:rFonts w:ascii="Times New Roman" w:hAnsi="Times New Roman"/>
+        </w:rPr>
+        <w:t>2.1 Постановка задачи</w:t>
+      </w:r>
+      <w:bookmarkEnd w:id="2"/>
+    </w:p>
+    <w:p>
+      <w:pPr>
+        <w:ind w:firstLine="709"/>
+        <w:jc w:val="both"/>
+      </w:pPr>
+      <w:r>
+        <w:t xml:space="preserve">Для изучения работы с </w:t>
+      </w:r>
+      <w:r>
+        <w:rPr>
+          <w:i/>
+        </w:rPr>
+        <w:t>Web</w:t>
+      </w:r>
+      <w:r>
+        <w:t>-ресурсами в рамках работы требуется выполнить следующие задачи:</w:t>
+      </w:r>
+    </w:p>
+    <w:p>
+      <w:pPr>
+        <w:ind w:firstLine="709"/>
+        <w:jc w:val="both"/>
+      </w:pPr>
+      <w:r>
+        <w:t>1 создать оконное приложение на основе заготовки из методических указаний;</w:t>
+      </w:r>
+    </w:p>
+    <w:p>
+      <w:pPr>
+        <w:ind w:firstLine="709"/>
+        <w:jc w:val="both"/>
+      </w:pPr>
+      <w:r>
+        <w:t xml:space="preserve">2 прочитать содержимое файла-справочника через </w:t>
       </w:r>
       <w:r>
         <w:rPr>
@@ -1332,6 +1268,57 @@
         <w:t>URL</w:t>
       </w:r>
       <w:r>
+        <w:t xml:space="preserve"> и потоковые классы;</w:t>
+      </w:r>
+    </w:p>
+    <w:p>
+      <w:pPr>
+        <w:ind w:firstLine="709"/>
+        <w:jc w:val="both"/>
+      </w:pPr>
+      <w:r>
+        <w:t>3 реализовать индивидуальное задание: по введенным симптомам найти название лекарства;</w:t>
+      </w:r>
+    </w:p>
+    <w:p>
+      <w:pPr>
+        <w:ind w:firstLine="709"/>
+        <w:jc w:val="both"/>
+      </w:pPr>
+      <w:r>
+        <w:t>4 вывести результат пользователю в окне приложения.</w:t>
+      </w:r>
+    </w:p>
+    <w:p>
+      <w:pPr>
+        <w:pStyle w:val="21"/>
+        <w:spacing w:before="360"/>
+        <w:ind w:firstLine="709"/>
+      </w:pPr>
+      <w:bookmarkStart w:id="3" w:name="_Toc242612906"/>
+      <w:r>
+        <w:rPr>
+          <w:rFonts w:ascii="Times New Roman" w:hAnsi="Times New Roman"/>
+        </w:rPr>
+        <w:t>2.2 Теоретические сведения</w:t>
+      </w:r>
+      <w:bookmarkEnd w:id="3"/>
+    </w:p>
+    <w:p>
+      <w:pPr>
+        <w:ind w:firstLine="709"/>
+        <w:jc w:val="both"/>
+      </w:pPr>
+      <w:r>
+        <w:t xml:space="preserve">Работа посвящена поиску информационных документов по набору ключевых слов. Приложение вводит ключевые слова, находит документ, соответствующий (релевантный) введенному набору, и открывает его в браузере. Источником данных служат ресурсы, адресуемые </w:t>
+      </w:r>
+      <w:r>
+        <w:rPr>
+          <w:i/>
+        </w:rPr>
+        <w:t>URL</w:t>
+      </w:r>
+      <w:r>
         <w:t xml:space="preserve"> (</w:t>
       </w:r>
       <w:r>
@@ -1516,39 +1503,19 @@
       </w:r>
     </w:p>
     <w:p>
-      <w:r>
-        <w:br w:type="page"/>
-      </w:r>
-    </w:p>
-    <w:p>
-      <w:pPr>
-        <w:pStyle w:val="1"/>
+      <w:pPr>
+        <w:pStyle w:val="21"/>
+        <w:spacing w:before="360"/>
         <w:ind w:firstLine="709"/>
       </w:pPr>
-      <w:bookmarkStart w:id="2" w:name="_Toc242385924"/>
+      <w:bookmarkStart w:id="4" w:name="_Toc242612907"/>
       <w:r>
         <w:rPr>
           <w:rFonts w:ascii="Times New Roman" w:hAnsi="Times New Roman"/>
         </w:rPr>
-        <w:lastRenderedPageBreak/>
-        <w:t>3 ВЫПОЛНЕНИЕ РАБОТЫ</w:t>
-      </w:r>
-      <w:bookmarkEnd w:id="2"/>
-    </w:p>
-    <w:p>
-      <w:pPr>
-        <w:pStyle w:val="21"/>
-        <w:spacing w:before="360"/>
-        <w:ind w:firstLine="709"/>
-      </w:pPr>
-      <w:bookmarkStart w:id="3" w:name="_Toc242385925"/>
-      <w:r>
-        <w:rPr>
-          <w:rFonts w:ascii="Times New Roman" w:hAnsi="Times New Roman"/>
-        </w:rPr>
-        <w:t>3.1 Подготовка среды</w:t>
-      </w:r>
-      <w:bookmarkEnd w:id="3"/>
+        <w:t>2.3 Подготовка среды</w:t>
+      </w:r>
+      <w:bookmarkEnd w:id="4"/>
     </w:p>
     <w:p>
       <w:pPr>
@@ -1628,7 +1595,11 @@
         <w:t>Web_res_lab.java</w:t>
       </w:r>
       <w:r>
-        <w:t xml:space="preserve">. Запуск выполняется из каталога лабораторной работы командой </w:t>
+        <w:t xml:space="preserve">. </w:t>
+      </w:r>
+      <w:r>
+        <w:lastRenderedPageBreak/>
+        <w:t xml:space="preserve">Запуск выполняется из каталога лабораторной работы командой </w:t>
       </w:r>
       <w:r>
         <w:rPr>
@@ -1700,14 +1671,14 @@
         <w:spacing w:before="360"/>
         <w:ind w:firstLine="709"/>
       </w:pPr>
-      <w:bookmarkStart w:id="4" w:name="_Toc242385926"/>
+      <w:bookmarkStart w:id="5" w:name="_Toc242612908"/>
       <w:r>
         <w:rPr>
           <w:rFonts w:ascii="Times New Roman" w:hAnsi="Times New Roman"/>
         </w:rPr>
-        <w:t>3.2 Индивидуальное задание и исходные данные</w:t>
-      </w:r>
-      <w:bookmarkEnd w:id="4"/>
+        <w:t>2.4 Индивидуальное задание и исходные данные</w:t>
+      </w:r>
+      <w:bookmarkEnd w:id="5"/>
     </w:p>
     <w:p>
       <w:pPr>
@@ -1748,10 +1719,29 @@
     <w:p>
       <w:pPr>
         <w:keepNext/>
+        <w:ind w:firstLine="709"/>
+        <w:jc w:val="both"/>
+      </w:pPr>
+      <w:r>
+        <w:t xml:space="preserve">Данные по теме «набор данных </w:t>
+      </w:r>
+      <w:r>
+        <w:rPr>
+          <w:i/>
+        </w:rPr>
+        <w:t>medicines.txt</w:t>
+      </w:r>
+      <w:r>
+        <w:t>» приведены в таблице 2.1.</w:t>
+      </w:r>
+    </w:p>
+    <w:p>
+      <w:pPr>
+        <w:keepNext/>
         <w:spacing w:before="360"/>
       </w:pPr>
       <w:r>
-        <w:t xml:space="preserve">Таблица 3.1 – Набор данных </w:t>
+        <w:t xml:space="preserve">Таблица 2.1 – Набор данных </w:t>
       </w:r>
       <w:r>
         <w:rPr>
@@ -2069,14 +2059,14 @@
         <w:spacing w:before="360"/>
         <w:ind w:firstLine="709"/>
       </w:pPr>
-      <w:bookmarkStart w:id="5" w:name="_Toc242385927"/>
+      <w:bookmarkStart w:id="6" w:name="_Toc242612909"/>
       <w:r>
         <w:rPr>
           <w:rFonts w:ascii="Times New Roman" w:hAnsi="Times New Roman"/>
         </w:rPr>
-        <w:t>3.3 Программа</w:t>
-      </w:r>
-      <w:bookmarkEnd w:id="5"/>
+        <w:t>2.5 Программа</w:t>
+      </w:r>
+      <w:bookmarkEnd w:id="6"/>
     </w:p>
     <w:p>
       <w:pPr>
@@ -2120,11 +2110,7 @@
         <w:t>Search</w:t>
       </w:r>
       <w:r>
-        <w:t xml:space="preserve"> разбивает введенный текст по запятым на ключевые слова, читает список лекарств из файла, для каждой строки подсчитывает число совпадений ключевых слов с симптомами, выводит название и число совпадений в </w:t>
-      </w:r>
-      <w:r>
-        <w:lastRenderedPageBreak/>
-        <w:t xml:space="preserve">текстовую область и открывает в браузере </w:t>
+        <w:t xml:space="preserve"> разбивает введенный текст по запятым на ключевые слова, читает список лекарств из файла, для каждой строки подсчитывает число совпадений ключевых слов с симптомами, выводит название и число совпадений в текстовую область и открывает в браузере </w:t>
       </w:r>
       <w:r>
         <w:rPr>
@@ -2133,313 +2119,9 @@
         <w:t>html</w:t>
       </w:r>
       <w:r>
-        <w:t>-документ лекарства с наибольшим числом совпадений. Основные методы приведены в листингах.</w:t>
-      </w:r>
-    </w:p>
-    <w:p>
-      <w:pPr>
-        <w:keepNext/>
-        <w:ind w:firstLine="709"/>
-        <w:jc w:val="both"/>
-      </w:pPr>
-      <w:r>
-        <w:t xml:space="preserve">Листинг 3.1 – Обработчик кнопки </w:t>
-      </w:r>
-      <w:r>
-        <w:rPr>
-          <w:i/>
-        </w:rPr>
-        <w:t>Search</w:t>
-      </w:r>
-    </w:p>
-    <w:p>
-      <w:pPr>
-        <w:pStyle w:val="Listing"/>
-      </w:pPr>
-      <w:r>
-        <w:t>public void actionPerformed(ActionEvent ae) {</w:t>
-      </w:r>
-    </w:p>
-    <w:p>
-      <w:pPr>
-        <w:pStyle w:val="Listing"/>
-      </w:pPr>
-      <w:r>
-        <w:t xml:space="preserve">    if (ae.getSource() == exitButton) {</w:t>
-      </w:r>
-    </w:p>
-    <w:p>
-      <w:pPr>
-        <w:pStyle w:val="Listing"/>
-      </w:pPr>
-      <w:r>
-        <w:t xml:space="preserve">        System.exit(0);</w:t>
-      </w:r>
-    </w:p>
-    <w:p>
-      <w:pPr>
-        <w:pStyle w:val="Listing"/>
-      </w:pPr>
-      <w:r>
-        <w:t xml:space="preserve">    } else if (ae.getSource() == searchButton) {</w:t>
-      </w:r>
-    </w:p>
-    <w:p>
-      <w:pPr>
-        <w:pStyle w:val="Listing"/>
-      </w:pPr>
-      <w:r>
-        <w:t xml:space="preserve">        // Ключевые слова (симптомы) разделяются запятыми</w:t>
-      </w:r>
-    </w:p>
-    <w:p>
-      <w:pPr>
-        <w:pStyle w:val="Listing"/>
-      </w:pPr>
-      <w:r>
-        <w:t xml:space="preserve">        String[] keywords = textArea.getText().split(",");</w:t>
-      </w:r>
-    </w:p>
-    <w:p>
-      <w:pPr>
-        <w:pStyle w:val="Listing"/>
-      </w:pPr>
-      <w:r>
-        <w:t xml:space="preserve">        textArea.setText("");</w:t>
-      </w:r>
-    </w:p>
-    <w:p>
-      <w:pPr>
-        <w:pStyle w:val="Listing"/>
-      </w:pPr>
-    </w:p>
-    <w:p>
-      <w:pPr>
-        <w:pStyle w:val="Listing"/>
-      </w:pPr>
-      <w:r>
-        <w:t xml:space="preserve">        // Список лекарств читается из текстового файла</w:t>
-      </w:r>
-    </w:p>
-    <w:p>
-      <w:pPr>
-        <w:pStyle w:val="Listing"/>
-      </w:pPr>
-      <w:r>
-        <w:t xml:space="preserve">        File medicinesFile = new File("medicines.txt");</w:t>
-      </w:r>
-    </w:p>
-    <w:p>
-      <w:pPr>
-        <w:pStyle w:val="Listing"/>
-      </w:pPr>
-      <w:r>
-        <w:t xml:space="preserve">        ArrayList&lt;String&gt; medicines = readLines(medicinesFile);</w:t>
-      </w:r>
-    </w:p>
-    <w:p>
-      <w:pPr>
-        <w:pStyle w:val="Listing"/>
-      </w:pPr>
-    </w:p>
-    <w:p>
-      <w:pPr>
-        <w:pStyle w:val="Listing"/>
-      </w:pPr>
-      <w:r>
-        <w:t xml:space="preserve">        String bestName = null;</w:t>
-      </w:r>
-    </w:p>
-    <w:p>
-      <w:pPr>
-        <w:pStyle w:val="Listing"/>
-      </w:pPr>
-      <w:r>
-        <w:t xml:space="preserve">        int bestCount = 0;</w:t>
-      </w:r>
-    </w:p>
-    <w:p>
-      <w:pPr>
-        <w:pStyle w:val="Listing"/>
-      </w:pPr>
-      <w:r>
-        <w:t xml:space="preserve">        for (String line : medicines) {</w:t>
-      </w:r>
-    </w:p>
-    <w:p>
-      <w:pPr>
-        <w:pStyle w:val="Listing"/>
-      </w:pPr>
-      <w:r>
-        <w:t xml:space="preserve">            // Формат строки: Название | симптом1, симптом2, ...</w:t>
-      </w:r>
-    </w:p>
-    <w:p>
-      <w:pPr>
-        <w:pStyle w:val="Listing"/>
-      </w:pPr>
-      <w:r>
-        <w:t xml:space="preserve">            String[] parts = line.split("\\|");</w:t>
-      </w:r>
-    </w:p>
-    <w:p>
-      <w:pPr>
-        <w:pStyle w:val="Listing"/>
-      </w:pPr>
-      <w:r>
-        <w:t xml:space="preserve">            if (parts.length &lt; 2) {</w:t>
-      </w:r>
-    </w:p>
-    <w:p>
-      <w:pPr>
-        <w:pStyle w:val="Listing"/>
-      </w:pPr>
-      <w:r>
-        <w:t xml:space="preserve">                continue;</w:t>
-      </w:r>
-    </w:p>
-    <w:p>
-      <w:pPr>
-        <w:pStyle w:val="Listing"/>
-      </w:pPr>
-      <w:r>
-        <w:t xml:space="preserve">            }</w:t>
-      </w:r>
-    </w:p>
-    <w:p>
-      <w:pPr>
-        <w:pStyle w:val="Listing"/>
-      </w:pPr>
-      <w:r>
-        <w:t xml:space="preserve">            String name = parts[0].trim();</w:t>
-      </w:r>
-    </w:p>
-    <w:p>
-      <w:pPr>
-        <w:pStyle w:val="Listing"/>
-      </w:pPr>
-      <w:r>
-        <w:t xml:space="preserve">            int coincidenceCount = testSymptoms(parts[1], keywords);</w:t>
-      </w:r>
-    </w:p>
-    <w:p>
-      <w:pPr>
-        <w:pStyle w:val="Listing"/>
-      </w:pPr>
-      <w:r>
-        <w:t xml:space="preserve">            textArea.append("\n" + name + "  :" + coincidenceCount);</w:t>
-      </w:r>
-    </w:p>
-    <w:p>
-      <w:pPr>
-        <w:pStyle w:val="Listing"/>
-      </w:pPr>
-      <w:r>
-        <w:t xml:space="preserve">            if (coincidenceCount &gt; bestCount) {</w:t>
-      </w:r>
-    </w:p>
-    <w:p>
-      <w:pPr>
-        <w:pStyle w:val="Listing"/>
-      </w:pPr>
-      <w:r>
-        <w:t xml:space="preserve">                bestCount = coincidenceCount;</w:t>
-      </w:r>
-    </w:p>
-    <w:p>
-      <w:pPr>
-        <w:pStyle w:val="Listing"/>
-      </w:pPr>
-      <w:r>
-        <w:t xml:space="preserve">                bestName = name;</w:t>
-      </w:r>
-    </w:p>
-    <w:p>
-      <w:pPr>
-        <w:pStyle w:val="Listing"/>
-      </w:pPr>
-      <w:r>
-        <w:t xml:space="preserve">            }</w:t>
-      </w:r>
-    </w:p>
-    <w:p>
-      <w:pPr>
-        <w:pStyle w:val="Listing"/>
-      </w:pPr>
-      <w:r>
-        <w:t xml:space="preserve">        }</w:t>
-      </w:r>
-    </w:p>
-    <w:p>
-      <w:pPr>
-        <w:pStyle w:val="Listing"/>
-      </w:pPr>
-    </w:p>
-    <w:p>
-      <w:pPr>
-        <w:pStyle w:val="Listing"/>
-      </w:pPr>
-      <w:r>
-        <w:t xml:space="preserve">        if (bestName == null) {</w:t>
-      </w:r>
-    </w:p>
-    <w:p>
-      <w:pPr>
-        <w:pStyle w:val="Listing"/>
-      </w:pPr>
-      <w:r>
-        <w:t xml:space="preserve">            textArea.append("\nЛекарство не найдено");</w:t>
-      </w:r>
-    </w:p>
-    <w:p>
-      <w:pPr>
-        <w:pStyle w:val="Listing"/>
-      </w:pPr>
-      <w:r>
-        <w:t xml:space="preserve">        } else {</w:t>
-      </w:r>
-    </w:p>
-    <w:p>
-      <w:pPr>
-        <w:pStyle w:val="Listing"/>
-      </w:pPr>
-      <w:r>
-        <w:t xml:space="preserve">            textArea.append("\n\nЛекарство: " + bestName);</w:t>
-      </w:r>
-    </w:p>
-    <w:p>
-      <w:pPr>
-        <w:pStyle w:val="Listing"/>
-      </w:pPr>
-      <w:r>
-        <w:t xml:space="preserve">            openInBrowser(new File("source_html", bestName + ".html"));</w:t>
-      </w:r>
-    </w:p>
-    <w:p>
-      <w:pPr>
-        <w:pStyle w:val="Listing"/>
-      </w:pPr>
-      <w:r>
-        <w:t xml:space="preserve">        }</w:t>
-      </w:r>
-    </w:p>
-    <w:p>
-      <w:pPr>
-        <w:pStyle w:val="Listing"/>
-      </w:pPr>
-      <w:r>
-        <w:t xml:space="preserve">    }</w:t>
-      </w:r>
-    </w:p>
-    <w:p>
-      <w:pPr>
-        <w:pStyle w:val="Listing"/>
-      </w:pPr>
-      <w:r>
-        <w:t>}</w:t>
-      </w:r>
-    </w:p>
-    <w:p/>
+        <w:t>-документ лекарства с наибольшим числом совпадений. Основные методы приведены в приложении А.</w:t>
+      </w:r>
+    </w:p>
     <w:p>
       <w:pPr>
         <w:ind w:firstLine="709"/>
@@ -2460,352 +2142,19 @@
     </w:p>
     <w:p>
       <w:pPr>
-        <w:keepNext/>
-        <w:ind w:firstLine="709"/>
-        <w:jc w:val="both"/>
-      </w:pPr>
-      <w:r>
-        <w:t>Листинг 3.2 – Чтение файла, подсчет совпадений и открытие браузера</w:t>
-      </w:r>
-    </w:p>
-    <w:p>
-      <w:pPr>
-        <w:pStyle w:val="Listing"/>
-      </w:pPr>
-      <w:r>
-        <w:t>// Чтение строк файла через URL и потоковые классы</w:t>
-      </w:r>
-    </w:p>
-    <w:p>
-      <w:pPr>
-        <w:pStyle w:val="Listing"/>
-      </w:pPr>
-      <w:r>
-        <w:t>private ArrayList&lt;String&gt; readLines(File file) {</w:t>
-      </w:r>
-    </w:p>
-    <w:p>
-      <w:pPr>
-        <w:pStyle w:val="Listing"/>
-      </w:pPr>
-      <w:r>
-        <w:t xml:space="preserve">    ArrayList&lt;String&gt; lines = new ArrayList&lt;&gt;();</w:t>
-      </w:r>
-    </w:p>
-    <w:p>
-      <w:pPr>
-        <w:pStyle w:val="Listing"/>
-      </w:pPr>
-      <w:r>
-        <w:t xml:space="preserve">    try {</w:t>
-      </w:r>
-    </w:p>
-    <w:p>
-      <w:pPr>
-        <w:pStyle w:val="Listing"/>
-      </w:pPr>
-      <w:r>
-        <w:t xml:space="preserve">        URL url = file.toURI().toURL();</w:t>
-      </w:r>
-    </w:p>
-    <w:p>
-      <w:pPr>
-        <w:pStyle w:val="Listing"/>
-      </w:pPr>
-      <w:r>
-        <w:t xml:space="preserve">        URLConnection connection = url.openConnection();</w:t>
-      </w:r>
-    </w:p>
-    <w:p>
-      <w:pPr>
-        <w:pStyle w:val="Listing"/>
-      </w:pPr>
-      <w:r>
-        <w:lastRenderedPageBreak/>
-        <w:t xml:space="preserve">        try (BufferedReader reader = new BufferedReader(</w:t>
-      </w:r>
-    </w:p>
-    <w:p>
-      <w:pPr>
-        <w:pStyle w:val="Listing"/>
-      </w:pPr>
-      <w:r>
-        <w:t xml:space="preserve">                new InputStreamReader(connection.getInputStream(), "UTF-8"))) {</w:t>
-      </w:r>
-    </w:p>
-    <w:p>
-      <w:pPr>
-        <w:pStyle w:val="Listing"/>
-      </w:pPr>
-      <w:r>
-        <w:t xml:space="preserve">            String line;</w:t>
-      </w:r>
-    </w:p>
-    <w:p>
-      <w:pPr>
-        <w:pStyle w:val="Listing"/>
-      </w:pPr>
-      <w:r>
-        <w:t xml:space="preserve">            while ((line = reader.readLine()) != null) {</w:t>
-      </w:r>
-    </w:p>
-    <w:p>
-      <w:pPr>
-        <w:pStyle w:val="Listing"/>
-      </w:pPr>
-      <w:r>
-        <w:t xml:space="preserve">                if (!line.trim().isEmpty() &amp;&amp; !line.startsWith("#")) {</w:t>
-      </w:r>
-    </w:p>
-    <w:p>
-      <w:pPr>
-        <w:pStyle w:val="Listing"/>
-      </w:pPr>
-      <w:r>
-        <w:t xml:space="preserve">                    lines.add(line);</w:t>
-      </w:r>
-    </w:p>
-    <w:p>
-      <w:pPr>
-        <w:pStyle w:val="Listing"/>
-      </w:pPr>
-      <w:r>
-        <w:t xml:space="preserve">                }</w:t>
-      </w:r>
-    </w:p>
-    <w:p>
-      <w:pPr>
-        <w:pStyle w:val="Listing"/>
-      </w:pPr>
-      <w:r>
-        <w:t xml:space="preserve">            }</w:t>
-      </w:r>
-    </w:p>
-    <w:p>
-      <w:pPr>
-        <w:pStyle w:val="Listing"/>
-      </w:pPr>
-      <w:r>
-        <w:t xml:space="preserve">        }</w:t>
-      </w:r>
-    </w:p>
-    <w:p>
-      <w:pPr>
-        <w:pStyle w:val="Listing"/>
-      </w:pPr>
-      <w:r>
-        <w:t xml:space="preserve">    } catch (IOException e) {</w:t>
-      </w:r>
-    </w:p>
-    <w:p>
-      <w:pPr>
-        <w:pStyle w:val="Listing"/>
-      </w:pPr>
-      <w:r>
-        <w:t xml:space="preserve">        System.out.println("Error: " + e.getMessage());</w:t>
-      </w:r>
-    </w:p>
-    <w:p>
-      <w:pPr>
-        <w:pStyle w:val="Listing"/>
-      </w:pPr>
-      <w:r>
-        <w:t xml:space="preserve">    }</w:t>
-      </w:r>
-    </w:p>
-    <w:p>
-      <w:pPr>
-        <w:pStyle w:val="Listing"/>
-      </w:pPr>
-      <w:r>
-        <w:t xml:space="preserve">    return lines;</w:t>
-      </w:r>
-    </w:p>
-    <w:p>
-      <w:pPr>
-        <w:pStyle w:val="Listing"/>
-      </w:pPr>
-      <w:r>
-        <w:t>}</w:t>
-      </w:r>
-    </w:p>
-    <w:p>
-      <w:pPr>
-        <w:pStyle w:val="Listing"/>
-      </w:pPr>
-    </w:p>
-    <w:p>
-      <w:pPr>
-        <w:pStyle w:val="Listing"/>
-      </w:pPr>
-      <w:r>
-        <w:t>// Число ключевых слов, найденных среди симптомов лекарства</w:t>
-      </w:r>
-    </w:p>
-    <w:p>
-      <w:pPr>
-        <w:pStyle w:val="Listing"/>
-      </w:pPr>
-      <w:r>
-        <w:t>private int testSymptoms(String symptoms, String[] keywords) {</w:t>
-      </w:r>
-    </w:p>
-    <w:p>
-      <w:pPr>
-        <w:pStyle w:val="Listing"/>
-      </w:pPr>
-      <w:r>
-        <w:t xml:space="preserve">    int results = 0;</w:t>
-      </w:r>
-    </w:p>
-    <w:p>
-      <w:pPr>
-        <w:pStyle w:val="Listing"/>
-      </w:pPr>
-      <w:r>
-        <w:t xml:space="preserve">    String content = symptoms.toLowerCase();</w:t>
-      </w:r>
-    </w:p>
-    <w:p>
-      <w:pPr>
-        <w:pStyle w:val="Listing"/>
-      </w:pPr>
-      <w:r>
-        <w:t xml:space="preserve">    for (String keyword : keywords) {</w:t>
-      </w:r>
-    </w:p>
-    <w:p>
-      <w:pPr>
-        <w:pStyle w:val="Listing"/>
-      </w:pPr>
-      <w:r>
-        <w:t xml:space="preserve">        if (!keyword.trim().isEmpty() &amp;&amp; content.contains(keyword.trim().toLowerCase())) {</w:t>
-      </w:r>
-    </w:p>
-    <w:p>
-      <w:pPr>
-        <w:pStyle w:val="Listing"/>
-      </w:pPr>
-      <w:r>
-        <w:t xml:space="preserve">            results++;</w:t>
-      </w:r>
-    </w:p>
-    <w:p>
-      <w:pPr>
-        <w:pStyle w:val="Listing"/>
-      </w:pPr>
-      <w:r>
-        <w:t xml:space="preserve">        }</w:t>
-      </w:r>
-    </w:p>
-    <w:p>
-      <w:pPr>
-        <w:pStyle w:val="Listing"/>
-      </w:pPr>
-      <w:r>
-        <w:t xml:space="preserve">    }</w:t>
-      </w:r>
-    </w:p>
-    <w:p>
-      <w:pPr>
-        <w:pStyle w:val="Listing"/>
-      </w:pPr>
-      <w:r>
-        <w:t xml:space="preserve">    return results;</w:t>
-      </w:r>
-    </w:p>
-    <w:p>
-      <w:pPr>
-        <w:pStyle w:val="Listing"/>
-      </w:pPr>
-      <w:r>
-        <w:t>}</w:t>
-      </w:r>
-    </w:p>
-    <w:p>
-      <w:pPr>
-        <w:pStyle w:val="Listing"/>
-      </w:pPr>
-    </w:p>
-    <w:p>
-      <w:pPr>
-        <w:pStyle w:val="Listing"/>
-      </w:pPr>
-      <w:r>
-        <w:t>// Открытие html-документа в браузере</w:t>
-      </w:r>
-    </w:p>
-    <w:p>
-      <w:pPr>
-        <w:pStyle w:val="Listing"/>
-      </w:pPr>
-      <w:r>
-        <w:t>private void openInBrowser(File file) {</w:t>
-      </w:r>
-    </w:p>
-    <w:p>
-      <w:pPr>
-        <w:pStyle w:val="Listing"/>
-      </w:pPr>
-      <w:r>
-        <w:t xml:space="preserve">    try {</w:t>
-      </w:r>
-    </w:p>
-    <w:p>
-      <w:pPr>
-        <w:pStyle w:val="Listing"/>
-      </w:pPr>
-      <w:r>
-        <w:t xml:space="preserve">        Desktop.getDesktop().browse(file.getAbsoluteFile().toURI());</w:t>
-      </w:r>
-    </w:p>
-    <w:p>
-      <w:pPr>
-        <w:pStyle w:val="Listing"/>
-      </w:pPr>
-      <w:r>
-        <w:t xml:space="preserve">    } catch (IOException e) {</w:t>
-      </w:r>
-    </w:p>
-    <w:p>
-      <w:pPr>
-        <w:pStyle w:val="Listing"/>
-      </w:pPr>
-      <w:r>
-        <w:t xml:space="preserve">        System.out.println("Error: " + e.getMessage());</w:t>
-      </w:r>
-    </w:p>
-    <w:p>
-      <w:pPr>
-        <w:pStyle w:val="Listing"/>
-      </w:pPr>
-      <w:r>
-        <w:t xml:space="preserve">    }</w:t>
-      </w:r>
-    </w:p>
-    <w:p>
-      <w:pPr>
-        <w:pStyle w:val="Listing"/>
-      </w:pPr>
-      <w:r>
-        <w:t>}</w:t>
-      </w:r>
-    </w:p>
-    <w:p/>
-    <w:p>
-      <w:pPr>
         <w:pStyle w:val="21"/>
         <w:spacing w:before="360"/>
         <w:ind w:firstLine="709"/>
       </w:pPr>
-      <w:bookmarkStart w:id="6" w:name="_Toc242385928"/>
+      <w:bookmarkStart w:id="7" w:name="_Toc242612910"/>
       <w:r>
         <w:rPr>
           <w:rFonts w:ascii="Times New Roman" w:hAnsi="Times New Roman"/>
         </w:rPr>
-        <w:t>3.4 Результаты работы</w:t>
-      </w:r>
-      <w:bookmarkEnd w:id="6"/>
+        <w:lastRenderedPageBreak/>
+        <w:t>2.6 Результаты работы</w:t>
+      </w:r>
+      <w:bookmarkEnd w:id="7"/>
     </w:p>
     <w:p>
       <w:pPr>
@@ -2813,7 +2162,7 @@
         <w:jc w:val="both"/>
       </w:pPr>
       <w:r>
-        <w:t>Окно приложения после запуска показано на рисунке 3.1.</w:t>
+        <w:t>Окно приложения после запуска показано на рисунке 2.1.</w:t>
       </w:r>
     </w:p>
     <w:p>
@@ -2826,9 +2175,8 @@
         <w:rPr>
           <w:noProof/>
         </w:rPr>
-        <w:lastRenderedPageBreak/>
         <w:drawing>
-          <wp:inline distT="0" distB="0" distL="0" distR="0" wp14:anchorId="3F495301" wp14:editId="7B021D3C">
+          <wp:inline distT="0" distB="0" distL="0" distR="0" wp14:anchorId="1C247F2C" wp14:editId="3F2F720F">
             <wp:extent cx="5580000" cy="3055113"/>
             <wp:effectExtent l="0" t="0" r="0" b="0"/>
             <wp:docPr id="1" name="Picture 1"/>
@@ -2870,7 +2218,7 @@
         <w:jc w:val="center"/>
       </w:pPr>
       <w:r>
-        <w:t>Рисунок 3.1 – Окно приложения после запуска</w:t>
+        <w:t>Рисунок 2.1 – Окно приложения после запуска</w:t>
       </w:r>
     </w:p>
     <w:p/>
@@ -2907,7 +2255,7 @@
         <w:jc w:val="both"/>
       </w:pPr>
       <w:r>
-        <w:t>В текстовую область введены симптомы «головная боль, высокая температура», как показано на рисунке 3.2.</w:t>
+        <w:t>В текстовую область введены симптомы «головная боль, высокая температура», как показано на рисунке 2.2.</w:t>
       </w:r>
     </w:p>
     <w:p>
@@ -2921,7 +2269,7 @@
           <w:noProof/>
         </w:rPr>
         <w:drawing>
-          <wp:inline distT="0" distB="0" distL="0" distR="0" wp14:anchorId="1B2878C4" wp14:editId="7AADB551">
+          <wp:inline distT="0" distB="0" distL="0" distR="0" wp14:anchorId="1A377056" wp14:editId="5BDD4046">
             <wp:extent cx="5580000" cy="3055113"/>
             <wp:effectExtent l="0" t="0" r="0" b="0"/>
             <wp:docPr id="2" name="Picture 2"/>
@@ -2963,7 +2311,7 @@
         <w:jc w:val="center"/>
       </w:pPr>
       <w:r>
-        <w:t>Рисунок 3.2 – Ввод ключевых слов</w:t>
+        <w:t>Рисунок 2.2 – Ввод ключевых слов</w:t>
       </w:r>
     </w:p>
     <w:p/>
@@ -2982,8 +2330,7 @@
         <w:jc w:val="both"/>
       </w:pPr>
       <w:r>
-        <w:lastRenderedPageBreak/>
-        <w:t>Результат поиска показан на рисунках 3.3 и 3.4.</w:t>
+        <w:t>Результат поиска показан на рисунках 2.3 и 2.4.</w:t>
       </w:r>
     </w:p>
     <w:p>
@@ -2997,7 +2344,7 @@
           <w:noProof/>
         </w:rPr>
         <w:drawing>
-          <wp:inline distT="0" distB="0" distL="0" distR="0" wp14:anchorId="7511D484" wp14:editId="4812C1F7">
+          <wp:inline distT="0" distB="0" distL="0" distR="0" wp14:anchorId="51F79DA3" wp14:editId="236758BF">
             <wp:extent cx="5580000" cy="3055113"/>
             <wp:effectExtent l="0" t="0" r="0" b="0"/>
             <wp:docPr id="3" name="Picture 3"/>
@@ -3039,7 +2386,7 @@
         <w:jc w:val="center"/>
       </w:pPr>
       <w:r>
-        <w:t>Рисунок 3.3 – Результат поиска (начало списка)</w:t>
+        <w:t>Рисунок 2.3 – Результат поиска (начало списка)</w:t>
       </w:r>
     </w:p>
     <w:p/>
@@ -3058,7 +2405,7 @@
         <w:jc w:val="both"/>
       </w:pPr>
       <w:r>
-        <w:t>Конец списка с найденным лекарством показан на рисунке 3.4.</w:t>
+        <w:t>Конец списка с найденным лекарством показан на рисунке 2.4.</w:t>
       </w:r>
     </w:p>
     <w:p>
@@ -3072,7 +2419,7 @@
           <w:noProof/>
         </w:rPr>
         <w:drawing>
-          <wp:inline distT="0" distB="0" distL="0" distR="0" wp14:anchorId="12A7FDDF" wp14:editId="51C2FF05">
+          <wp:inline distT="0" distB="0" distL="0" distR="0" wp14:anchorId="4EC46BC1" wp14:editId="6066B92E">
             <wp:extent cx="5580000" cy="3055113"/>
             <wp:effectExtent l="0" t="0" r="0" b="0"/>
             <wp:docPr id="4" name="Picture 4"/>
@@ -3114,7 +2461,7 @@
         <w:jc w:val="center"/>
       </w:pPr>
       <w:r>
-        <w:t>Рисунок 3.4 – Результат поиска (конец списка)</w:t>
+        <w:t>Рисунок 2.4 – Результат поиска (конец списка)</w:t>
       </w:r>
     </w:p>
     <w:p/>
@@ -3124,7 +2471,6 @@
         <w:jc w:val="both"/>
       </w:pPr>
       <w:r>
-        <w:lastRenderedPageBreak/>
         <w:t>Список завершается строкой «Лекарство: Парацетамол», то есть выбран документ с наибольшим числом совпадений.</w:t>
       </w:r>
     </w:p>
@@ -3143,7 +2489,7 @@
         <w:t>html</w:t>
       </w:r>
       <w:r>
-        <w:t>-документ открывается в браузере, как показано на рисунке 3.5. Снимок страницы получен отдельно, чтобы показать содержимое документа.</w:t>
+        <w:t>-документ открывается в браузере, как показано на рисунке 2.5. Снимок страницы получен отдельно, чтобы показать содержимое документа.</w:t>
       </w:r>
     </w:p>
     <w:p>
@@ -3157,7 +2503,7 @@
           <w:noProof/>
         </w:rPr>
         <w:drawing>
-          <wp:inline distT="0" distB="0" distL="0" distR="0" wp14:anchorId="40BE46B2" wp14:editId="5EAAF95F">
+          <wp:inline distT="0" distB="0" distL="0" distR="0" wp14:anchorId="5FDB1365" wp14:editId="7283E2EE">
             <wp:extent cx="5580000" cy="1860000"/>
             <wp:effectExtent l="0" t="0" r="0" b="0"/>
             <wp:docPr id="5" name="Picture 5"/>
@@ -3199,7 +2545,7 @@
         <w:jc w:val="center"/>
       </w:pPr>
       <w:r>
-        <w:t>Рисунок 3.5 – Документ лекарства в браузере</w:t>
+        <w:t>Рисунок 2.5 – Документ лекарства в браузере</w:t>
       </w:r>
     </w:p>
     <w:p/>
@@ -3222,35 +2568,13 @@
         <w:pStyle w:val="1"/>
         <w:ind w:firstLine="709"/>
       </w:pPr>
-      <w:bookmarkStart w:id="7" w:name="_Toc242385929"/>
+      <w:bookmarkStart w:id="8" w:name="_Toc242612911"/>
       <w:r>
         <w:rPr>
           <w:rFonts w:ascii="Times New Roman" w:hAnsi="Times New Roman"/>
         </w:rPr>
         <w:lastRenderedPageBreak/>
-        <w:t>4 КОНТРОЛЬНЫЕ ВОПРОСЫ</w:t>
-      </w:r>
-      <w:bookmarkEnd w:id="7"/>
-    </w:p>
-    <w:p>
-      <w:pPr>
-        <w:pStyle w:val="21"/>
-        <w:spacing w:before="360"/>
-        <w:ind w:firstLine="709"/>
-      </w:pPr>
-      <w:bookmarkStart w:id="8" w:name="_Toc242385930"/>
-      <w:r>
-        <w:rPr>
-          <w:rFonts w:ascii="Times New Roman" w:hAnsi="Times New Roman"/>
-        </w:rPr>
-        <w:t xml:space="preserve">4.1 Что такое </w:t>
-      </w:r>
-      <w:r>
-        <w:rPr>
-          <w:rFonts w:ascii="Times New Roman" w:hAnsi="Times New Roman"/>
-          <w:i/>
-        </w:rPr>
-        <w:t>URL</w:t>
+        <w:t>3 Ответы на контрольные вопросы</w:t>
       </w:r>
       <w:bookmarkEnd w:id="8"/>
     </w:p>
@@ -3259,6 +2583,9 @@
         <w:ind w:firstLine="709"/>
         <w:jc w:val="both"/>
       </w:pPr>
+      <w:r>
+        <w:t xml:space="preserve">1. Что такое </w:t>
+      </w:r>
       <w:r>
         <w:rPr>
           <w:i/>
@@ -3266,6 +2593,21 @@
         <w:t>URL</w:t>
       </w:r>
       <w:r>
+        <w:t>?</w:t>
+      </w:r>
+    </w:p>
+    <w:p>
+      <w:pPr>
+        <w:ind w:firstLine="709"/>
+        <w:jc w:val="both"/>
+      </w:pPr>
+      <w:r>
+        <w:rPr>
+          <w:i/>
+        </w:rPr>
+        <w:t>URL</w:t>
+      </w:r>
+      <w:r>
         <w:t xml:space="preserve"> (</w:t>
       </w:r>
       <w:r>
@@ -3355,18 +2697,12 @@
     </w:p>
     <w:p>
       <w:pPr>
-        <w:pStyle w:val="21"/>
-        <w:spacing w:before="360"/>
         <w:ind w:firstLine="709"/>
-      </w:pPr>
-      <w:bookmarkStart w:id="9" w:name="_Toc242385931"/>
-      <w:r>
-        <w:rPr>
-          <w:rFonts w:ascii="Times New Roman" w:hAnsi="Times New Roman"/>
-        </w:rPr>
-        <w:t>4.2 Как программно получить список всех файлов в папке</w:t>
-      </w:r>
-      <w:bookmarkEnd w:id="9"/>
+        <w:jc w:val="both"/>
+      </w:pPr>
+      <w:r>
+        <w:t>2. Как программно получить список всех файлов в папке?</w:t>
+      </w:r>
     </w:p>
     <w:p>
       <w:pPr>
@@ -3451,31 +2787,21 @@
     </w:p>
     <w:p>
       <w:pPr>
-        <w:pStyle w:val="21"/>
-        <w:spacing w:before="360"/>
         <w:ind w:firstLine="709"/>
-      </w:pPr>
-      <w:bookmarkStart w:id="10" w:name="_Toc242385932"/>
+        <w:jc w:val="both"/>
+      </w:pPr>
+      <w:r>
+        <w:t xml:space="preserve">3. Как программно запустить браузер и открыть </w:t>
+      </w:r>
       <w:r>
         <w:rPr>
-          <w:rFonts w:ascii="Times New Roman" w:hAnsi="Times New Roman"/>
-        </w:rPr>
-        <w:t xml:space="preserve">4.3 Как программно запустить браузер и открыть </w:t>
-      </w:r>
-      <w:r>
-        <w:rPr>
-          <w:rFonts w:ascii="Times New Roman" w:hAnsi="Times New Roman"/>
           <w:i/>
         </w:rPr>
         <w:t>html</w:t>
       </w:r>
       <w:r>
-        <w:rPr>
-          <w:rFonts w:ascii="Times New Roman" w:hAnsi="Times New Roman"/>
-        </w:rPr>
-        <w:t>-файл</w:t>
-      </w:r>
-      <w:bookmarkEnd w:id="10"/>
+        <w:t>-файл?</w:t>
+      </w:r>
     </w:p>
     <w:p>
       <w:pPr>
@@ -3557,18 +2883,12 @@
     </w:p>
     <w:p>
       <w:pPr>
-        <w:pStyle w:val="21"/>
-        <w:spacing w:before="360"/>
         <w:ind w:firstLine="709"/>
-      </w:pPr>
-      <w:bookmarkStart w:id="11" w:name="_Toc242385933"/>
-      <w:r>
-        <w:rPr>
-          <w:rFonts w:ascii="Times New Roman" w:hAnsi="Times New Roman"/>
-        </w:rPr>
-        <w:t>4.4 Использование потоковых классов в приложении</w:t>
-      </w:r>
-      <w:bookmarkEnd w:id="11"/>
+        <w:jc w:val="both"/>
+      </w:pPr>
+      <w:r>
+        <w:t>4. Как используются потоковые классы в приложении?</w:t>
+      </w:r>
     </w:p>
     <w:p>
       <w:pPr>
@@ -3649,15 +2969,15 @@
         <w:pStyle w:val="1"/>
         <w:jc w:val="center"/>
       </w:pPr>
-      <w:bookmarkStart w:id="12" w:name="_Toc242385934"/>
+      <w:bookmarkStart w:id="9" w:name="_Toc242612912"/>
       <w:r>
         <w:rPr>
           <w:rFonts w:ascii="Times New Roman" w:hAnsi="Times New Roman"/>
         </w:rPr>
         <w:lastRenderedPageBreak/>
-        <w:t>ЗАКЛЮЧЕНИЕ</w:t>
-      </w:r>
-      <w:bookmarkEnd w:id="12"/>
+        <w:t>Выводы</w:t>
+      </w:r>
+      <w:bookmarkEnd w:id="9"/>
     </w:p>
     <w:p>
       <w:pPr>
@@ -3683,9 +3003,680 @@
         <w:t>URLConnection</w:t>
       </w:r>
       <w:r>
-        <w:t>, построчное чтение файла, подсчет совпадений ключевых слов и открытие найденного документа в браузере. Заготовка из методических указаний доработана под вариант 2: поиск названия лекарства по набору симптомов из текстового файла. Приложение корректно определило лекарство с наибольшим числом совпадений. Цель работы достигнута.</w:t>
-      </w:r>
-    </w:p>
+        <w:t>, построчное чтение файла, подсчет совпадений ключевых слов и открытие найденного документа в браузере. Заготовка из методических указаний доработана под вариант 2: поиск названия лекарства по набору симптомов из текстового файла. Приложение корректно определило лекарство с наибольшим числом совпадений. Поставленная цель достигнута.</w:t>
+      </w:r>
+    </w:p>
+    <w:p>
+      <w:r>
+        <w:br w:type="page"/>
+      </w:r>
+    </w:p>
+    <w:p>
+      <w:pPr>
+        <w:pStyle w:val="1"/>
+        <w:jc w:val="center"/>
+      </w:pPr>
+      <w:bookmarkStart w:id="10" w:name="_Toc242612913"/>
+      <w:r>
+        <w:lastRenderedPageBreak/>
+        <w:t>Приложение А</w:t>
+      </w:r>
+      <w:r>
+        <w:br/>
+      </w:r>
+      <w:r>
+        <w:rPr>
+          <w:caps w:val="0"/>
+        </w:rPr>
+        <w:t>(обязательное)</w:t>
+      </w:r>
+      <w:r>
+        <w:rPr>
+          <w:caps w:val="0"/>
+        </w:rPr>
+        <w:br/>
+        <w:t>Листинги программного кода</w:t>
+      </w:r>
+      <w:bookmarkEnd w:id="10"/>
+    </w:p>
+    <w:p>
+      <w:pPr>
+        <w:keepNext/>
+        <w:ind w:firstLine="709"/>
+        <w:jc w:val="both"/>
+      </w:pPr>
+      <w:r>
+        <w:t xml:space="preserve">Листинг А.1 – Обработчик кнопки </w:t>
+      </w:r>
+      <w:r>
+        <w:rPr>
+          <w:i/>
+        </w:rPr>
+        <w:t>Search</w:t>
+      </w:r>
+    </w:p>
+    <w:p>
+      <w:pPr>
+        <w:pStyle w:val="Listing"/>
+      </w:pPr>
+      <w:r>
+        <w:t>public void actionPerformed(ActionEvent ae) {</w:t>
+      </w:r>
+    </w:p>
+    <w:p>
+      <w:pPr>
+        <w:pStyle w:val="Listing"/>
+      </w:pPr>
+      <w:r>
+        <w:t xml:space="preserve">    if (ae.getSource() == exitButton) {</w:t>
+      </w:r>
+    </w:p>
+    <w:p>
+      <w:pPr>
+        <w:pStyle w:val="Listing"/>
+      </w:pPr>
+      <w:r>
+        <w:t xml:space="preserve">        System.exit(0);</w:t>
+      </w:r>
+    </w:p>
+    <w:p>
+      <w:pPr>
+        <w:pStyle w:val="Listing"/>
+      </w:pPr>
+      <w:r>
+        <w:t xml:space="preserve">    } else if (ae.getSource() == searchButton) {</w:t>
+      </w:r>
+    </w:p>
+    <w:p>
+      <w:pPr>
+        <w:pStyle w:val="Listing"/>
+      </w:pPr>
+      <w:r>
+        <w:t xml:space="preserve">        // Ключевые слова (симптомы) разделяются запятыми</w:t>
+      </w:r>
+    </w:p>
+    <w:p>
+      <w:pPr>
+        <w:pStyle w:val="Listing"/>
+      </w:pPr>
+      <w:r>
+        <w:t xml:space="preserve">        String[] keywords = textArea.getText().split(",");</w:t>
+      </w:r>
+    </w:p>
+    <w:p>
+      <w:pPr>
+        <w:pStyle w:val="Listing"/>
+      </w:pPr>
+      <w:r>
+        <w:t xml:space="preserve">        textArea.setText("");</w:t>
+      </w:r>
+    </w:p>
+    <w:p>
+      <w:pPr>
+        <w:pStyle w:val="Listing"/>
+      </w:pPr>
+    </w:p>
+    <w:p>
+      <w:pPr>
+        <w:pStyle w:val="Listing"/>
+      </w:pPr>
+      <w:r>
+        <w:t xml:space="preserve">        // Список лекарств читается из текстового файла</w:t>
+      </w:r>
+    </w:p>
+    <w:p>
+      <w:pPr>
+        <w:pStyle w:val="Listing"/>
+      </w:pPr>
+      <w:r>
+        <w:t xml:space="preserve">        File medicinesFile = new File("medicines.txt");</w:t>
+      </w:r>
+    </w:p>
+    <w:p>
+      <w:pPr>
+        <w:pStyle w:val="Listing"/>
+      </w:pPr>
+      <w:r>
+        <w:t xml:space="preserve">        ArrayList&lt;String&gt; medicines = readLines(medicinesFile);</w:t>
+      </w:r>
+    </w:p>
+    <w:p>
+      <w:pPr>
+        <w:pStyle w:val="Listing"/>
+      </w:pPr>
+    </w:p>
+    <w:p>
+      <w:pPr>
+        <w:pStyle w:val="Listing"/>
+      </w:pPr>
+      <w:r>
+        <w:t xml:space="preserve">        String bestName = null;</w:t>
+      </w:r>
+    </w:p>
+    <w:p>
+      <w:pPr>
+        <w:pStyle w:val="Listing"/>
+      </w:pPr>
+      <w:r>
+        <w:t xml:space="preserve">        int bestCount = 0;</w:t>
+      </w:r>
+    </w:p>
+    <w:p>
+      <w:pPr>
+        <w:pStyle w:val="Listing"/>
+      </w:pPr>
+      <w:r>
+        <w:t xml:space="preserve">        for (String line : medicines) {</w:t>
+      </w:r>
+    </w:p>
+    <w:p>
+      <w:pPr>
+        <w:pStyle w:val="Listing"/>
+      </w:pPr>
+      <w:r>
+        <w:t xml:space="preserve">            // Формат строки: Название | симптом1, симптом2, ...</w:t>
+      </w:r>
+    </w:p>
+    <w:p>
+      <w:pPr>
+        <w:pStyle w:val="Listing"/>
+      </w:pPr>
+      <w:r>
+        <w:t xml:space="preserve">            String[] parts = line.split("\\|");</w:t>
+      </w:r>
+    </w:p>
+    <w:p>
+      <w:pPr>
+        <w:pStyle w:val="Listing"/>
+      </w:pPr>
+      <w:r>
+        <w:t xml:space="preserve">            if (parts.length &lt; 2) {</w:t>
+      </w:r>
+    </w:p>
+    <w:p>
+      <w:pPr>
+        <w:pStyle w:val="Listing"/>
+      </w:pPr>
+      <w:r>
+        <w:t xml:space="preserve">                continue;</w:t>
+      </w:r>
+    </w:p>
+    <w:p>
+      <w:pPr>
+        <w:pStyle w:val="Listing"/>
+      </w:pPr>
+      <w:r>
+        <w:t xml:space="preserve">            }</w:t>
+      </w:r>
+    </w:p>
+    <w:p>
+      <w:pPr>
+        <w:pStyle w:val="Listing"/>
+      </w:pPr>
+      <w:r>
+        <w:t xml:space="preserve">            String name = parts[0].trim();</w:t>
+      </w:r>
+    </w:p>
+    <w:p>
+      <w:pPr>
+        <w:pStyle w:val="Listing"/>
+      </w:pPr>
+      <w:r>
+        <w:t xml:space="preserve">            int coincidenceCount = testSymptoms(parts[1], keywords);</w:t>
+      </w:r>
+    </w:p>
+    <w:p>
+      <w:pPr>
+        <w:pStyle w:val="Listing"/>
+      </w:pPr>
+      <w:r>
+        <w:t xml:space="preserve">            textArea.append("\n" + name + "  :" + coincidenceCount);</w:t>
+      </w:r>
+    </w:p>
+    <w:p>
+      <w:pPr>
+        <w:pStyle w:val="Listing"/>
+      </w:pPr>
+      <w:r>
+        <w:t xml:space="preserve">            if (coincidenceCount &gt; bestCount) {</w:t>
+      </w:r>
+    </w:p>
+    <w:p>
+      <w:pPr>
+        <w:pStyle w:val="Listing"/>
+      </w:pPr>
+      <w:r>
+        <w:t xml:space="preserve">                bestCount = coincidenceCount;</w:t>
+      </w:r>
+    </w:p>
+    <w:p>
+      <w:pPr>
+        <w:pStyle w:val="Listing"/>
+      </w:pPr>
+      <w:r>
+        <w:t xml:space="preserve">                bestName = name;</w:t>
+      </w:r>
+    </w:p>
+    <w:p>
+      <w:pPr>
+        <w:pStyle w:val="Listing"/>
+      </w:pPr>
+      <w:r>
+        <w:t xml:space="preserve">            }</w:t>
+      </w:r>
+    </w:p>
+    <w:p>
+      <w:pPr>
+        <w:pStyle w:val="Listing"/>
+      </w:pPr>
+      <w:r>
+        <w:t xml:space="preserve">        }</w:t>
+      </w:r>
+    </w:p>
+    <w:p>
+      <w:pPr>
+        <w:pStyle w:val="Listing"/>
+      </w:pPr>
+    </w:p>
+    <w:p>
+      <w:pPr>
+        <w:pStyle w:val="Listing"/>
+      </w:pPr>
+      <w:r>
+        <w:t xml:space="preserve">        if (bestName == null) {</w:t>
+      </w:r>
+    </w:p>
+    <w:p>
+      <w:pPr>
+        <w:pStyle w:val="Listing"/>
+      </w:pPr>
+      <w:r>
+        <w:t xml:space="preserve">            textArea.append("\nЛекарство не найдено");</w:t>
+      </w:r>
+    </w:p>
+    <w:p>
+      <w:pPr>
+        <w:pStyle w:val="Listing"/>
+      </w:pPr>
+      <w:r>
+        <w:t xml:space="preserve">        } else {</w:t>
+      </w:r>
+    </w:p>
+    <w:p>
+      <w:pPr>
+        <w:pStyle w:val="Listing"/>
+      </w:pPr>
+      <w:r>
+        <w:t xml:space="preserve">            textArea.append("\n\nЛекарство: " + bestName);</w:t>
+      </w:r>
+    </w:p>
+    <w:p>
+      <w:pPr>
+        <w:pStyle w:val="Listing"/>
+      </w:pPr>
+      <w:r>
+        <w:t xml:space="preserve">            openInBrowser(new File("source_html", bestName + ".html"));</w:t>
+      </w:r>
+    </w:p>
+    <w:p>
+      <w:pPr>
+        <w:pStyle w:val="Listing"/>
+      </w:pPr>
+      <w:r>
+        <w:t xml:space="preserve">        }</w:t>
+      </w:r>
+    </w:p>
+    <w:p>
+      <w:pPr>
+        <w:pStyle w:val="Listing"/>
+      </w:pPr>
+      <w:r>
+        <w:t xml:space="preserve">    }</w:t>
+      </w:r>
+    </w:p>
+    <w:p>
+      <w:pPr>
+        <w:pStyle w:val="Listing"/>
+      </w:pPr>
+      <w:r>
+        <w:t>}</w:t>
+      </w:r>
+    </w:p>
+    <w:p/>
+    <w:p>
+      <w:pPr>
+        <w:keepNext/>
+        <w:ind w:firstLine="709"/>
+        <w:jc w:val="both"/>
+      </w:pPr>
+      <w:r>
+        <w:t>Листинг А.2 – Чтение файла, подсчет совпадений и открытие браузера</w:t>
+      </w:r>
+    </w:p>
+    <w:p>
+      <w:pPr>
+        <w:pStyle w:val="Listing"/>
+      </w:pPr>
+      <w:r>
+        <w:t>// Чтение строк файла через URL и потоковые классы</w:t>
+      </w:r>
+    </w:p>
+    <w:p>
+      <w:pPr>
+        <w:pStyle w:val="Listing"/>
+      </w:pPr>
+      <w:r>
+        <w:t>private ArrayList&lt;String&gt; readLines(File file) {</w:t>
+      </w:r>
+    </w:p>
+    <w:p>
+      <w:pPr>
+        <w:pStyle w:val="Listing"/>
+      </w:pPr>
+      <w:r>
+        <w:t xml:space="preserve">    ArrayList&lt;String&gt; lines = new ArrayList&lt;&gt;();</w:t>
+      </w:r>
+    </w:p>
+    <w:p>
+      <w:pPr>
+        <w:pStyle w:val="Listing"/>
+      </w:pPr>
+      <w:r>
+        <w:t xml:space="preserve">    try {</w:t>
+      </w:r>
+    </w:p>
+    <w:p>
+      <w:pPr>
+        <w:pStyle w:val="Listing"/>
+      </w:pPr>
+      <w:r>
+        <w:t xml:space="preserve">        URL url = file.toURI().toURL();</w:t>
+      </w:r>
+    </w:p>
+    <w:p>
+      <w:pPr>
+        <w:pStyle w:val="Listing"/>
+      </w:pPr>
+      <w:r>
+        <w:t xml:space="preserve">        URLConnection connection = url.openConnection();</w:t>
+      </w:r>
+    </w:p>
+    <w:p>
+      <w:pPr>
+        <w:pStyle w:val="Listing"/>
+      </w:pPr>
+      <w:r>
+        <w:lastRenderedPageBreak/>
+        <w:t xml:space="preserve">        try (BufferedReader reader = new BufferedReader(</w:t>
+      </w:r>
+    </w:p>
+    <w:p>
+      <w:pPr>
+        <w:pStyle w:val="Listing"/>
+      </w:pPr>
+      <w:r>
+        <w:t xml:space="preserve">                new InputStreamReader(connection.getInputStream(), "UTF-8"))) {</w:t>
+      </w:r>
+    </w:p>
+    <w:p>
+      <w:pPr>
+        <w:pStyle w:val="Listing"/>
+      </w:pPr>
+      <w:r>
+        <w:t xml:space="preserve">            String line;</w:t>
+      </w:r>
+    </w:p>
+    <w:p>
+      <w:pPr>
+        <w:pStyle w:val="Listing"/>
+      </w:pPr>
+      <w:r>
+        <w:t xml:space="preserve">            while ((line = reader.readLine()) != null) {</w:t>
+      </w:r>
+    </w:p>
+    <w:p>
+      <w:pPr>
+        <w:pStyle w:val="Listing"/>
+      </w:pPr>
+      <w:r>
+        <w:t xml:space="preserve">                if (!line.trim().isEmpty() &amp;&amp; !line.startsWith("#")) {</w:t>
+      </w:r>
+    </w:p>
+    <w:p>
+      <w:pPr>
+        <w:pStyle w:val="Listing"/>
+      </w:pPr>
+      <w:r>
+        <w:t xml:space="preserve">                    lines.add(line);</w:t>
+      </w:r>
+    </w:p>
+    <w:p>
+      <w:pPr>
+        <w:pStyle w:val="Listing"/>
+      </w:pPr>
+      <w:r>
+        <w:t xml:space="preserve">                }</w:t>
+      </w:r>
+    </w:p>
+    <w:p>
+      <w:pPr>
+        <w:pStyle w:val="Listing"/>
+      </w:pPr>
+      <w:r>
+        <w:t xml:space="preserve">            }</w:t>
+      </w:r>
+    </w:p>
+    <w:p>
+      <w:pPr>
+        <w:pStyle w:val="Listing"/>
+      </w:pPr>
+      <w:r>
+        <w:t xml:space="preserve">        }</w:t>
+      </w:r>
+    </w:p>
+    <w:p>
+      <w:pPr>
+        <w:pStyle w:val="Listing"/>
+      </w:pPr>
+      <w:r>
+        <w:t xml:space="preserve">    } catch (IOException e) {</w:t>
+      </w:r>
+    </w:p>
+    <w:p>
+      <w:pPr>
+        <w:pStyle w:val="Listing"/>
+      </w:pPr>
+      <w:r>
+        <w:t xml:space="preserve">        System.out.println("Error: " + e.getMessage());</w:t>
+      </w:r>
+    </w:p>
+    <w:p>
+      <w:pPr>
+        <w:pStyle w:val="Listing"/>
+      </w:pPr>
+      <w:r>
+        <w:t xml:space="preserve">    }</w:t>
+      </w:r>
+    </w:p>
+    <w:p>
+      <w:pPr>
+        <w:pStyle w:val="Listing"/>
+      </w:pPr>
+      <w:r>
+        <w:t xml:space="preserve">    return lines;</w:t>
+      </w:r>
+    </w:p>
+    <w:p>
+      <w:pPr>
+        <w:pStyle w:val="Listing"/>
+      </w:pPr>
+      <w:r>
+        <w:t>}</w:t>
+      </w:r>
+    </w:p>
+    <w:p>
+      <w:pPr>
+        <w:pStyle w:val="Listing"/>
+      </w:pPr>
+    </w:p>
+    <w:p>
+      <w:pPr>
+        <w:pStyle w:val="Listing"/>
+      </w:pPr>
+      <w:r>
+        <w:t>// Число ключевых слов, найденных среди симптомов лекарства</w:t>
+      </w:r>
+    </w:p>
+    <w:p>
+      <w:pPr>
+        <w:pStyle w:val="Listing"/>
+      </w:pPr>
+      <w:r>
+        <w:t>private int testSymptoms(String symptoms, String[] keywords) {</w:t>
+      </w:r>
+    </w:p>
+    <w:p>
+      <w:pPr>
+        <w:pStyle w:val="Listing"/>
+      </w:pPr>
+      <w:r>
+        <w:t xml:space="preserve">    int results = 0;</w:t>
+      </w:r>
+    </w:p>
+    <w:p>
+      <w:pPr>
+        <w:pStyle w:val="Listing"/>
+      </w:pPr>
+      <w:r>
+        <w:t xml:space="preserve">    String content = symptoms.toLowerCase();</w:t>
+      </w:r>
+    </w:p>
+    <w:p>
+      <w:pPr>
+        <w:pStyle w:val="Listing"/>
+      </w:pPr>
+      <w:r>
+        <w:t xml:space="preserve">    for (String keyword : keywords) {</w:t>
+      </w:r>
+    </w:p>
+    <w:p>
+      <w:pPr>
+        <w:pStyle w:val="Listing"/>
+      </w:pPr>
+      <w:r>
+        <w:t xml:space="preserve">        if (!keyword.trim().isEmpty() &amp;&amp; content.contains(keyword.trim().toLowerCase())) {</w:t>
+      </w:r>
+    </w:p>
+    <w:p>
+      <w:pPr>
+        <w:pStyle w:val="Listing"/>
+      </w:pPr>
+      <w:r>
+        <w:t xml:space="preserve">            results++;</w:t>
+      </w:r>
+    </w:p>
+    <w:p>
+      <w:pPr>
+        <w:pStyle w:val="Listing"/>
+      </w:pPr>
+      <w:r>
+        <w:t xml:space="preserve">        }</w:t>
+      </w:r>
+    </w:p>
+    <w:p>
+      <w:pPr>
+        <w:pStyle w:val="Listing"/>
+      </w:pPr>
+      <w:r>
+        <w:t xml:space="preserve">    }</w:t>
+      </w:r>
+    </w:p>
+    <w:p>
+      <w:pPr>
+        <w:pStyle w:val="Listing"/>
+      </w:pPr>
+      <w:r>
+        <w:t xml:space="preserve">    return results;</w:t>
+      </w:r>
+    </w:p>
+    <w:p>
+      <w:pPr>
+        <w:pStyle w:val="Listing"/>
+      </w:pPr>
+      <w:r>
+        <w:t>}</w:t>
+      </w:r>
+    </w:p>
+    <w:p>
+      <w:pPr>
+        <w:pStyle w:val="Listing"/>
+      </w:pPr>
+    </w:p>
+    <w:p>
+      <w:pPr>
+        <w:pStyle w:val="Listing"/>
+      </w:pPr>
+      <w:r>
+        <w:t>// Открытие html-документа в браузере</w:t>
+      </w:r>
+    </w:p>
+    <w:p>
+      <w:pPr>
+        <w:pStyle w:val="Listing"/>
+      </w:pPr>
+      <w:r>
+        <w:t>private void openInBrowser(File file) {</w:t>
+      </w:r>
+    </w:p>
+    <w:p>
+      <w:pPr>
+        <w:pStyle w:val="Listing"/>
+      </w:pPr>
+      <w:r>
+        <w:t xml:space="preserve">    try {</w:t>
+      </w:r>
+    </w:p>
+    <w:p>
+      <w:pPr>
+        <w:pStyle w:val="Listing"/>
+      </w:pPr>
+      <w:r>
+        <w:t xml:space="preserve">        Desktop.getDesktop().browse(file.getAbsoluteFile().toURI());</w:t>
+      </w:r>
+    </w:p>
+    <w:p>
+      <w:pPr>
+        <w:pStyle w:val="Listing"/>
+      </w:pPr>
+      <w:r>
+        <w:t xml:space="preserve">    } catch (IOException e) {</w:t>
+      </w:r>
+    </w:p>
+    <w:p>
+      <w:pPr>
+        <w:pStyle w:val="Listing"/>
+      </w:pPr>
+      <w:r>
+        <w:t xml:space="preserve">        System.out.println("Error: " + e.getMessage());</w:t>
+      </w:r>
+    </w:p>
+    <w:p>
+      <w:pPr>
+        <w:pStyle w:val="Listing"/>
+      </w:pPr>
+      <w:r>
+        <w:t xml:space="preserve">    }</w:t>
+      </w:r>
+    </w:p>
+    <w:p>
+      <w:pPr>
+        <w:pStyle w:val="Listing"/>
+      </w:pPr>
+      <w:r>
+        <w:t>}</w:t>
+      </w:r>
+    </w:p>
+    <w:p/>
     <w:sectPr>
       <w:headerReference w:type="default" r:id="rId13"/>
       <w:footerReference w:type="default" r:id="rId14"/>
@@ -3957,31 +3948,31 @@
       </w:rPr>
     </w:lvl>
   </w:abstractNum>
-  <w:num w:numId="1" w16cid:durableId="778647475">
+  <w:num w:numId="1" w16cid:durableId="1984002347">
     <w:abstractNumId w:val="8"/>
   </w:num>
-  <w:num w:numId="2" w16cid:durableId="2068797499">
+  <w:num w:numId="2" w16cid:durableId="546795265">
     <w:abstractNumId w:val="6"/>
   </w:num>
-  <w:num w:numId="3" w16cid:durableId="1783845183">
+  <w:num w:numId="3" w16cid:durableId="1114254830">
     <w:abstractNumId w:val="5"/>
   </w:num>
-  <w:num w:numId="4" w16cid:durableId="1611475739">
+  <w:num w:numId="4" w16cid:durableId="1292783547">
     <w:abstractNumId w:val="4"/>
   </w:num>
-  <w:num w:numId="5" w16cid:durableId="647325909">
+  <w:num w:numId="5" w16cid:durableId="1490366897">
     <w:abstractNumId w:val="7"/>
   </w:num>
-  <w:num w:numId="6" w16cid:durableId="1796410528">
+  <w:num w:numId="6" w16cid:durableId="1924874051">
     <w:abstractNumId w:val="3"/>
   </w:num>
-  <w:num w:numId="7" w16cid:durableId="1651787280">
+  <w:num w:numId="7" w16cid:durableId="1122072669">
     <w:abstractNumId w:val="2"/>
   </w:num>
-  <w:num w:numId="8" w16cid:durableId="1622759989">
+  <w:num w:numId="8" w16cid:durableId="1991401534">
     <w:abstractNumId w:val="1"/>
   </w:num>
-  <w:num w:numId="9" w16cid:durableId="984242659">
+  <w:num w:numId="9" w16cid:durableId="958226075">
     <w:abstractNumId w:val="0"/>
   </w:num>
 </w:numbering>
@@ -4403,6 +4394,7 @@
       <w:rFonts w:asciiTheme="majorHAnsi" w:eastAsiaTheme="majorEastAsia" w:hAnsiTheme="majorHAnsi" w:cstheme="majorBidi"/>
       <w:b/>
       <w:bCs/>
+      <w:caps/>
       <w:szCs w:val="28"/>
     </w:rPr>
   </w:style>
@@ -15387,7 +15379,7 @@
     <w:autoRedefine/>
     <w:uiPriority w:val="39"/>
     <w:unhideWhenUsed/>
-    <w:rsid w:val="002D5C9D"/>
+    <w:rsid w:val="008F07BB"/>
     <w:pPr>
       <w:spacing w:after="100"/>
     </w:pPr>
@@ -15399,7 +15391,7 @@
     <w:autoRedefine/>
     <w:uiPriority w:val="39"/>
     <w:unhideWhenUsed/>
-    <w:rsid w:val="002D5C9D"/>
+    <w:rsid w:val="008F07BB"/>
     <w:pPr>
       <w:spacing w:after="100"/>
       <w:ind w:left="280"/>
@@ -15410,7 +15402,7 @@
     <w:basedOn w:val="a2"/>
     <w:uiPriority w:val="99"/>
     <w:unhideWhenUsed/>
-    <w:rsid w:val="002D5C9D"/>
+    <w:rsid w:val="008F07BB"/>
     <w:rPr>
       <w:color w:val="0000FF" w:themeColor="hyperlink"/>
       <w:u w:val="single"/>

</xml_diff>

<commit_message>
docs: rebuild reports in the ITiVP structure
</commit_message>
<xml_diff>
--- a/airp/lab1/report/Отчет_ЛР1.docx
+++ b/airp/lab1/report/Отчет_ЛР1.docx
@@ -142,6 +142,15 @@
     <w:p>
       <w:pPr>
         <w:keepLines/>
+        <w:jc w:val="center"/>
+      </w:pPr>
+      <w:r>
+        <w:t>Вариант 2</w:t>
+      </w:r>
+    </w:p>
+    <w:p>
+      <w:pPr>
+        <w:keepLines/>
       </w:pPr>
     </w:p>
     <w:p>
@@ -188,7 +197,7 @@
       </w:pPr>
       <w:r>
         <w:tab/>
-        <w:t>К. А. Хаджинова</w:t>
+        <w:t>К.А. Хаджинова</w:t>
       </w:r>
     </w:p>
     <w:p>
@@ -213,7 +222,7 @@
       </w:r>
       <w:r>
         <w:tab/>
-        <w:t>Ю. О. Герман</w:t>
+        <w:t>Ю.О. Герман</w:t>
       </w:r>
     </w:p>
     <w:p>
@@ -297,13 +306,13 @@
       <w:r>
         <w:fldChar w:fldCharType="separate"/>
       </w:r>
-      <w:hyperlink w:anchor="_Toc242385922" w:history="1">
+      <w:hyperlink w:anchor="_Toc242612903" w:history="1">
         <w:r>
           <w:rPr>
             <w:rStyle w:val="aff8"/>
             <w:noProof/>
           </w:rPr>
-          <w:t>1 ЦЕЛЬ РАБОТЫ</w:t>
+          <w:t>1 Цель работы</w:t>
         </w:r>
         <w:r>
           <w:rPr>
@@ -324,7 +333,7 @@
             <w:noProof/>
             <w:webHidden/>
           </w:rPr>
-          <w:instrText xml:space="preserve"> PAGEREF _Toc242385922 \h </w:instrText>
+          <w:instrText xml:space="preserve"> PAGEREF _Toc242612903 \h </w:instrText>
         </w:r>
         <w:r>
           <w:rPr>
@@ -370,13 +379,13 @@
           <w14:ligatures w14:val="standardContextual"/>
         </w:rPr>
       </w:pPr>
-      <w:hyperlink w:anchor="_Toc242385923" w:history="1">
+      <w:hyperlink w:anchor="_Toc242612904" w:history="1">
         <w:r>
           <w:rPr>
             <w:rStyle w:val="aff8"/>
             <w:noProof/>
           </w:rPr>
-          <w:t>2 ТЕОРЕТИЧЕСКИЕ СВЕДЕНИЯ</w:t>
+          <w:t>2 Ход работы</w:t>
         </w:r>
         <w:r>
           <w:rPr>
@@ -397,7 +406,7 @@
             <w:noProof/>
             <w:webHidden/>
           </w:rPr>
-          <w:instrText xml:space="preserve"> PAGEREF _Toc242385923 \h </w:instrText>
+          <w:instrText xml:space="preserve"> PAGEREF _Toc242612904 \h </w:instrText>
         </w:r>
         <w:r>
           <w:rPr>
@@ -430,7 +439,7 @@
     </w:p>
     <w:p>
       <w:pPr>
-        <w:pStyle w:val="14"/>
+        <w:pStyle w:val="2c"/>
         <w:tabs>
           <w:tab w:val="right" w:leader="dot" w:pos="9345"/>
         </w:tabs>
@@ -443,13 +452,13 @@
           <w14:ligatures w14:val="standardContextual"/>
         </w:rPr>
       </w:pPr>
-      <w:hyperlink w:anchor="_Toc242385924" w:history="1">
+      <w:hyperlink w:anchor="_Toc242612905" w:history="1">
         <w:r>
           <w:rPr>
             <w:rStyle w:val="aff8"/>
             <w:noProof/>
           </w:rPr>
-          <w:t>3 ВЫПОЛНЕНИЕ РАБОТЫ</w:t>
+          <w:t>2.1 Постановка задачи</w:t>
         </w:r>
         <w:r>
           <w:rPr>
@@ -470,7 +479,226 @@
             <w:noProof/>
             <w:webHidden/>
           </w:rPr>
-          <w:instrText xml:space="preserve"> PAGEREF _Toc242385924 \h </w:instrText>
+          <w:instrText xml:space="preserve"> PAGEREF _Toc242612905 \h </w:instrText>
+        </w:r>
+        <w:r>
+          <w:rPr>
+            <w:noProof/>
+            <w:webHidden/>
+          </w:rPr>
+        </w:r>
+        <w:r>
+          <w:rPr>
+            <w:noProof/>
+            <w:webHidden/>
+          </w:rPr>
+          <w:fldChar w:fldCharType="separate"/>
+        </w:r>
+        <w:r>
+          <w:rPr>
+            <w:noProof/>
+            <w:webHidden/>
+          </w:rPr>
+          <w:t>4</w:t>
+        </w:r>
+        <w:r>
+          <w:rPr>
+            <w:noProof/>
+            <w:webHidden/>
+          </w:rPr>
+          <w:fldChar w:fldCharType="end"/>
+        </w:r>
+      </w:hyperlink>
+    </w:p>
+    <w:p>
+      <w:pPr>
+        <w:pStyle w:val="2c"/>
+        <w:tabs>
+          <w:tab w:val="right" w:leader="dot" w:pos="9345"/>
+        </w:tabs>
+        <w:rPr>
+          <w:rFonts w:asciiTheme="minorHAnsi" w:eastAsiaTheme="minorEastAsia" w:hAnsiTheme="minorHAnsi"/>
+          <w:noProof/>
+          <w:kern w:val="2"/>
+          <w:sz w:val="24"/>
+          <w:szCs w:val="24"/>
+          <w14:ligatures w14:val="standardContextual"/>
+        </w:rPr>
+      </w:pPr>
+      <w:hyperlink w:anchor="_Toc242612906" w:history="1">
+        <w:r>
+          <w:rPr>
+            <w:rStyle w:val="aff8"/>
+            <w:noProof/>
+          </w:rPr>
+          <w:t>2.2 Теоретические сведения</w:t>
+        </w:r>
+        <w:r>
+          <w:rPr>
+            <w:noProof/>
+            <w:webHidden/>
+          </w:rPr>
+          <w:tab/>
+        </w:r>
+        <w:r>
+          <w:rPr>
+            <w:noProof/>
+            <w:webHidden/>
+          </w:rPr>
+          <w:fldChar w:fldCharType="begin"/>
+        </w:r>
+        <w:r>
+          <w:rPr>
+            <w:noProof/>
+            <w:webHidden/>
+          </w:rPr>
+          <w:instrText xml:space="preserve"> PAGEREF _Toc242612906 \h </w:instrText>
+        </w:r>
+        <w:r>
+          <w:rPr>
+            <w:noProof/>
+            <w:webHidden/>
+          </w:rPr>
+        </w:r>
+        <w:r>
+          <w:rPr>
+            <w:noProof/>
+            <w:webHidden/>
+          </w:rPr>
+          <w:fldChar w:fldCharType="separate"/>
+        </w:r>
+        <w:r>
+          <w:rPr>
+            <w:noProof/>
+            <w:webHidden/>
+          </w:rPr>
+          <w:t>4</w:t>
+        </w:r>
+        <w:r>
+          <w:rPr>
+            <w:noProof/>
+            <w:webHidden/>
+          </w:rPr>
+          <w:fldChar w:fldCharType="end"/>
+        </w:r>
+      </w:hyperlink>
+    </w:p>
+    <w:p>
+      <w:pPr>
+        <w:pStyle w:val="2c"/>
+        <w:tabs>
+          <w:tab w:val="right" w:leader="dot" w:pos="9345"/>
+        </w:tabs>
+        <w:rPr>
+          <w:rFonts w:asciiTheme="minorHAnsi" w:eastAsiaTheme="minorEastAsia" w:hAnsiTheme="minorHAnsi"/>
+          <w:noProof/>
+          <w:kern w:val="2"/>
+          <w:sz w:val="24"/>
+          <w:szCs w:val="24"/>
+          <w14:ligatures w14:val="standardContextual"/>
+        </w:rPr>
+      </w:pPr>
+      <w:hyperlink w:anchor="_Toc242612907" w:history="1">
+        <w:r>
+          <w:rPr>
+            <w:rStyle w:val="aff8"/>
+            <w:noProof/>
+          </w:rPr>
+          <w:t>2.3 Подготовка среды</w:t>
+        </w:r>
+        <w:r>
+          <w:rPr>
+            <w:noProof/>
+            <w:webHidden/>
+          </w:rPr>
+          <w:tab/>
+        </w:r>
+        <w:r>
+          <w:rPr>
+            <w:noProof/>
+            <w:webHidden/>
+          </w:rPr>
+          <w:fldChar w:fldCharType="begin"/>
+        </w:r>
+        <w:r>
+          <w:rPr>
+            <w:noProof/>
+            <w:webHidden/>
+          </w:rPr>
+          <w:instrText xml:space="preserve"> PAGEREF _Toc242612907 \h </w:instrText>
+        </w:r>
+        <w:r>
+          <w:rPr>
+            <w:noProof/>
+            <w:webHidden/>
+          </w:rPr>
+        </w:r>
+        <w:r>
+          <w:rPr>
+            <w:noProof/>
+            <w:webHidden/>
+          </w:rPr>
+          <w:fldChar w:fldCharType="separate"/>
+        </w:r>
+        <w:r>
+          <w:rPr>
+            <w:noProof/>
+            <w:webHidden/>
+          </w:rPr>
+          <w:t>4</w:t>
+        </w:r>
+        <w:r>
+          <w:rPr>
+            <w:noProof/>
+            <w:webHidden/>
+          </w:rPr>
+          <w:fldChar w:fldCharType="end"/>
+        </w:r>
+      </w:hyperlink>
+    </w:p>
+    <w:p>
+      <w:pPr>
+        <w:pStyle w:val="2c"/>
+        <w:tabs>
+          <w:tab w:val="right" w:leader="dot" w:pos="9345"/>
+        </w:tabs>
+        <w:rPr>
+          <w:rFonts w:asciiTheme="minorHAnsi" w:eastAsiaTheme="minorEastAsia" w:hAnsiTheme="minorHAnsi"/>
+          <w:noProof/>
+          <w:kern w:val="2"/>
+          <w:sz w:val="24"/>
+          <w:szCs w:val="24"/>
+          <w14:ligatures w14:val="standardContextual"/>
+        </w:rPr>
+      </w:pPr>
+      <w:hyperlink w:anchor="_Toc242612908" w:history="1">
+        <w:r>
+          <w:rPr>
+            <w:rStyle w:val="aff8"/>
+            <w:noProof/>
+          </w:rPr>
+          <w:t>2.4 Индивидуальное задание и исходные данные</w:t>
+        </w:r>
+        <w:r>
+          <w:rPr>
+            <w:noProof/>
+            <w:webHidden/>
+          </w:rPr>
+          <w:tab/>
+        </w:r>
+        <w:r>
+          <w:rPr>
+            <w:noProof/>
+            <w:webHidden/>
+          </w:rPr>
+          <w:fldChar w:fldCharType="begin"/>
+        </w:r>
+        <w:r>
+          <w:rPr>
+            <w:noProof/>
+            <w:webHidden/>
+          </w:rPr>
+          <w:instrText xml:space="preserve"> PAGEREF _Toc242612908 \h </w:instrText>
         </w:r>
         <w:r>
           <w:rPr>
@@ -516,13 +744,13 @@
           <w14:ligatures w14:val="standardContextual"/>
         </w:rPr>
       </w:pPr>
-      <w:hyperlink w:anchor="_Toc242385925" w:history="1">
+      <w:hyperlink w:anchor="_Toc242612909" w:history="1">
         <w:r>
           <w:rPr>
             <w:rStyle w:val="aff8"/>
             <w:noProof/>
           </w:rPr>
-          <w:t>3.1 Подготовка среды</w:t>
+          <w:t>2.5 Программа</w:t>
         </w:r>
         <w:r>
           <w:rPr>
@@ -543,7 +771,7 @@
             <w:noProof/>
             <w:webHidden/>
           </w:rPr>
-          <w:instrText xml:space="preserve"> PAGEREF _Toc242385925 \h </w:instrText>
+          <w:instrText xml:space="preserve"> PAGEREF _Toc242612909 \h </w:instrText>
         </w:r>
         <w:r>
           <w:rPr>
@@ -589,13 +817,13 @@
           <w14:ligatures w14:val="standardContextual"/>
         </w:rPr>
       </w:pPr>
-      <w:hyperlink w:anchor="_Toc242385926" w:history="1">
+      <w:hyperlink w:anchor="_Toc242612910" w:history="1">
         <w:r>
           <w:rPr>
             <w:rStyle w:val="aff8"/>
             <w:noProof/>
           </w:rPr>
-          <w:t>3.2 Индивидуальное задание и исходные данные</w:t>
+          <w:t>2.6 Результаты работы</w:t>
         </w:r>
         <w:r>
           <w:rPr>
@@ -616,7 +844,7 @@
             <w:noProof/>
             <w:webHidden/>
           </w:rPr>
-          <w:instrText xml:space="preserve"> PAGEREF _Toc242385926 \h </w:instrText>
+          <w:instrText xml:space="preserve"> PAGEREF _Toc242612910 \h </w:instrText>
         </w:r>
         <w:r>
           <w:rPr>
@@ -636,7 +864,7 @@
             <w:noProof/>
             <w:webHidden/>
           </w:rPr>
-          <w:t>5</w:t>
+          <w:t>6</w:t>
         </w:r>
         <w:r>
           <w:rPr>
@@ -649,7 +877,7 @@
     </w:p>
     <w:p>
       <w:pPr>
-        <w:pStyle w:val="2c"/>
+        <w:pStyle w:val="14"/>
         <w:tabs>
           <w:tab w:val="right" w:leader="dot" w:pos="9345"/>
         </w:tabs>
@@ -662,13 +890,13 @@
           <w14:ligatures w14:val="standardContextual"/>
         </w:rPr>
       </w:pPr>
-      <w:hyperlink w:anchor="_Toc242385927" w:history="1">
+      <w:hyperlink w:anchor="_Toc242612911" w:history="1">
         <w:r>
           <w:rPr>
             <w:rStyle w:val="aff8"/>
             <w:noProof/>
           </w:rPr>
-          <w:t>3.3 Программа</w:t>
+          <w:t>3 Ответы на контрольные вопросы</w:t>
         </w:r>
         <w:r>
           <w:rPr>
@@ -689,7 +917,7 @@
             <w:noProof/>
             <w:webHidden/>
           </w:rPr>
-          <w:instrText xml:space="preserve"> PAGEREF _Toc242385927 \h </w:instrText>
+          <w:instrText xml:space="preserve"> PAGEREF _Toc242612911 \h </w:instrText>
         </w:r>
         <w:r>
           <w:rPr>
@@ -709,7 +937,7 @@
             <w:noProof/>
             <w:webHidden/>
           </w:rPr>
-          <w:t>5</w:t>
+          <w:t>9</w:t>
         </w:r>
         <w:r>
           <w:rPr>
@@ -722,7 +950,7 @@
     </w:p>
     <w:p>
       <w:pPr>
-        <w:pStyle w:val="2c"/>
+        <w:pStyle w:val="14"/>
         <w:tabs>
           <w:tab w:val="right" w:leader="dot" w:pos="9345"/>
         </w:tabs>
@@ -735,13 +963,13 @@
           <w14:ligatures w14:val="standardContextual"/>
         </w:rPr>
       </w:pPr>
-      <w:hyperlink w:anchor="_Toc242385928" w:history="1">
+      <w:hyperlink w:anchor="_Toc242612912" w:history="1">
         <w:r>
           <w:rPr>
             <w:rStyle w:val="aff8"/>
             <w:noProof/>
           </w:rPr>
-          <w:t>3.4 Результаты работы</w:t>
+          <w:t>Выводы</w:t>
         </w:r>
         <w:r>
           <w:rPr>
@@ -762,7 +990,7 @@
             <w:noProof/>
             <w:webHidden/>
           </w:rPr>
-          <w:instrText xml:space="preserve"> PAGEREF _Toc242385928 \h </w:instrText>
+          <w:instrText xml:space="preserve"> PAGEREF _Toc242612912 \h </w:instrText>
         </w:r>
         <w:r>
           <w:rPr>
@@ -782,7 +1010,7 @@
             <w:noProof/>
             <w:webHidden/>
           </w:rPr>
-          <w:t>7</w:t>
+          <w:t>10</w:t>
         </w:r>
         <w:r>
           <w:rPr>
@@ -808,13 +1036,13 @@
           <w14:ligatures w14:val="standardContextual"/>
         </w:rPr>
       </w:pPr>
-      <w:hyperlink w:anchor="_Toc242385929" w:history="1">
+      <w:hyperlink w:anchor="_Toc242612913" w:history="1">
         <w:r>
           <w:rPr>
             <w:rStyle w:val="aff8"/>
             <w:noProof/>
           </w:rPr>
-          <w:t>4 КОНТРОЛЬНЫЕ ВОПРОСЫ</w:t>
+          <w:t>Приложение А (обязательное) Листинги программного кода</w:t>
         </w:r>
         <w:r>
           <w:rPr>
@@ -835,7 +1063,7 @@
             <w:noProof/>
             <w:webHidden/>
           </w:rPr>
-          <w:instrText xml:space="preserve"> PAGEREF _Toc242385929 \h </w:instrText>
+          <w:instrText xml:space="preserve"> PAGEREF _Toc242612913 \h </w:instrText>
         </w:r>
         <w:r>
           <w:rPr>
@@ -867,394 +1095,6 @@
       </w:hyperlink>
     </w:p>
     <w:p>
-      <w:pPr>
-        <w:pStyle w:val="2c"/>
-        <w:tabs>
-          <w:tab w:val="right" w:leader="dot" w:pos="9345"/>
-        </w:tabs>
-        <w:rPr>
-          <w:rFonts w:asciiTheme="minorHAnsi" w:eastAsiaTheme="minorEastAsia" w:hAnsiTheme="minorHAnsi"/>
-          <w:noProof/>
-          <w:kern w:val="2"/>
-          <w:sz w:val="24"/>
-          <w:szCs w:val="24"/>
-          <w14:ligatures w14:val="standardContextual"/>
-        </w:rPr>
-      </w:pPr>
-      <w:hyperlink w:anchor="_Toc242385930" w:history="1">
-        <w:r>
-          <w:rPr>
-            <w:rStyle w:val="aff8"/>
-            <w:noProof/>
-          </w:rPr>
-          <w:t xml:space="preserve">4.1 Что такое </w:t>
-        </w:r>
-        <w:r>
-          <w:rPr>
-            <w:rStyle w:val="aff8"/>
-            <w:i/>
-            <w:noProof/>
-          </w:rPr>
-          <w:t>URL</w:t>
-        </w:r>
-        <w:r>
-          <w:rPr>
-            <w:noProof/>
-            <w:webHidden/>
-          </w:rPr>
-          <w:tab/>
-        </w:r>
-        <w:r>
-          <w:rPr>
-            <w:noProof/>
-            <w:webHidden/>
-          </w:rPr>
-          <w:fldChar w:fldCharType="begin"/>
-        </w:r>
-        <w:r>
-          <w:rPr>
-            <w:noProof/>
-            <w:webHidden/>
-          </w:rPr>
-          <w:instrText xml:space="preserve"> PAGEREF _Toc242385930 \h </w:instrText>
-        </w:r>
-        <w:r>
-          <w:rPr>
-            <w:noProof/>
-            <w:webHidden/>
-          </w:rPr>
-        </w:r>
-        <w:r>
-          <w:rPr>
-            <w:noProof/>
-            <w:webHidden/>
-          </w:rPr>
-          <w:fldChar w:fldCharType="separate"/>
-        </w:r>
-        <w:r>
-          <w:rPr>
-            <w:noProof/>
-            <w:webHidden/>
-          </w:rPr>
-          <w:t>11</w:t>
-        </w:r>
-        <w:r>
-          <w:rPr>
-            <w:noProof/>
-            <w:webHidden/>
-          </w:rPr>
-          <w:fldChar w:fldCharType="end"/>
-        </w:r>
-      </w:hyperlink>
-    </w:p>
-    <w:p>
-      <w:pPr>
-        <w:pStyle w:val="2c"/>
-        <w:tabs>
-          <w:tab w:val="right" w:leader="dot" w:pos="9345"/>
-        </w:tabs>
-        <w:rPr>
-          <w:rFonts w:asciiTheme="minorHAnsi" w:eastAsiaTheme="minorEastAsia" w:hAnsiTheme="minorHAnsi"/>
-          <w:noProof/>
-          <w:kern w:val="2"/>
-          <w:sz w:val="24"/>
-          <w:szCs w:val="24"/>
-          <w14:ligatures w14:val="standardContextual"/>
-        </w:rPr>
-      </w:pPr>
-      <w:hyperlink w:anchor="_Toc242385931" w:history="1">
-        <w:r>
-          <w:rPr>
-            <w:rStyle w:val="aff8"/>
-            <w:noProof/>
-          </w:rPr>
-          <w:t>4.2 Как программно получить список всех файлов в папке</w:t>
-        </w:r>
-        <w:r>
-          <w:rPr>
-            <w:noProof/>
-            <w:webHidden/>
-          </w:rPr>
-          <w:tab/>
-        </w:r>
-        <w:r>
-          <w:rPr>
-            <w:noProof/>
-            <w:webHidden/>
-          </w:rPr>
-          <w:fldChar w:fldCharType="begin"/>
-        </w:r>
-        <w:r>
-          <w:rPr>
-            <w:noProof/>
-            <w:webHidden/>
-          </w:rPr>
-          <w:instrText xml:space="preserve"> PAGEREF _Toc242385931 \h </w:instrText>
-        </w:r>
-        <w:r>
-          <w:rPr>
-            <w:noProof/>
-            <w:webHidden/>
-          </w:rPr>
-        </w:r>
-        <w:r>
-          <w:rPr>
-            <w:noProof/>
-            <w:webHidden/>
-          </w:rPr>
-          <w:fldChar w:fldCharType="separate"/>
-        </w:r>
-        <w:r>
-          <w:rPr>
-            <w:noProof/>
-            <w:webHidden/>
-          </w:rPr>
-          <w:t>11</w:t>
-        </w:r>
-        <w:r>
-          <w:rPr>
-            <w:noProof/>
-            <w:webHidden/>
-          </w:rPr>
-          <w:fldChar w:fldCharType="end"/>
-        </w:r>
-      </w:hyperlink>
-    </w:p>
-    <w:p>
-      <w:pPr>
-        <w:pStyle w:val="2c"/>
-        <w:tabs>
-          <w:tab w:val="right" w:leader="dot" w:pos="9345"/>
-        </w:tabs>
-        <w:rPr>
-          <w:rFonts w:asciiTheme="minorHAnsi" w:eastAsiaTheme="minorEastAsia" w:hAnsiTheme="minorHAnsi"/>
-          <w:noProof/>
-          <w:kern w:val="2"/>
-          <w:sz w:val="24"/>
-          <w:szCs w:val="24"/>
-          <w14:ligatures w14:val="standardContextual"/>
-        </w:rPr>
-      </w:pPr>
-      <w:hyperlink w:anchor="_Toc242385932" w:history="1">
-        <w:r>
-          <w:rPr>
-            <w:rStyle w:val="aff8"/>
-            <w:noProof/>
-          </w:rPr>
-          <w:t xml:space="preserve">4.3 Как программно запустить браузер и открыть </w:t>
-        </w:r>
-        <w:r>
-          <w:rPr>
-            <w:rStyle w:val="aff8"/>
-            <w:i/>
-            <w:noProof/>
-          </w:rPr>
-          <w:t>html</w:t>
-        </w:r>
-        <w:r>
-          <w:rPr>
-            <w:rStyle w:val="aff8"/>
-            <w:noProof/>
-          </w:rPr>
-          <w:t>-файл</w:t>
-        </w:r>
-        <w:r>
-          <w:rPr>
-            <w:noProof/>
-            <w:webHidden/>
-          </w:rPr>
-          <w:tab/>
-        </w:r>
-        <w:r>
-          <w:rPr>
-            <w:noProof/>
-            <w:webHidden/>
-          </w:rPr>
-          <w:fldChar w:fldCharType="begin"/>
-        </w:r>
-        <w:r>
-          <w:rPr>
-            <w:noProof/>
-            <w:webHidden/>
-          </w:rPr>
-          <w:instrText xml:space="preserve"> PAGEREF _Toc242385932 \h </w:instrText>
-        </w:r>
-        <w:r>
-          <w:rPr>
-            <w:noProof/>
-            <w:webHidden/>
-          </w:rPr>
-        </w:r>
-        <w:r>
-          <w:rPr>
-            <w:noProof/>
-            <w:webHidden/>
-          </w:rPr>
-          <w:fldChar w:fldCharType="separate"/>
-        </w:r>
-        <w:r>
-          <w:rPr>
-            <w:noProof/>
-            <w:webHidden/>
-          </w:rPr>
-          <w:t>11</w:t>
-        </w:r>
-        <w:r>
-          <w:rPr>
-            <w:noProof/>
-            <w:webHidden/>
-          </w:rPr>
-          <w:fldChar w:fldCharType="end"/>
-        </w:r>
-      </w:hyperlink>
-    </w:p>
-    <w:p>
-      <w:pPr>
-        <w:pStyle w:val="2c"/>
-        <w:tabs>
-          <w:tab w:val="right" w:leader="dot" w:pos="9345"/>
-        </w:tabs>
-        <w:rPr>
-          <w:rFonts w:asciiTheme="minorHAnsi" w:eastAsiaTheme="minorEastAsia" w:hAnsiTheme="minorHAnsi"/>
-          <w:noProof/>
-          <w:kern w:val="2"/>
-          <w:sz w:val="24"/>
-          <w:szCs w:val="24"/>
-          <w14:ligatures w14:val="standardContextual"/>
-        </w:rPr>
-      </w:pPr>
-      <w:hyperlink w:anchor="_Toc242385933" w:history="1">
-        <w:r>
-          <w:rPr>
-            <w:rStyle w:val="aff8"/>
-            <w:noProof/>
-          </w:rPr>
-          <w:t>4.4 Использование потоковых классов в приложении</w:t>
-        </w:r>
-        <w:r>
-          <w:rPr>
-            <w:noProof/>
-            <w:webHidden/>
-          </w:rPr>
-          <w:tab/>
-        </w:r>
-        <w:r>
-          <w:rPr>
-            <w:noProof/>
-            <w:webHidden/>
-          </w:rPr>
-          <w:fldChar w:fldCharType="begin"/>
-        </w:r>
-        <w:r>
-          <w:rPr>
-            <w:noProof/>
-            <w:webHidden/>
-          </w:rPr>
-          <w:instrText xml:space="preserve"> PAGEREF _Toc242385933 \h </w:instrText>
-        </w:r>
-        <w:r>
-          <w:rPr>
-            <w:noProof/>
-            <w:webHidden/>
-          </w:rPr>
-        </w:r>
-        <w:r>
-          <w:rPr>
-            <w:noProof/>
-            <w:webHidden/>
-          </w:rPr>
-          <w:fldChar w:fldCharType="separate"/>
-        </w:r>
-        <w:r>
-          <w:rPr>
-            <w:noProof/>
-            <w:webHidden/>
-          </w:rPr>
-          <w:t>11</w:t>
-        </w:r>
-        <w:r>
-          <w:rPr>
-            <w:noProof/>
-            <w:webHidden/>
-          </w:rPr>
-          <w:fldChar w:fldCharType="end"/>
-        </w:r>
-      </w:hyperlink>
-    </w:p>
-    <w:p>
-      <w:pPr>
-        <w:pStyle w:val="14"/>
-        <w:tabs>
-          <w:tab w:val="right" w:leader="dot" w:pos="9345"/>
-        </w:tabs>
-        <w:rPr>
-          <w:rFonts w:asciiTheme="minorHAnsi" w:eastAsiaTheme="minorEastAsia" w:hAnsiTheme="minorHAnsi"/>
-          <w:noProof/>
-          <w:kern w:val="2"/>
-          <w:sz w:val="24"/>
-          <w:szCs w:val="24"/>
-          <w14:ligatures w14:val="standardContextual"/>
-        </w:rPr>
-      </w:pPr>
-      <w:hyperlink w:anchor="_Toc242385934" w:history="1">
-        <w:r>
-          <w:rPr>
-            <w:rStyle w:val="aff8"/>
-            <w:noProof/>
-          </w:rPr>
-          <w:t>ЗАКЛЮЧЕНИЕ</w:t>
-        </w:r>
-        <w:r>
-          <w:rPr>
-            <w:noProof/>
-            <w:webHidden/>
-          </w:rPr>
-          <w:tab/>
-        </w:r>
-        <w:r>
-          <w:rPr>
-            <w:noProof/>
-            <w:webHidden/>
-          </w:rPr>
-          <w:fldChar w:fldCharType="begin"/>
-        </w:r>
-        <w:r>
-          <w:rPr>
-            <w:noProof/>
-            <w:webHidden/>
-          </w:rPr>
-          <w:instrText xml:space="preserve"> PAGEREF _Toc242385934 \h </w:instrText>
-        </w:r>
-        <w:r>
-          <w:rPr>
-            <w:noProof/>
-            <w:webHidden/>
-          </w:rPr>
-        </w:r>
-        <w:r>
-          <w:rPr>
-            <w:noProof/>
-            <w:webHidden/>
-          </w:rPr>
-          <w:fldChar w:fldCharType="separate"/>
-        </w:r>
-        <w:r>
-          <w:rPr>
-            <w:noProof/>
-            <w:webHidden/>
-          </w:rPr>
-          <w:t>12</w:t>
-        </w:r>
-        <w:r>
-          <w:rPr>
-            <w:noProof/>
-            <w:webHidden/>
-          </w:rPr>
-          <w:fldChar w:fldCharType="end"/>
-        </w:r>
-      </w:hyperlink>
-    </w:p>
-    <w:p>
       <w:r>
         <w:fldChar w:fldCharType="end"/>
       </w:r>
@@ -1269,13 +1109,13 @@
         <w:pStyle w:val="1"/>
         <w:ind w:firstLine="709"/>
       </w:pPr>
-      <w:bookmarkStart w:id="0" w:name="_Toc242385922"/>
+      <w:bookmarkStart w:id="0" w:name="_Toc242612903"/>
       <w:r>
         <w:rPr>
           <w:rFonts w:ascii="Times New Roman" w:hAnsi="Times New Roman"/>
         </w:rPr>
         <w:lastRenderedPageBreak/>
-        <w:t>1 ЦЕЛЬ РАБОТЫ</w:t>
+        <w:t>1 Цель работы</w:t>
       </w:r>
       <w:bookmarkEnd w:id="0"/>
     </w:p>
@@ -1285,7 +1125,25 @@
         <w:jc w:val="both"/>
       </w:pPr>
       <w:r>
-        <w:t xml:space="preserve">Познакомиться с возможностями поиска информации в удаленных </w:t>
+        <w:t xml:space="preserve">Изучить механизмы работы с </w:t>
+      </w:r>
+      <w:r>
+        <w:rPr>
+          <w:i/>
+        </w:rPr>
+        <w:t>Web</w:t>
+      </w:r>
+      <w:r>
+        <w:t xml:space="preserve">-ресурсами в языке </w:t>
+      </w:r>
+      <w:r>
+        <w:rPr>
+          <w:i/>
+        </w:rPr>
+        <w:t>Java</w:t>
+      </w:r>
+      <w:r>
+        <w:t xml:space="preserve">: получение содержимого ресурса по </w:t>
       </w:r>
       <w:r>
         <w:rPr>
@@ -1294,7 +1152,16 @@
         <w:t>URL</w:t>
       </w:r>
       <w:r>
-        <w:t>-ресурсах.</w:t>
+        <w:t xml:space="preserve"> с помощью потоковых классов, программный запуск браузера, получение списка файлов каталога и построение оконного приложения на основе библиотеки </w:t>
+      </w:r>
+      <w:r>
+        <w:rPr>
+          <w:i/>
+        </w:rPr>
+        <w:t>AWT</w:t>
+      </w:r>
+      <w:r>
+        <w:t>. Научиться выполнять индивидуальное задание варианта 2 – поиск названия лекарства по симптомам в файле-справочнике.</w:t>
       </w:r>
     </w:p>
     <w:p>
@@ -1307,13 +1174,13 @@
         <w:pStyle w:val="1"/>
         <w:ind w:firstLine="709"/>
       </w:pPr>
-      <w:bookmarkStart w:id="1" w:name="_Toc242385923"/>
+      <w:bookmarkStart w:id="1" w:name="_Toc242612904"/>
       <w:r>
         <w:rPr>
           <w:rFonts w:ascii="Times New Roman" w:hAnsi="Times New Roman"/>
         </w:rPr>
         <w:lastRenderedPageBreak/>
-        <w:t>2 ТЕОРЕТИЧЕСКИЕ СВЕДЕНИЯ</w:t>
+        <w:t>2 Ход работы</w:t>
       </w:r>
       <w:bookmarkEnd w:id="1"/>
     </w:p>
@@ -1323,7 +1190,76 @@
         <w:jc w:val="both"/>
       </w:pPr>
       <w:r>
-        <w:t xml:space="preserve">Работа посвящена поиску информационных документов по набору ключевых слов. Приложение вводит ключевые слова, находит документ, соответствующий (релевантный) введенному набору, и открывает его в браузере. Источником данных служат ресурсы, адресуемые </w:t>
+        <w:t xml:space="preserve">Работа выполнена на языке </w:t>
+      </w:r>
+      <w:r>
+        <w:rPr>
+          <w:i/>
+        </w:rPr>
+        <w:t>Java</w:t>
+      </w:r>
+      <w:r>
+        <w:t xml:space="preserve"> 17 с использованием библиотеки </w:t>
+      </w:r>
+      <w:r>
+        <w:rPr>
+          <w:i/>
+        </w:rPr>
+        <w:t>AWT</w:t>
+      </w:r>
+      <w:r>
+        <w:t>. Полный текст программы приведен в приложении А. Ниже последовательно описаны постановка задачи, теоретическая основа, реализация заданий и результаты проверки.</w:t>
+      </w:r>
+    </w:p>
+    <w:p>
+      <w:pPr>
+        <w:pStyle w:val="21"/>
+        <w:spacing w:before="360"/>
+        <w:ind w:firstLine="709"/>
+      </w:pPr>
+      <w:bookmarkStart w:id="2" w:name="_Toc242612905"/>
+      <w:r>
+        <w:rPr>
+          <w:rFonts w:ascii="Times New Roman" w:hAnsi="Times New Roman"/>
+        </w:rPr>
+        <w:t>2.1 Постановка задачи</w:t>
+      </w:r>
+      <w:bookmarkEnd w:id="2"/>
+    </w:p>
+    <w:p>
+      <w:pPr>
+        <w:ind w:firstLine="709"/>
+        <w:jc w:val="both"/>
+      </w:pPr>
+      <w:r>
+        <w:t xml:space="preserve">Для изучения работы с </w:t>
+      </w:r>
+      <w:r>
+        <w:rPr>
+          <w:i/>
+        </w:rPr>
+        <w:t>Web</w:t>
+      </w:r>
+      <w:r>
+        <w:t>-ресурсами в рамках работы требуется выполнить следующие задачи:</w:t>
+      </w:r>
+    </w:p>
+    <w:p>
+      <w:pPr>
+        <w:ind w:firstLine="709"/>
+        <w:jc w:val="both"/>
+      </w:pPr>
+      <w:r>
+        <w:t>1 создать оконное приложение на основе заготовки из методических указаний;</w:t>
+      </w:r>
+    </w:p>
+    <w:p>
+      <w:pPr>
+        <w:ind w:firstLine="709"/>
+        <w:jc w:val="both"/>
+      </w:pPr>
+      <w:r>
+        <w:t xml:space="preserve">2 прочитать содержимое файла-справочника через </w:t>
       </w:r>
       <w:r>
         <w:rPr>
@@ -1332,6 +1268,57 @@
         <w:t>URL</w:t>
       </w:r>
       <w:r>
+        <w:t xml:space="preserve"> и потоковые классы;</w:t>
+      </w:r>
+    </w:p>
+    <w:p>
+      <w:pPr>
+        <w:ind w:firstLine="709"/>
+        <w:jc w:val="both"/>
+      </w:pPr>
+      <w:r>
+        <w:t>3 реализовать индивидуальное задание: по введенным симптомам найти название лекарства;</w:t>
+      </w:r>
+    </w:p>
+    <w:p>
+      <w:pPr>
+        <w:ind w:firstLine="709"/>
+        <w:jc w:val="both"/>
+      </w:pPr>
+      <w:r>
+        <w:t>4 вывести результат пользователю в окне приложения.</w:t>
+      </w:r>
+    </w:p>
+    <w:p>
+      <w:pPr>
+        <w:pStyle w:val="21"/>
+        <w:spacing w:before="360"/>
+        <w:ind w:firstLine="709"/>
+      </w:pPr>
+      <w:bookmarkStart w:id="3" w:name="_Toc242612906"/>
+      <w:r>
+        <w:rPr>
+          <w:rFonts w:ascii="Times New Roman" w:hAnsi="Times New Roman"/>
+        </w:rPr>
+        <w:t>2.2 Теоретические сведения</w:t>
+      </w:r>
+      <w:bookmarkEnd w:id="3"/>
+    </w:p>
+    <w:p>
+      <w:pPr>
+        <w:ind w:firstLine="709"/>
+        <w:jc w:val="both"/>
+      </w:pPr>
+      <w:r>
+        <w:t xml:space="preserve">Работа посвящена поиску информационных документов по набору ключевых слов. Приложение вводит ключевые слова, находит документ, соответствующий (релевантный) введенному набору, и открывает его в браузере. Источником данных служат ресурсы, адресуемые </w:t>
+      </w:r>
+      <w:r>
+        <w:rPr>
+          <w:i/>
+        </w:rPr>
+        <w:t>URL</w:t>
+      </w:r>
+      <w:r>
         <w:t xml:space="preserve"> (</w:t>
       </w:r>
       <w:r>
@@ -1516,39 +1503,19 @@
       </w:r>
     </w:p>
     <w:p>
-      <w:r>
-        <w:br w:type="page"/>
-      </w:r>
-    </w:p>
-    <w:p>
-      <w:pPr>
-        <w:pStyle w:val="1"/>
+      <w:pPr>
+        <w:pStyle w:val="21"/>
+        <w:spacing w:before="360"/>
         <w:ind w:firstLine="709"/>
       </w:pPr>
-      <w:bookmarkStart w:id="2" w:name="_Toc242385924"/>
+      <w:bookmarkStart w:id="4" w:name="_Toc242612907"/>
       <w:r>
         <w:rPr>
           <w:rFonts w:ascii="Times New Roman" w:hAnsi="Times New Roman"/>
         </w:rPr>
-        <w:lastRenderedPageBreak/>
-        <w:t>3 ВЫПОЛНЕНИЕ РАБОТЫ</w:t>
-      </w:r>
-      <w:bookmarkEnd w:id="2"/>
-    </w:p>
-    <w:p>
-      <w:pPr>
-        <w:pStyle w:val="21"/>
-        <w:spacing w:before="360"/>
-        <w:ind w:firstLine="709"/>
-      </w:pPr>
-      <w:bookmarkStart w:id="3" w:name="_Toc242385925"/>
-      <w:r>
-        <w:rPr>
-          <w:rFonts w:ascii="Times New Roman" w:hAnsi="Times New Roman"/>
-        </w:rPr>
-        <w:t>3.1 Подготовка среды</w:t>
-      </w:r>
-      <w:bookmarkEnd w:id="3"/>
+        <w:t>2.3 Подготовка среды</w:t>
+      </w:r>
+      <w:bookmarkEnd w:id="4"/>
     </w:p>
     <w:p>
       <w:pPr>
@@ -1628,7 +1595,11 @@
         <w:t>Web_res_lab.java</w:t>
       </w:r>
       <w:r>
-        <w:t xml:space="preserve">. Запуск выполняется из каталога лабораторной работы командой </w:t>
+        <w:t xml:space="preserve">. </w:t>
+      </w:r>
+      <w:r>
+        <w:lastRenderedPageBreak/>
+        <w:t xml:space="preserve">Запуск выполняется из каталога лабораторной работы командой </w:t>
       </w:r>
       <w:r>
         <w:rPr>
@@ -1700,14 +1671,14 @@
         <w:spacing w:before="360"/>
         <w:ind w:firstLine="709"/>
       </w:pPr>
-      <w:bookmarkStart w:id="4" w:name="_Toc242385926"/>
+      <w:bookmarkStart w:id="5" w:name="_Toc242612908"/>
       <w:r>
         <w:rPr>
           <w:rFonts w:ascii="Times New Roman" w:hAnsi="Times New Roman"/>
         </w:rPr>
-        <w:t>3.2 Индивидуальное задание и исходные данные</w:t>
-      </w:r>
-      <w:bookmarkEnd w:id="4"/>
+        <w:t>2.4 Индивидуальное задание и исходные данные</w:t>
+      </w:r>
+      <w:bookmarkEnd w:id="5"/>
     </w:p>
     <w:p>
       <w:pPr>
@@ -1748,10 +1719,29 @@
     <w:p>
       <w:pPr>
         <w:keepNext/>
+        <w:ind w:firstLine="709"/>
+        <w:jc w:val="both"/>
+      </w:pPr>
+      <w:r>
+        <w:t xml:space="preserve">Данные по теме «набор данных </w:t>
+      </w:r>
+      <w:r>
+        <w:rPr>
+          <w:i/>
+        </w:rPr>
+        <w:t>medicines.txt</w:t>
+      </w:r>
+      <w:r>
+        <w:t>» приведены в таблице 2.1.</w:t>
+      </w:r>
+    </w:p>
+    <w:p>
+      <w:pPr>
+        <w:keepNext/>
         <w:spacing w:before="360"/>
       </w:pPr>
       <w:r>
-        <w:t xml:space="preserve">Таблица 3.1 – Набор данных </w:t>
+        <w:t xml:space="preserve">Таблица 2.1 – Набор данных </w:t>
       </w:r>
       <w:r>
         <w:rPr>
@@ -2069,14 +2059,14 @@
         <w:spacing w:before="360"/>
         <w:ind w:firstLine="709"/>
       </w:pPr>
-      <w:bookmarkStart w:id="5" w:name="_Toc242385927"/>
+      <w:bookmarkStart w:id="6" w:name="_Toc242612909"/>
       <w:r>
         <w:rPr>
           <w:rFonts w:ascii="Times New Roman" w:hAnsi="Times New Roman"/>
         </w:rPr>
-        <w:t>3.3 Программа</w:t>
-      </w:r>
-      <w:bookmarkEnd w:id="5"/>
+        <w:t>2.5 Программа</w:t>
+      </w:r>
+      <w:bookmarkEnd w:id="6"/>
     </w:p>
     <w:p>
       <w:pPr>
@@ -2120,11 +2110,7 @@
         <w:t>Search</w:t>
       </w:r>
       <w:r>
-        <w:t xml:space="preserve"> разбивает введенный текст по запятым на ключевые слова, читает список лекарств из файла, для каждой строки подсчитывает число совпадений ключевых слов с симптомами, выводит название и число совпадений в </w:t>
-      </w:r>
-      <w:r>
-        <w:lastRenderedPageBreak/>
-        <w:t xml:space="preserve">текстовую область и открывает в браузере </w:t>
+        <w:t xml:space="preserve"> разбивает введенный текст по запятым на ключевые слова, читает список лекарств из файла, для каждой строки подсчитывает число совпадений ключевых слов с симптомами, выводит название и число совпадений в текстовую область и открывает в браузере </w:t>
       </w:r>
       <w:r>
         <w:rPr>
@@ -2133,313 +2119,9 @@
         <w:t>html</w:t>
       </w:r>
       <w:r>
-        <w:t>-документ лекарства с наибольшим числом совпадений. Основные методы приведены в листингах.</w:t>
-      </w:r>
-    </w:p>
-    <w:p>
-      <w:pPr>
-        <w:keepNext/>
-        <w:ind w:firstLine="709"/>
-        <w:jc w:val="both"/>
-      </w:pPr>
-      <w:r>
-        <w:t xml:space="preserve">Листинг 3.1 – Обработчик кнопки </w:t>
-      </w:r>
-      <w:r>
-        <w:rPr>
-          <w:i/>
-        </w:rPr>
-        <w:t>Search</w:t>
-      </w:r>
-    </w:p>
-    <w:p>
-      <w:pPr>
-        <w:pStyle w:val="Listing"/>
-      </w:pPr>
-      <w:r>
-        <w:t>public void actionPerformed(ActionEvent ae) {</w:t>
-      </w:r>
-    </w:p>
-    <w:p>
-      <w:pPr>
-        <w:pStyle w:val="Listing"/>
-      </w:pPr>
-      <w:r>
-        <w:t xml:space="preserve">    if (ae.getSource() == exitButton) {</w:t>
-      </w:r>
-    </w:p>
-    <w:p>
-      <w:pPr>
-        <w:pStyle w:val="Listing"/>
-      </w:pPr>
-      <w:r>
-        <w:t xml:space="preserve">        System.exit(0);</w:t>
-      </w:r>
-    </w:p>
-    <w:p>
-      <w:pPr>
-        <w:pStyle w:val="Listing"/>
-      </w:pPr>
-      <w:r>
-        <w:t xml:space="preserve">    } else if (ae.getSource() == searchButton) {</w:t>
-      </w:r>
-    </w:p>
-    <w:p>
-      <w:pPr>
-        <w:pStyle w:val="Listing"/>
-      </w:pPr>
-      <w:r>
-        <w:t xml:space="preserve">        // Ключевые слова (симптомы) разделяются запятыми</w:t>
-      </w:r>
-    </w:p>
-    <w:p>
-      <w:pPr>
-        <w:pStyle w:val="Listing"/>
-      </w:pPr>
-      <w:r>
-        <w:t xml:space="preserve">        String[] keywords = textArea.getText().split(",");</w:t>
-      </w:r>
-    </w:p>
-    <w:p>
-      <w:pPr>
-        <w:pStyle w:val="Listing"/>
-      </w:pPr>
-      <w:r>
-        <w:t xml:space="preserve">        textArea.setText("");</w:t>
-      </w:r>
-    </w:p>
-    <w:p>
-      <w:pPr>
-        <w:pStyle w:val="Listing"/>
-      </w:pPr>
-    </w:p>
-    <w:p>
-      <w:pPr>
-        <w:pStyle w:val="Listing"/>
-      </w:pPr>
-      <w:r>
-        <w:t xml:space="preserve">        // Список лекарств читается из текстового файла</w:t>
-      </w:r>
-    </w:p>
-    <w:p>
-      <w:pPr>
-        <w:pStyle w:val="Listing"/>
-      </w:pPr>
-      <w:r>
-        <w:t xml:space="preserve">        File medicinesFile = new File("medicines.txt");</w:t>
-      </w:r>
-    </w:p>
-    <w:p>
-      <w:pPr>
-        <w:pStyle w:val="Listing"/>
-      </w:pPr>
-      <w:r>
-        <w:t xml:space="preserve">        ArrayList&lt;String&gt; medicines = readLines(medicinesFile);</w:t>
-      </w:r>
-    </w:p>
-    <w:p>
-      <w:pPr>
-        <w:pStyle w:val="Listing"/>
-      </w:pPr>
-    </w:p>
-    <w:p>
-      <w:pPr>
-        <w:pStyle w:val="Listing"/>
-      </w:pPr>
-      <w:r>
-        <w:t xml:space="preserve">        String bestName = null;</w:t>
-      </w:r>
-    </w:p>
-    <w:p>
-      <w:pPr>
-        <w:pStyle w:val="Listing"/>
-      </w:pPr>
-      <w:r>
-        <w:t xml:space="preserve">        int bestCount = 0;</w:t>
-      </w:r>
-    </w:p>
-    <w:p>
-      <w:pPr>
-        <w:pStyle w:val="Listing"/>
-      </w:pPr>
-      <w:r>
-        <w:t xml:space="preserve">        for (String line : medicines) {</w:t>
-      </w:r>
-    </w:p>
-    <w:p>
-      <w:pPr>
-        <w:pStyle w:val="Listing"/>
-      </w:pPr>
-      <w:r>
-        <w:t xml:space="preserve">            // Формат строки: Название | симптом1, симптом2, ...</w:t>
-      </w:r>
-    </w:p>
-    <w:p>
-      <w:pPr>
-        <w:pStyle w:val="Listing"/>
-      </w:pPr>
-      <w:r>
-        <w:t xml:space="preserve">            String[] parts = line.split("\\|");</w:t>
-      </w:r>
-    </w:p>
-    <w:p>
-      <w:pPr>
-        <w:pStyle w:val="Listing"/>
-      </w:pPr>
-      <w:r>
-        <w:t xml:space="preserve">            if (parts.length &lt; 2) {</w:t>
-      </w:r>
-    </w:p>
-    <w:p>
-      <w:pPr>
-        <w:pStyle w:val="Listing"/>
-      </w:pPr>
-      <w:r>
-        <w:t xml:space="preserve">                continue;</w:t>
-      </w:r>
-    </w:p>
-    <w:p>
-      <w:pPr>
-        <w:pStyle w:val="Listing"/>
-      </w:pPr>
-      <w:r>
-        <w:t xml:space="preserve">            }</w:t>
-      </w:r>
-    </w:p>
-    <w:p>
-      <w:pPr>
-        <w:pStyle w:val="Listing"/>
-      </w:pPr>
-      <w:r>
-        <w:t xml:space="preserve">            String name = parts[0].trim();</w:t>
-      </w:r>
-    </w:p>
-    <w:p>
-      <w:pPr>
-        <w:pStyle w:val="Listing"/>
-      </w:pPr>
-      <w:r>
-        <w:t xml:space="preserve">            int coincidenceCount = testSymptoms(parts[1], keywords);</w:t>
-      </w:r>
-    </w:p>
-    <w:p>
-      <w:pPr>
-        <w:pStyle w:val="Listing"/>
-      </w:pPr>
-      <w:r>
-        <w:t xml:space="preserve">            textArea.append("\n" + name + "  :" + coincidenceCount);</w:t>
-      </w:r>
-    </w:p>
-    <w:p>
-      <w:pPr>
-        <w:pStyle w:val="Listing"/>
-      </w:pPr>
-      <w:r>
-        <w:t xml:space="preserve">            if (coincidenceCount &gt; bestCount) {</w:t>
-      </w:r>
-    </w:p>
-    <w:p>
-      <w:pPr>
-        <w:pStyle w:val="Listing"/>
-      </w:pPr>
-      <w:r>
-        <w:t xml:space="preserve">                bestCount = coincidenceCount;</w:t>
-      </w:r>
-    </w:p>
-    <w:p>
-      <w:pPr>
-        <w:pStyle w:val="Listing"/>
-      </w:pPr>
-      <w:r>
-        <w:t xml:space="preserve">                bestName = name;</w:t>
-      </w:r>
-    </w:p>
-    <w:p>
-      <w:pPr>
-        <w:pStyle w:val="Listing"/>
-      </w:pPr>
-      <w:r>
-        <w:t xml:space="preserve">            }</w:t>
-      </w:r>
-    </w:p>
-    <w:p>
-      <w:pPr>
-        <w:pStyle w:val="Listing"/>
-      </w:pPr>
-      <w:r>
-        <w:t xml:space="preserve">        }</w:t>
-      </w:r>
-    </w:p>
-    <w:p>
-      <w:pPr>
-        <w:pStyle w:val="Listing"/>
-      </w:pPr>
-    </w:p>
-    <w:p>
-      <w:pPr>
-        <w:pStyle w:val="Listing"/>
-      </w:pPr>
-      <w:r>
-        <w:t xml:space="preserve">        if (bestName == null) {</w:t>
-      </w:r>
-    </w:p>
-    <w:p>
-      <w:pPr>
-        <w:pStyle w:val="Listing"/>
-      </w:pPr>
-      <w:r>
-        <w:t xml:space="preserve">            textArea.append("\nЛекарство не найдено");</w:t>
-      </w:r>
-    </w:p>
-    <w:p>
-      <w:pPr>
-        <w:pStyle w:val="Listing"/>
-      </w:pPr>
-      <w:r>
-        <w:t xml:space="preserve">        } else {</w:t>
-      </w:r>
-    </w:p>
-    <w:p>
-      <w:pPr>
-        <w:pStyle w:val="Listing"/>
-      </w:pPr>
-      <w:r>
-        <w:t xml:space="preserve">            textArea.append("\n\nЛекарство: " + bestName);</w:t>
-      </w:r>
-    </w:p>
-    <w:p>
-      <w:pPr>
-        <w:pStyle w:val="Listing"/>
-      </w:pPr>
-      <w:r>
-        <w:t xml:space="preserve">            openInBrowser(new File("source_html", bestName + ".html"));</w:t>
-      </w:r>
-    </w:p>
-    <w:p>
-      <w:pPr>
-        <w:pStyle w:val="Listing"/>
-      </w:pPr>
-      <w:r>
-        <w:t xml:space="preserve">        }</w:t>
-      </w:r>
-    </w:p>
-    <w:p>
-      <w:pPr>
-        <w:pStyle w:val="Listing"/>
-      </w:pPr>
-      <w:r>
-        <w:t xml:space="preserve">    }</w:t>
-      </w:r>
-    </w:p>
-    <w:p>
-      <w:pPr>
-        <w:pStyle w:val="Listing"/>
-      </w:pPr>
-      <w:r>
-        <w:t>}</w:t>
-      </w:r>
-    </w:p>
-    <w:p/>
+        <w:t>-документ лекарства с наибольшим числом совпадений. Основные методы приведены в приложении А.</w:t>
+      </w:r>
+    </w:p>
     <w:p>
       <w:pPr>
         <w:ind w:firstLine="709"/>
@@ -2460,352 +2142,19 @@
     </w:p>
     <w:p>
       <w:pPr>
-        <w:keepNext/>
-        <w:ind w:firstLine="709"/>
-        <w:jc w:val="both"/>
-      </w:pPr>
-      <w:r>
-        <w:t>Листинг 3.2 – Чтение файла, подсчет совпадений и открытие браузера</w:t>
-      </w:r>
-    </w:p>
-    <w:p>
-      <w:pPr>
-        <w:pStyle w:val="Listing"/>
-      </w:pPr>
-      <w:r>
-        <w:t>// Чтение строк файла через URL и потоковые классы</w:t>
-      </w:r>
-    </w:p>
-    <w:p>
-      <w:pPr>
-        <w:pStyle w:val="Listing"/>
-      </w:pPr>
-      <w:r>
-        <w:t>private ArrayList&lt;String&gt; readLines(File file) {</w:t>
-      </w:r>
-    </w:p>
-    <w:p>
-      <w:pPr>
-        <w:pStyle w:val="Listing"/>
-      </w:pPr>
-      <w:r>
-        <w:t xml:space="preserve">    ArrayList&lt;String&gt; lines = new ArrayList&lt;&gt;();</w:t>
-      </w:r>
-    </w:p>
-    <w:p>
-      <w:pPr>
-        <w:pStyle w:val="Listing"/>
-      </w:pPr>
-      <w:r>
-        <w:t xml:space="preserve">    try {</w:t>
-      </w:r>
-    </w:p>
-    <w:p>
-      <w:pPr>
-        <w:pStyle w:val="Listing"/>
-      </w:pPr>
-      <w:r>
-        <w:t xml:space="preserve">        URL url = file.toURI().toURL();</w:t>
-      </w:r>
-    </w:p>
-    <w:p>
-      <w:pPr>
-        <w:pStyle w:val="Listing"/>
-      </w:pPr>
-      <w:r>
-        <w:t xml:space="preserve">        URLConnection connection = url.openConnection();</w:t>
-      </w:r>
-    </w:p>
-    <w:p>
-      <w:pPr>
-        <w:pStyle w:val="Listing"/>
-      </w:pPr>
-      <w:r>
-        <w:lastRenderedPageBreak/>
-        <w:t xml:space="preserve">        try (BufferedReader reader = new BufferedReader(</w:t>
-      </w:r>
-    </w:p>
-    <w:p>
-      <w:pPr>
-        <w:pStyle w:val="Listing"/>
-      </w:pPr>
-      <w:r>
-        <w:t xml:space="preserve">                new InputStreamReader(connection.getInputStream(), "UTF-8"))) {</w:t>
-      </w:r>
-    </w:p>
-    <w:p>
-      <w:pPr>
-        <w:pStyle w:val="Listing"/>
-      </w:pPr>
-      <w:r>
-        <w:t xml:space="preserve">            String line;</w:t>
-      </w:r>
-    </w:p>
-    <w:p>
-      <w:pPr>
-        <w:pStyle w:val="Listing"/>
-      </w:pPr>
-      <w:r>
-        <w:t xml:space="preserve">            while ((line = reader.readLine()) != null) {</w:t>
-      </w:r>
-    </w:p>
-    <w:p>
-      <w:pPr>
-        <w:pStyle w:val="Listing"/>
-      </w:pPr>
-      <w:r>
-        <w:t xml:space="preserve">                if (!line.trim().isEmpty() &amp;&amp; !line.startsWith("#")) {</w:t>
-      </w:r>
-    </w:p>
-    <w:p>
-      <w:pPr>
-        <w:pStyle w:val="Listing"/>
-      </w:pPr>
-      <w:r>
-        <w:t xml:space="preserve">                    lines.add(line);</w:t>
-      </w:r>
-    </w:p>
-    <w:p>
-      <w:pPr>
-        <w:pStyle w:val="Listing"/>
-      </w:pPr>
-      <w:r>
-        <w:t xml:space="preserve">                }</w:t>
-      </w:r>
-    </w:p>
-    <w:p>
-      <w:pPr>
-        <w:pStyle w:val="Listing"/>
-      </w:pPr>
-      <w:r>
-        <w:t xml:space="preserve">            }</w:t>
-      </w:r>
-    </w:p>
-    <w:p>
-      <w:pPr>
-        <w:pStyle w:val="Listing"/>
-      </w:pPr>
-      <w:r>
-        <w:t xml:space="preserve">        }</w:t>
-      </w:r>
-    </w:p>
-    <w:p>
-      <w:pPr>
-        <w:pStyle w:val="Listing"/>
-      </w:pPr>
-      <w:r>
-        <w:t xml:space="preserve">    } catch (IOException e) {</w:t>
-      </w:r>
-    </w:p>
-    <w:p>
-      <w:pPr>
-        <w:pStyle w:val="Listing"/>
-      </w:pPr>
-      <w:r>
-        <w:t xml:space="preserve">        System.out.println("Error: " + e.getMessage());</w:t>
-      </w:r>
-    </w:p>
-    <w:p>
-      <w:pPr>
-        <w:pStyle w:val="Listing"/>
-      </w:pPr>
-      <w:r>
-        <w:t xml:space="preserve">    }</w:t>
-      </w:r>
-    </w:p>
-    <w:p>
-      <w:pPr>
-        <w:pStyle w:val="Listing"/>
-      </w:pPr>
-      <w:r>
-        <w:t xml:space="preserve">    return lines;</w:t>
-      </w:r>
-    </w:p>
-    <w:p>
-      <w:pPr>
-        <w:pStyle w:val="Listing"/>
-      </w:pPr>
-      <w:r>
-        <w:t>}</w:t>
-      </w:r>
-    </w:p>
-    <w:p>
-      <w:pPr>
-        <w:pStyle w:val="Listing"/>
-      </w:pPr>
-    </w:p>
-    <w:p>
-      <w:pPr>
-        <w:pStyle w:val="Listing"/>
-      </w:pPr>
-      <w:r>
-        <w:t>// Число ключевых слов, найденных среди симптомов лекарства</w:t>
-      </w:r>
-    </w:p>
-    <w:p>
-      <w:pPr>
-        <w:pStyle w:val="Listing"/>
-      </w:pPr>
-      <w:r>
-        <w:t>private int testSymptoms(String symptoms, String[] keywords) {</w:t>
-      </w:r>
-    </w:p>
-    <w:p>
-      <w:pPr>
-        <w:pStyle w:val="Listing"/>
-      </w:pPr>
-      <w:r>
-        <w:t xml:space="preserve">    int results = 0;</w:t>
-      </w:r>
-    </w:p>
-    <w:p>
-      <w:pPr>
-        <w:pStyle w:val="Listing"/>
-      </w:pPr>
-      <w:r>
-        <w:t xml:space="preserve">    String content = symptoms.toLowerCase();</w:t>
-      </w:r>
-    </w:p>
-    <w:p>
-      <w:pPr>
-        <w:pStyle w:val="Listing"/>
-      </w:pPr>
-      <w:r>
-        <w:t xml:space="preserve">    for (String keyword : keywords) {</w:t>
-      </w:r>
-    </w:p>
-    <w:p>
-      <w:pPr>
-        <w:pStyle w:val="Listing"/>
-      </w:pPr>
-      <w:r>
-        <w:t xml:space="preserve">        if (!keyword.trim().isEmpty() &amp;&amp; content.contains(keyword.trim().toLowerCase())) {</w:t>
-      </w:r>
-    </w:p>
-    <w:p>
-      <w:pPr>
-        <w:pStyle w:val="Listing"/>
-      </w:pPr>
-      <w:r>
-        <w:t xml:space="preserve">            results++;</w:t>
-      </w:r>
-    </w:p>
-    <w:p>
-      <w:pPr>
-        <w:pStyle w:val="Listing"/>
-      </w:pPr>
-      <w:r>
-        <w:t xml:space="preserve">        }</w:t>
-      </w:r>
-    </w:p>
-    <w:p>
-      <w:pPr>
-        <w:pStyle w:val="Listing"/>
-      </w:pPr>
-      <w:r>
-        <w:t xml:space="preserve">    }</w:t>
-      </w:r>
-    </w:p>
-    <w:p>
-      <w:pPr>
-        <w:pStyle w:val="Listing"/>
-      </w:pPr>
-      <w:r>
-        <w:t xml:space="preserve">    return results;</w:t>
-      </w:r>
-    </w:p>
-    <w:p>
-      <w:pPr>
-        <w:pStyle w:val="Listing"/>
-      </w:pPr>
-      <w:r>
-        <w:t>}</w:t>
-      </w:r>
-    </w:p>
-    <w:p>
-      <w:pPr>
-        <w:pStyle w:val="Listing"/>
-      </w:pPr>
-    </w:p>
-    <w:p>
-      <w:pPr>
-        <w:pStyle w:val="Listing"/>
-      </w:pPr>
-      <w:r>
-        <w:t>// Открытие html-документа в браузере</w:t>
-      </w:r>
-    </w:p>
-    <w:p>
-      <w:pPr>
-        <w:pStyle w:val="Listing"/>
-      </w:pPr>
-      <w:r>
-        <w:t>private void openInBrowser(File file) {</w:t>
-      </w:r>
-    </w:p>
-    <w:p>
-      <w:pPr>
-        <w:pStyle w:val="Listing"/>
-      </w:pPr>
-      <w:r>
-        <w:t xml:space="preserve">    try {</w:t>
-      </w:r>
-    </w:p>
-    <w:p>
-      <w:pPr>
-        <w:pStyle w:val="Listing"/>
-      </w:pPr>
-      <w:r>
-        <w:t xml:space="preserve">        Desktop.getDesktop().browse(file.getAbsoluteFile().toURI());</w:t>
-      </w:r>
-    </w:p>
-    <w:p>
-      <w:pPr>
-        <w:pStyle w:val="Listing"/>
-      </w:pPr>
-      <w:r>
-        <w:t xml:space="preserve">    } catch (IOException e) {</w:t>
-      </w:r>
-    </w:p>
-    <w:p>
-      <w:pPr>
-        <w:pStyle w:val="Listing"/>
-      </w:pPr>
-      <w:r>
-        <w:t xml:space="preserve">        System.out.println("Error: " + e.getMessage());</w:t>
-      </w:r>
-    </w:p>
-    <w:p>
-      <w:pPr>
-        <w:pStyle w:val="Listing"/>
-      </w:pPr>
-      <w:r>
-        <w:t xml:space="preserve">    }</w:t>
-      </w:r>
-    </w:p>
-    <w:p>
-      <w:pPr>
-        <w:pStyle w:val="Listing"/>
-      </w:pPr>
-      <w:r>
-        <w:t>}</w:t>
-      </w:r>
-    </w:p>
-    <w:p/>
-    <w:p>
-      <w:pPr>
         <w:pStyle w:val="21"/>
         <w:spacing w:before="360"/>
         <w:ind w:firstLine="709"/>
       </w:pPr>
-      <w:bookmarkStart w:id="6" w:name="_Toc242385928"/>
+      <w:bookmarkStart w:id="7" w:name="_Toc242612910"/>
       <w:r>
         <w:rPr>
           <w:rFonts w:ascii="Times New Roman" w:hAnsi="Times New Roman"/>
         </w:rPr>
-        <w:t>3.4 Результаты работы</w:t>
-      </w:r>
-      <w:bookmarkEnd w:id="6"/>
+        <w:lastRenderedPageBreak/>
+        <w:t>2.6 Результаты работы</w:t>
+      </w:r>
+      <w:bookmarkEnd w:id="7"/>
     </w:p>
     <w:p>
       <w:pPr>
@@ -2813,7 +2162,7 @@
         <w:jc w:val="both"/>
       </w:pPr>
       <w:r>
-        <w:t>Окно приложения после запуска показано на рисунке 3.1.</w:t>
+        <w:t>Окно приложения после запуска показано на рисунке 2.1.</w:t>
       </w:r>
     </w:p>
     <w:p>
@@ -2826,9 +2175,8 @@
         <w:rPr>
           <w:noProof/>
         </w:rPr>
-        <w:lastRenderedPageBreak/>
         <w:drawing>
-          <wp:inline distT="0" distB="0" distL="0" distR="0" wp14:anchorId="3F495301" wp14:editId="7B021D3C">
+          <wp:inline distT="0" distB="0" distL="0" distR="0" wp14:anchorId="1C247F2C" wp14:editId="3F2F720F">
             <wp:extent cx="5580000" cy="3055113"/>
             <wp:effectExtent l="0" t="0" r="0" b="0"/>
             <wp:docPr id="1" name="Picture 1"/>
@@ -2870,7 +2218,7 @@
         <w:jc w:val="center"/>
       </w:pPr>
       <w:r>
-        <w:t>Рисунок 3.1 – Окно приложения после запуска</w:t>
+        <w:t>Рисунок 2.1 – Окно приложения после запуска</w:t>
       </w:r>
     </w:p>
     <w:p/>
@@ -2907,7 +2255,7 @@
         <w:jc w:val="both"/>
       </w:pPr>
       <w:r>
-        <w:t>В текстовую область введены симптомы «головная боль, высокая температура», как показано на рисунке 3.2.</w:t>
+        <w:t>В текстовую область введены симптомы «головная боль, высокая температура», как показано на рисунке 2.2.</w:t>
       </w:r>
     </w:p>
     <w:p>
@@ -2921,7 +2269,7 @@
           <w:noProof/>
         </w:rPr>
         <w:drawing>
-          <wp:inline distT="0" distB="0" distL="0" distR="0" wp14:anchorId="1B2878C4" wp14:editId="7AADB551">
+          <wp:inline distT="0" distB="0" distL="0" distR="0" wp14:anchorId="1A377056" wp14:editId="5BDD4046">
             <wp:extent cx="5580000" cy="3055113"/>
             <wp:effectExtent l="0" t="0" r="0" b="0"/>
             <wp:docPr id="2" name="Picture 2"/>
@@ -2963,7 +2311,7 @@
         <w:jc w:val="center"/>
       </w:pPr>
       <w:r>
-        <w:t>Рисунок 3.2 – Ввод ключевых слов</w:t>
+        <w:t>Рисунок 2.2 – Ввод ключевых слов</w:t>
       </w:r>
     </w:p>
     <w:p/>
@@ -2982,8 +2330,7 @@
         <w:jc w:val="both"/>
       </w:pPr>
       <w:r>
-        <w:lastRenderedPageBreak/>
-        <w:t>Результат поиска показан на рисунках 3.3 и 3.4.</w:t>
+        <w:t>Результат поиска показан на рисунках 2.3 и 2.4.</w:t>
       </w:r>
     </w:p>
     <w:p>
@@ -2997,7 +2344,7 @@
           <w:noProof/>
         </w:rPr>
         <w:drawing>
-          <wp:inline distT="0" distB="0" distL="0" distR="0" wp14:anchorId="7511D484" wp14:editId="4812C1F7">
+          <wp:inline distT="0" distB="0" distL="0" distR="0" wp14:anchorId="51F79DA3" wp14:editId="236758BF">
             <wp:extent cx="5580000" cy="3055113"/>
             <wp:effectExtent l="0" t="0" r="0" b="0"/>
             <wp:docPr id="3" name="Picture 3"/>
@@ -3039,7 +2386,7 @@
         <w:jc w:val="center"/>
       </w:pPr>
       <w:r>
-        <w:t>Рисунок 3.3 – Результат поиска (начало списка)</w:t>
+        <w:t>Рисунок 2.3 – Результат поиска (начало списка)</w:t>
       </w:r>
     </w:p>
     <w:p/>
@@ -3058,7 +2405,7 @@
         <w:jc w:val="both"/>
       </w:pPr>
       <w:r>
-        <w:t>Конец списка с найденным лекарством показан на рисунке 3.4.</w:t>
+        <w:t>Конец списка с найденным лекарством показан на рисунке 2.4.</w:t>
       </w:r>
     </w:p>
     <w:p>
@@ -3072,7 +2419,7 @@
           <w:noProof/>
         </w:rPr>
         <w:drawing>
-          <wp:inline distT="0" distB="0" distL="0" distR="0" wp14:anchorId="12A7FDDF" wp14:editId="51C2FF05">
+          <wp:inline distT="0" distB="0" distL="0" distR="0" wp14:anchorId="4EC46BC1" wp14:editId="6066B92E">
             <wp:extent cx="5580000" cy="3055113"/>
             <wp:effectExtent l="0" t="0" r="0" b="0"/>
             <wp:docPr id="4" name="Picture 4"/>
@@ -3114,7 +2461,7 @@
         <w:jc w:val="center"/>
       </w:pPr>
       <w:r>
-        <w:t>Рисунок 3.4 – Результат поиска (конец списка)</w:t>
+        <w:t>Рисунок 2.4 – Результат поиска (конец списка)</w:t>
       </w:r>
     </w:p>
     <w:p/>
@@ -3124,7 +2471,6 @@
         <w:jc w:val="both"/>
       </w:pPr>
       <w:r>
-        <w:lastRenderedPageBreak/>
         <w:t>Список завершается строкой «Лекарство: Парацетамол», то есть выбран документ с наибольшим числом совпадений.</w:t>
       </w:r>
     </w:p>
@@ -3143,7 +2489,7 @@
         <w:t>html</w:t>
       </w:r>
       <w:r>
-        <w:t>-документ открывается в браузере, как показано на рисунке 3.5. Снимок страницы получен отдельно, чтобы показать содержимое документа.</w:t>
+        <w:t>-документ открывается в браузере, как показано на рисунке 2.5. Снимок страницы получен отдельно, чтобы показать содержимое документа.</w:t>
       </w:r>
     </w:p>
     <w:p>
@@ -3157,7 +2503,7 @@
           <w:noProof/>
         </w:rPr>
         <w:drawing>
-          <wp:inline distT="0" distB="0" distL="0" distR="0" wp14:anchorId="40BE46B2" wp14:editId="5EAAF95F">
+          <wp:inline distT="0" distB="0" distL="0" distR="0" wp14:anchorId="5FDB1365" wp14:editId="7283E2EE">
             <wp:extent cx="5580000" cy="1860000"/>
             <wp:effectExtent l="0" t="0" r="0" b="0"/>
             <wp:docPr id="5" name="Picture 5"/>
@@ -3199,7 +2545,7 @@
         <w:jc w:val="center"/>
       </w:pPr>
       <w:r>
-        <w:t>Рисунок 3.5 – Документ лекарства в браузере</w:t>
+        <w:t>Рисунок 2.5 – Документ лекарства в браузере</w:t>
       </w:r>
     </w:p>
     <w:p/>
@@ -3222,35 +2568,13 @@
         <w:pStyle w:val="1"/>
         <w:ind w:firstLine="709"/>
       </w:pPr>
-      <w:bookmarkStart w:id="7" w:name="_Toc242385929"/>
+      <w:bookmarkStart w:id="8" w:name="_Toc242612911"/>
       <w:r>
         <w:rPr>
           <w:rFonts w:ascii="Times New Roman" w:hAnsi="Times New Roman"/>
         </w:rPr>
         <w:lastRenderedPageBreak/>
-        <w:t>4 КОНТРОЛЬНЫЕ ВОПРОСЫ</w:t>
-      </w:r>
-      <w:bookmarkEnd w:id="7"/>
-    </w:p>
-    <w:p>
-      <w:pPr>
-        <w:pStyle w:val="21"/>
-        <w:spacing w:before="360"/>
-        <w:ind w:firstLine="709"/>
-      </w:pPr>
-      <w:bookmarkStart w:id="8" w:name="_Toc242385930"/>
-      <w:r>
-        <w:rPr>
-          <w:rFonts w:ascii="Times New Roman" w:hAnsi="Times New Roman"/>
-        </w:rPr>
-        <w:t xml:space="preserve">4.1 Что такое </w:t>
-      </w:r>
-      <w:r>
-        <w:rPr>
-          <w:rFonts w:ascii="Times New Roman" w:hAnsi="Times New Roman"/>
-          <w:i/>
-        </w:rPr>
-        <w:t>URL</w:t>
+        <w:t>3 Ответы на контрольные вопросы</w:t>
       </w:r>
       <w:bookmarkEnd w:id="8"/>
     </w:p>
@@ -3259,6 +2583,9 @@
         <w:ind w:firstLine="709"/>
         <w:jc w:val="both"/>
       </w:pPr>
+      <w:r>
+        <w:t xml:space="preserve">1. Что такое </w:t>
+      </w:r>
       <w:r>
         <w:rPr>
           <w:i/>
@@ -3266,6 +2593,21 @@
         <w:t>URL</w:t>
       </w:r>
       <w:r>
+        <w:t>?</w:t>
+      </w:r>
+    </w:p>
+    <w:p>
+      <w:pPr>
+        <w:ind w:firstLine="709"/>
+        <w:jc w:val="both"/>
+      </w:pPr>
+      <w:r>
+        <w:rPr>
+          <w:i/>
+        </w:rPr>
+        <w:t>URL</w:t>
+      </w:r>
+      <w:r>
         <w:t xml:space="preserve"> (</w:t>
       </w:r>
       <w:r>
@@ -3355,18 +2697,12 @@
     </w:p>
     <w:p>
       <w:pPr>
-        <w:pStyle w:val="21"/>
-        <w:spacing w:before="360"/>
         <w:ind w:firstLine="709"/>
-      </w:pPr>
-      <w:bookmarkStart w:id="9" w:name="_Toc242385931"/>
-      <w:r>
-        <w:rPr>
-          <w:rFonts w:ascii="Times New Roman" w:hAnsi="Times New Roman"/>
-        </w:rPr>
-        <w:t>4.2 Как программно получить список всех файлов в папке</w:t>
-      </w:r>
-      <w:bookmarkEnd w:id="9"/>
+        <w:jc w:val="both"/>
+      </w:pPr>
+      <w:r>
+        <w:t>2. Как программно получить список всех файлов в папке?</w:t>
+      </w:r>
     </w:p>
     <w:p>
       <w:pPr>
@@ -3451,31 +2787,21 @@
     </w:p>
     <w:p>
       <w:pPr>
-        <w:pStyle w:val="21"/>
-        <w:spacing w:before="360"/>
         <w:ind w:firstLine="709"/>
-      </w:pPr>
-      <w:bookmarkStart w:id="10" w:name="_Toc242385932"/>
+        <w:jc w:val="both"/>
+      </w:pPr>
+      <w:r>
+        <w:t xml:space="preserve">3. Как программно запустить браузер и открыть </w:t>
+      </w:r>
       <w:r>
         <w:rPr>
-          <w:rFonts w:ascii="Times New Roman" w:hAnsi="Times New Roman"/>
-        </w:rPr>
-        <w:t xml:space="preserve">4.3 Как программно запустить браузер и открыть </w:t>
-      </w:r>
-      <w:r>
-        <w:rPr>
-          <w:rFonts w:ascii="Times New Roman" w:hAnsi="Times New Roman"/>
           <w:i/>
         </w:rPr>
         <w:t>html</w:t>
       </w:r>
       <w:r>
-        <w:rPr>
-          <w:rFonts w:ascii="Times New Roman" w:hAnsi="Times New Roman"/>
-        </w:rPr>
-        <w:t>-файл</w:t>
-      </w:r>
-      <w:bookmarkEnd w:id="10"/>
+        <w:t>-файл?</w:t>
+      </w:r>
     </w:p>
     <w:p>
       <w:pPr>
@@ -3557,18 +2883,12 @@
     </w:p>
     <w:p>
       <w:pPr>
-        <w:pStyle w:val="21"/>
-        <w:spacing w:before="360"/>
         <w:ind w:firstLine="709"/>
-      </w:pPr>
-      <w:bookmarkStart w:id="11" w:name="_Toc242385933"/>
-      <w:r>
-        <w:rPr>
-          <w:rFonts w:ascii="Times New Roman" w:hAnsi="Times New Roman"/>
-        </w:rPr>
-        <w:t>4.4 Использование потоковых классов в приложении</w:t>
-      </w:r>
-      <w:bookmarkEnd w:id="11"/>
+        <w:jc w:val="both"/>
+      </w:pPr>
+      <w:r>
+        <w:t>4. Как используются потоковые классы в приложении?</w:t>
+      </w:r>
     </w:p>
     <w:p>
       <w:pPr>
@@ -3649,15 +2969,15 @@
         <w:pStyle w:val="1"/>
         <w:jc w:val="center"/>
       </w:pPr>
-      <w:bookmarkStart w:id="12" w:name="_Toc242385934"/>
+      <w:bookmarkStart w:id="9" w:name="_Toc242612912"/>
       <w:r>
         <w:rPr>
           <w:rFonts w:ascii="Times New Roman" w:hAnsi="Times New Roman"/>
         </w:rPr>
         <w:lastRenderedPageBreak/>
-        <w:t>ЗАКЛЮЧЕНИЕ</w:t>
-      </w:r>
-      <w:bookmarkEnd w:id="12"/>
+        <w:t>Выводы</w:t>
+      </w:r>
+      <w:bookmarkEnd w:id="9"/>
     </w:p>
     <w:p>
       <w:pPr>
@@ -3683,9 +3003,680 @@
         <w:t>URLConnection</w:t>
       </w:r>
       <w:r>
-        <w:t>, построчное чтение файла, подсчет совпадений ключевых слов и открытие найденного документа в браузере. Заготовка из методических указаний доработана под вариант 2: поиск названия лекарства по набору симптомов из текстового файла. Приложение корректно определило лекарство с наибольшим числом совпадений. Цель работы достигнута.</w:t>
-      </w:r>
-    </w:p>
+        <w:t>, построчное чтение файла, подсчет совпадений ключевых слов и открытие найденного документа в браузере. Заготовка из методических указаний доработана под вариант 2: поиск названия лекарства по набору симптомов из текстового файла. Приложение корректно определило лекарство с наибольшим числом совпадений. Поставленная цель достигнута.</w:t>
+      </w:r>
+    </w:p>
+    <w:p>
+      <w:r>
+        <w:br w:type="page"/>
+      </w:r>
+    </w:p>
+    <w:p>
+      <w:pPr>
+        <w:pStyle w:val="1"/>
+        <w:jc w:val="center"/>
+      </w:pPr>
+      <w:bookmarkStart w:id="10" w:name="_Toc242612913"/>
+      <w:r>
+        <w:lastRenderedPageBreak/>
+        <w:t>Приложение А</w:t>
+      </w:r>
+      <w:r>
+        <w:br/>
+      </w:r>
+      <w:r>
+        <w:rPr>
+          <w:caps w:val="0"/>
+        </w:rPr>
+        <w:t>(обязательное)</w:t>
+      </w:r>
+      <w:r>
+        <w:rPr>
+          <w:caps w:val="0"/>
+        </w:rPr>
+        <w:br/>
+        <w:t>Листинги программного кода</w:t>
+      </w:r>
+      <w:bookmarkEnd w:id="10"/>
+    </w:p>
+    <w:p>
+      <w:pPr>
+        <w:keepNext/>
+        <w:ind w:firstLine="709"/>
+        <w:jc w:val="both"/>
+      </w:pPr>
+      <w:r>
+        <w:t xml:space="preserve">Листинг А.1 – Обработчик кнопки </w:t>
+      </w:r>
+      <w:r>
+        <w:rPr>
+          <w:i/>
+        </w:rPr>
+        <w:t>Search</w:t>
+      </w:r>
+    </w:p>
+    <w:p>
+      <w:pPr>
+        <w:pStyle w:val="Listing"/>
+      </w:pPr>
+      <w:r>
+        <w:t>public void actionPerformed(ActionEvent ae) {</w:t>
+      </w:r>
+    </w:p>
+    <w:p>
+      <w:pPr>
+        <w:pStyle w:val="Listing"/>
+      </w:pPr>
+      <w:r>
+        <w:t xml:space="preserve">    if (ae.getSource() == exitButton) {</w:t>
+      </w:r>
+    </w:p>
+    <w:p>
+      <w:pPr>
+        <w:pStyle w:val="Listing"/>
+      </w:pPr>
+      <w:r>
+        <w:t xml:space="preserve">        System.exit(0);</w:t>
+      </w:r>
+    </w:p>
+    <w:p>
+      <w:pPr>
+        <w:pStyle w:val="Listing"/>
+      </w:pPr>
+      <w:r>
+        <w:t xml:space="preserve">    } else if (ae.getSource() == searchButton) {</w:t>
+      </w:r>
+    </w:p>
+    <w:p>
+      <w:pPr>
+        <w:pStyle w:val="Listing"/>
+      </w:pPr>
+      <w:r>
+        <w:t xml:space="preserve">        // Ключевые слова (симптомы) разделяются запятыми</w:t>
+      </w:r>
+    </w:p>
+    <w:p>
+      <w:pPr>
+        <w:pStyle w:val="Listing"/>
+      </w:pPr>
+      <w:r>
+        <w:t xml:space="preserve">        String[] keywords = textArea.getText().split(",");</w:t>
+      </w:r>
+    </w:p>
+    <w:p>
+      <w:pPr>
+        <w:pStyle w:val="Listing"/>
+      </w:pPr>
+      <w:r>
+        <w:t xml:space="preserve">        textArea.setText("");</w:t>
+      </w:r>
+    </w:p>
+    <w:p>
+      <w:pPr>
+        <w:pStyle w:val="Listing"/>
+      </w:pPr>
+    </w:p>
+    <w:p>
+      <w:pPr>
+        <w:pStyle w:val="Listing"/>
+      </w:pPr>
+      <w:r>
+        <w:t xml:space="preserve">        // Список лекарств читается из текстового файла</w:t>
+      </w:r>
+    </w:p>
+    <w:p>
+      <w:pPr>
+        <w:pStyle w:val="Listing"/>
+      </w:pPr>
+      <w:r>
+        <w:t xml:space="preserve">        File medicinesFile = new File("medicines.txt");</w:t>
+      </w:r>
+    </w:p>
+    <w:p>
+      <w:pPr>
+        <w:pStyle w:val="Listing"/>
+      </w:pPr>
+      <w:r>
+        <w:t xml:space="preserve">        ArrayList&lt;String&gt; medicines = readLines(medicinesFile);</w:t>
+      </w:r>
+    </w:p>
+    <w:p>
+      <w:pPr>
+        <w:pStyle w:val="Listing"/>
+      </w:pPr>
+    </w:p>
+    <w:p>
+      <w:pPr>
+        <w:pStyle w:val="Listing"/>
+      </w:pPr>
+      <w:r>
+        <w:t xml:space="preserve">        String bestName = null;</w:t>
+      </w:r>
+    </w:p>
+    <w:p>
+      <w:pPr>
+        <w:pStyle w:val="Listing"/>
+      </w:pPr>
+      <w:r>
+        <w:t xml:space="preserve">        int bestCount = 0;</w:t>
+      </w:r>
+    </w:p>
+    <w:p>
+      <w:pPr>
+        <w:pStyle w:val="Listing"/>
+      </w:pPr>
+      <w:r>
+        <w:t xml:space="preserve">        for (String line : medicines) {</w:t>
+      </w:r>
+    </w:p>
+    <w:p>
+      <w:pPr>
+        <w:pStyle w:val="Listing"/>
+      </w:pPr>
+      <w:r>
+        <w:t xml:space="preserve">            // Формат строки: Название | симптом1, симптом2, ...</w:t>
+      </w:r>
+    </w:p>
+    <w:p>
+      <w:pPr>
+        <w:pStyle w:val="Listing"/>
+      </w:pPr>
+      <w:r>
+        <w:t xml:space="preserve">            String[] parts = line.split("\\|");</w:t>
+      </w:r>
+    </w:p>
+    <w:p>
+      <w:pPr>
+        <w:pStyle w:val="Listing"/>
+      </w:pPr>
+      <w:r>
+        <w:t xml:space="preserve">            if (parts.length &lt; 2) {</w:t>
+      </w:r>
+    </w:p>
+    <w:p>
+      <w:pPr>
+        <w:pStyle w:val="Listing"/>
+      </w:pPr>
+      <w:r>
+        <w:t xml:space="preserve">                continue;</w:t>
+      </w:r>
+    </w:p>
+    <w:p>
+      <w:pPr>
+        <w:pStyle w:val="Listing"/>
+      </w:pPr>
+      <w:r>
+        <w:t xml:space="preserve">            }</w:t>
+      </w:r>
+    </w:p>
+    <w:p>
+      <w:pPr>
+        <w:pStyle w:val="Listing"/>
+      </w:pPr>
+      <w:r>
+        <w:t xml:space="preserve">            String name = parts[0].trim();</w:t>
+      </w:r>
+    </w:p>
+    <w:p>
+      <w:pPr>
+        <w:pStyle w:val="Listing"/>
+      </w:pPr>
+      <w:r>
+        <w:t xml:space="preserve">            int coincidenceCount = testSymptoms(parts[1], keywords);</w:t>
+      </w:r>
+    </w:p>
+    <w:p>
+      <w:pPr>
+        <w:pStyle w:val="Listing"/>
+      </w:pPr>
+      <w:r>
+        <w:t xml:space="preserve">            textArea.append("\n" + name + "  :" + coincidenceCount);</w:t>
+      </w:r>
+    </w:p>
+    <w:p>
+      <w:pPr>
+        <w:pStyle w:val="Listing"/>
+      </w:pPr>
+      <w:r>
+        <w:t xml:space="preserve">            if (coincidenceCount &gt; bestCount) {</w:t>
+      </w:r>
+    </w:p>
+    <w:p>
+      <w:pPr>
+        <w:pStyle w:val="Listing"/>
+      </w:pPr>
+      <w:r>
+        <w:t xml:space="preserve">                bestCount = coincidenceCount;</w:t>
+      </w:r>
+    </w:p>
+    <w:p>
+      <w:pPr>
+        <w:pStyle w:val="Listing"/>
+      </w:pPr>
+      <w:r>
+        <w:t xml:space="preserve">                bestName = name;</w:t>
+      </w:r>
+    </w:p>
+    <w:p>
+      <w:pPr>
+        <w:pStyle w:val="Listing"/>
+      </w:pPr>
+      <w:r>
+        <w:t xml:space="preserve">            }</w:t>
+      </w:r>
+    </w:p>
+    <w:p>
+      <w:pPr>
+        <w:pStyle w:val="Listing"/>
+      </w:pPr>
+      <w:r>
+        <w:t xml:space="preserve">        }</w:t>
+      </w:r>
+    </w:p>
+    <w:p>
+      <w:pPr>
+        <w:pStyle w:val="Listing"/>
+      </w:pPr>
+    </w:p>
+    <w:p>
+      <w:pPr>
+        <w:pStyle w:val="Listing"/>
+      </w:pPr>
+      <w:r>
+        <w:t xml:space="preserve">        if (bestName == null) {</w:t>
+      </w:r>
+    </w:p>
+    <w:p>
+      <w:pPr>
+        <w:pStyle w:val="Listing"/>
+      </w:pPr>
+      <w:r>
+        <w:t xml:space="preserve">            textArea.append("\nЛекарство не найдено");</w:t>
+      </w:r>
+    </w:p>
+    <w:p>
+      <w:pPr>
+        <w:pStyle w:val="Listing"/>
+      </w:pPr>
+      <w:r>
+        <w:t xml:space="preserve">        } else {</w:t>
+      </w:r>
+    </w:p>
+    <w:p>
+      <w:pPr>
+        <w:pStyle w:val="Listing"/>
+      </w:pPr>
+      <w:r>
+        <w:t xml:space="preserve">            textArea.append("\n\nЛекарство: " + bestName);</w:t>
+      </w:r>
+    </w:p>
+    <w:p>
+      <w:pPr>
+        <w:pStyle w:val="Listing"/>
+      </w:pPr>
+      <w:r>
+        <w:t xml:space="preserve">            openInBrowser(new File("source_html", bestName + ".html"));</w:t>
+      </w:r>
+    </w:p>
+    <w:p>
+      <w:pPr>
+        <w:pStyle w:val="Listing"/>
+      </w:pPr>
+      <w:r>
+        <w:t xml:space="preserve">        }</w:t>
+      </w:r>
+    </w:p>
+    <w:p>
+      <w:pPr>
+        <w:pStyle w:val="Listing"/>
+      </w:pPr>
+      <w:r>
+        <w:t xml:space="preserve">    }</w:t>
+      </w:r>
+    </w:p>
+    <w:p>
+      <w:pPr>
+        <w:pStyle w:val="Listing"/>
+      </w:pPr>
+      <w:r>
+        <w:t>}</w:t>
+      </w:r>
+    </w:p>
+    <w:p/>
+    <w:p>
+      <w:pPr>
+        <w:keepNext/>
+        <w:ind w:firstLine="709"/>
+        <w:jc w:val="both"/>
+      </w:pPr>
+      <w:r>
+        <w:t>Листинг А.2 – Чтение файла, подсчет совпадений и открытие браузера</w:t>
+      </w:r>
+    </w:p>
+    <w:p>
+      <w:pPr>
+        <w:pStyle w:val="Listing"/>
+      </w:pPr>
+      <w:r>
+        <w:t>// Чтение строк файла через URL и потоковые классы</w:t>
+      </w:r>
+    </w:p>
+    <w:p>
+      <w:pPr>
+        <w:pStyle w:val="Listing"/>
+      </w:pPr>
+      <w:r>
+        <w:t>private ArrayList&lt;String&gt; readLines(File file) {</w:t>
+      </w:r>
+    </w:p>
+    <w:p>
+      <w:pPr>
+        <w:pStyle w:val="Listing"/>
+      </w:pPr>
+      <w:r>
+        <w:t xml:space="preserve">    ArrayList&lt;String&gt; lines = new ArrayList&lt;&gt;();</w:t>
+      </w:r>
+    </w:p>
+    <w:p>
+      <w:pPr>
+        <w:pStyle w:val="Listing"/>
+      </w:pPr>
+      <w:r>
+        <w:t xml:space="preserve">    try {</w:t>
+      </w:r>
+    </w:p>
+    <w:p>
+      <w:pPr>
+        <w:pStyle w:val="Listing"/>
+      </w:pPr>
+      <w:r>
+        <w:t xml:space="preserve">        URL url = file.toURI().toURL();</w:t>
+      </w:r>
+    </w:p>
+    <w:p>
+      <w:pPr>
+        <w:pStyle w:val="Listing"/>
+      </w:pPr>
+      <w:r>
+        <w:t xml:space="preserve">        URLConnection connection = url.openConnection();</w:t>
+      </w:r>
+    </w:p>
+    <w:p>
+      <w:pPr>
+        <w:pStyle w:val="Listing"/>
+      </w:pPr>
+      <w:r>
+        <w:lastRenderedPageBreak/>
+        <w:t xml:space="preserve">        try (BufferedReader reader = new BufferedReader(</w:t>
+      </w:r>
+    </w:p>
+    <w:p>
+      <w:pPr>
+        <w:pStyle w:val="Listing"/>
+      </w:pPr>
+      <w:r>
+        <w:t xml:space="preserve">                new InputStreamReader(connection.getInputStream(), "UTF-8"))) {</w:t>
+      </w:r>
+    </w:p>
+    <w:p>
+      <w:pPr>
+        <w:pStyle w:val="Listing"/>
+      </w:pPr>
+      <w:r>
+        <w:t xml:space="preserve">            String line;</w:t>
+      </w:r>
+    </w:p>
+    <w:p>
+      <w:pPr>
+        <w:pStyle w:val="Listing"/>
+      </w:pPr>
+      <w:r>
+        <w:t xml:space="preserve">            while ((line = reader.readLine()) != null) {</w:t>
+      </w:r>
+    </w:p>
+    <w:p>
+      <w:pPr>
+        <w:pStyle w:val="Listing"/>
+      </w:pPr>
+      <w:r>
+        <w:t xml:space="preserve">                if (!line.trim().isEmpty() &amp;&amp; !line.startsWith("#")) {</w:t>
+      </w:r>
+    </w:p>
+    <w:p>
+      <w:pPr>
+        <w:pStyle w:val="Listing"/>
+      </w:pPr>
+      <w:r>
+        <w:t xml:space="preserve">                    lines.add(line);</w:t>
+      </w:r>
+    </w:p>
+    <w:p>
+      <w:pPr>
+        <w:pStyle w:val="Listing"/>
+      </w:pPr>
+      <w:r>
+        <w:t xml:space="preserve">                }</w:t>
+      </w:r>
+    </w:p>
+    <w:p>
+      <w:pPr>
+        <w:pStyle w:val="Listing"/>
+      </w:pPr>
+      <w:r>
+        <w:t xml:space="preserve">            }</w:t>
+      </w:r>
+    </w:p>
+    <w:p>
+      <w:pPr>
+        <w:pStyle w:val="Listing"/>
+      </w:pPr>
+      <w:r>
+        <w:t xml:space="preserve">        }</w:t>
+      </w:r>
+    </w:p>
+    <w:p>
+      <w:pPr>
+        <w:pStyle w:val="Listing"/>
+      </w:pPr>
+      <w:r>
+        <w:t xml:space="preserve">    } catch (IOException e) {</w:t>
+      </w:r>
+    </w:p>
+    <w:p>
+      <w:pPr>
+        <w:pStyle w:val="Listing"/>
+      </w:pPr>
+      <w:r>
+        <w:t xml:space="preserve">        System.out.println("Error: " + e.getMessage());</w:t>
+      </w:r>
+    </w:p>
+    <w:p>
+      <w:pPr>
+        <w:pStyle w:val="Listing"/>
+      </w:pPr>
+      <w:r>
+        <w:t xml:space="preserve">    }</w:t>
+      </w:r>
+    </w:p>
+    <w:p>
+      <w:pPr>
+        <w:pStyle w:val="Listing"/>
+      </w:pPr>
+      <w:r>
+        <w:t xml:space="preserve">    return lines;</w:t>
+      </w:r>
+    </w:p>
+    <w:p>
+      <w:pPr>
+        <w:pStyle w:val="Listing"/>
+      </w:pPr>
+      <w:r>
+        <w:t>}</w:t>
+      </w:r>
+    </w:p>
+    <w:p>
+      <w:pPr>
+        <w:pStyle w:val="Listing"/>
+      </w:pPr>
+    </w:p>
+    <w:p>
+      <w:pPr>
+        <w:pStyle w:val="Listing"/>
+      </w:pPr>
+      <w:r>
+        <w:t>// Число ключевых слов, найденных среди симптомов лекарства</w:t>
+      </w:r>
+    </w:p>
+    <w:p>
+      <w:pPr>
+        <w:pStyle w:val="Listing"/>
+      </w:pPr>
+      <w:r>
+        <w:t>private int testSymptoms(String symptoms, String[] keywords) {</w:t>
+      </w:r>
+    </w:p>
+    <w:p>
+      <w:pPr>
+        <w:pStyle w:val="Listing"/>
+      </w:pPr>
+      <w:r>
+        <w:t xml:space="preserve">    int results = 0;</w:t>
+      </w:r>
+    </w:p>
+    <w:p>
+      <w:pPr>
+        <w:pStyle w:val="Listing"/>
+      </w:pPr>
+      <w:r>
+        <w:t xml:space="preserve">    String content = symptoms.toLowerCase();</w:t>
+      </w:r>
+    </w:p>
+    <w:p>
+      <w:pPr>
+        <w:pStyle w:val="Listing"/>
+      </w:pPr>
+      <w:r>
+        <w:t xml:space="preserve">    for (String keyword : keywords) {</w:t>
+      </w:r>
+    </w:p>
+    <w:p>
+      <w:pPr>
+        <w:pStyle w:val="Listing"/>
+      </w:pPr>
+      <w:r>
+        <w:t xml:space="preserve">        if (!keyword.trim().isEmpty() &amp;&amp; content.contains(keyword.trim().toLowerCase())) {</w:t>
+      </w:r>
+    </w:p>
+    <w:p>
+      <w:pPr>
+        <w:pStyle w:val="Listing"/>
+      </w:pPr>
+      <w:r>
+        <w:t xml:space="preserve">            results++;</w:t>
+      </w:r>
+    </w:p>
+    <w:p>
+      <w:pPr>
+        <w:pStyle w:val="Listing"/>
+      </w:pPr>
+      <w:r>
+        <w:t xml:space="preserve">        }</w:t>
+      </w:r>
+    </w:p>
+    <w:p>
+      <w:pPr>
+        <w:pStyle w:val="Listing"/>
+      </w:pPr>
+      <w:r>
+        <w:t xml:space="preserve">    }</w:t>
+      </w:r>
+    </w:p>
+    <w:p>
+      <w:pPr>
+        <w:pStyle w:val="Listing"/>
+      </w:pPr>
+      <w:r>
+        <w:t xml:space="preserve">    return results;</w:t>
+      </w:r>
+    </w:p>
+    <w:p>
+      <w:pPr>
+        <w:pStyle w:val="Listing"/>
+      </w:pPr>
+      <w:r>
+        <w:t>}</w:t>
+      </w:r>
+    </w:p>
+    <w:p>
+      <w:pPr>
+        <w:pStyle w:val="Listing"/>
+      </w:pPr>
+    </w:p>
+    <w:p>
+      <w:pPr>
+        <w:pStyle w:val="Listing"/>
+      </w:pPr>
+      <w:r>
+        <w:t>// Открытие html-документа в браузере</w:t>
+      </w:r>
+    </w:p>
+    <w:p>
+      <w:pPr>
+        <w:pStyle w:val="Listing"/>
+      </w:pPr>
+      <w:r>
+        <w:t>private void openInBrowser(File file) {</w:t>
+      </w:r>
+    </w:p>
+    <w:p>
+      <w:pPr>
+        <w:pStyle w:val="Listing"/>
+      </w:pPr>
+      <w:r>
+        <w:t xml:space="preserve">    try {</w:t>
+      </w:r>
+    </w:p>
+    <w:p>
+      <w:pPr>
+        <w:pStyle w:val="Listing"/>
+      </w:pPr>
+      <w:r>
+        <w:t xml:space="preserve">        Desktop.getDesktop().browse(file.getAbsoluteFile().toURI());</w:t>
+      </w:r>
+    </w:p>
+    <w:p>
+      <w:pPr>
+        <w:pStyle w:val="Listing"/>
+      </w:pPr>
+      <w:r>
+        <w:t xml:space="preserve">    } catch (IOException e) {</w:t>
+      </w:r>
+    </w:p>
+    <w:p>
+      <w:pPr>
+        <w:pStyle w:val="Listing"/>
+      </w:pPr>
+      <w:r>
+        <w:t xml:space="preserve">        System.out.println("Error: " + e.getMessage());</w:t>
+      </w:r>
+    </w:p>
+    <w:p>
+      <w:pPr>
+        <w:pStyle w:val="Listing"/>
+      </w:pPr>
+      <w:r>
+        <w:t xml:space="preserve">    }</w:t>
+      </w:r>
+    </w:p>
+    <w:p>
+      <w:pPr>
+        <w:pStyle w:val="Listing"/>
+      </w:pPr>
+      <w:r>
+        <w:t>}</w:t>
+      </w:r>
+    </w:p>
+    <w:p/>
     <w:sectPr>
       <w:headerReference w:type="default" r:id="rId13"/>
       <w:footerReference w:type="default" r:id="rId14"/>
@@ -3957,31 +3948,31 @@
       </w:rPr>
     </w:lvl>
   </w:abstractNum>
-  <w:num w:numId="1" w16cid:durableId="778647475">
+  <w:num w:numId="1" w16cid:durableId="1984002347">
     <w:abstractNumId w:val="8"/>
   </w:num>
-  <w:num w:numId="2" w16cid:durableId="2068797499">
+  <w:num w:numId="2" w16cid:durableId="546795265">
     <w:abstractNumId w:val="6"/>
   </w:num>
-  <w:num w:numId="3" w16cid:durableId="1783845183">
+  <w:num w:numId="3" w16cid:durableId="1114254830">
     <w:abstractNumId w:val="5"/>
   </w:num>
-  <w:num w:numId="4" w16cid:durableId="1611475739">
+  <w:num w:numId="4" w16cid:durableId="1292783547">
     <w:abstractNumId w:val="4"/>
   </w:num>
-  <w:num w:numId="5" w16cid:durableId="647325909">
+  <w:num w:numId="5" w16cid:durableId="1490366897">
     <w:abstractNumId w:val="7"/>
   </w:num>
-  <w:num w:numId="6" w16cid:durableId="1796410528">
+  <w:num w:numId="6" w16cid:durableId="1924874051">
     <w:abstractNumId w:val="3"/>
   </w:num>
-  <w:num w:numId="7" w16cid:durableId="1651787280">
+  <w:num w:numId="7" w16cid:durableId="1122072669">
     <w:abstractNumId w:val="2"/>
   </w:num>
-  <w:num w:numId="8" w16cid:durableId="1622759989">
+  <w:num w:numId="8" w16cid:durableId="1991401534">
     <w:abstractNumId w:val="1"/>
   </w:num>
-  <w:num w:numId="9" w16cid:durableId="984242659">
+  <w:num w:numId="9" w16cid:durableId="958226075">
     <w:abstractNumId w:val="0"/>
   </w:num>
 </w:numbering>
@@ -4403,6 +4394,7 @@
       <w:rFonts w:asciiTheme="majorHAnsi" w:eastAsiaTheme="majorEastAsia" w:hAnsiTheme="majorHAnsi" w:cstheme="majorBidi"/>
       <w:b/>
       <w:bCs/>
+      <w:caps/>
       <w:szCs w:val="28"/>
     </w:rPr>
   </w:style>
@@ -15387,7 +15379,7 @@
     <w:autoRedefine/>
     <w:uiPriority w:val="39"/>
     <w:unhideWhenUsed/>
-    <w:rsid w:val="002D5C9D"/>
+    <w:rsid w:val="008F07BB"/>
     <w:pPr>
       <w:spacing w:after="100"/>
     </w:pPr>
@@ -15399,7 +15391,7 @@
     <w:autoRedefine/>
     <w:uiPriority w:val="39"/>
     <w:unhideWhenUsed/>
-    <w:rsid w:val="002D5C9D"/>
+    <w:rsid w:val="008F07BB"/>
     <w:pPr>
       <w:spacing w:after="100"/>
       <w:ind w:left="280"/>
@@ -15410,7 +15402,7 @@
     <w:basedOn w:val="a2"/>
     <w:uiPriority w:val="99"/>
     <w:unhideWhenUsed/>
-    <w:rsid w:val="002D5C9D"/>
+    <w:rsid w:val="008F07BB"/>
     <w:rPr>
       <w:color w:val="0000FF" w:themeColor="hyperlink"/>
       <w:u w:val="single"/>

</xml_diff>

<commit_message>
docs: reports re-laid out by the new rules (page number 10 mm from the bottom edge, capital section headings)
</commit_message>
<xml_diff>
--- a/airp/lab1/report/Отчет_ЛР1.docx
+++ b/airp/lab1/report/Отчет_ЛР1.docx
@@ -306,13 +306,13 @@
       <w:r>
         <w:fldChar w:fldCharType="separate"/>
       </w:r>
-      <w:hyperlink w:anchor="_Toc242612903" w:history="1">
+      <w:hyperlink w:anchor="_Toc242646769" w:history="1">
         <w:r>
           <w:rPr>
             <w:rStyle w:val="aff8"/>
             <w:noProof/>
           </w:rPr>
-          <w:t>1 Цель работы</w:t>
+          <w:t>1 ЦЕЛЬ РАБОТЫ</w:t>
         </w:r>
         <w:r>
           <w:rPr>
@@ -333,7 +333,7 @@
             <w:noProof/>
             <w:webHidden/>
           </w:rPr>
-          <w:instrText xml:space="preserve"> PAGEREF _Toc242612903 \h </w:instrText>
+          <w:instrText xml:space="preserve"> PAGEREF _Toc242646769 \h </w:instrText>
         </w:r>
         <w:r>
           <w:rPr>
@@ -379,13 +379,13 @@
           <w14:ligatures w14:val="standardContextual"/>
         </w:rPr>
       </w:pPr>
-      <w:hyperlink w:anchor="_Toc242612904" w:history="1">
+      <w:hyperlink w:anchor="_Toc242646770" w:history="1">
         <w:r>
           <w:rPr>
             <w:rStyle w:val="aff8"/>
             <w:noProof/>
           </w:rPr>
-          <w:t>2 Ход работы</w:t>
+          <w:t>2 ХОД РАБОТЫ</w:t>
         </w:r>
         <w:r>
           <w:rPr>
@@ -406,7 +406,7 @@
             <w:noProof/>
             <w:webHidden/>
           </w:rPr>
-          <w:instrText xml:space="preserve"> PAGEREF _Toc242612904 \h </w:instrText>
+          <w:instrText xml:space="preserve"> PAGEREF _Toc242646770 \h </w:instrText>
         </w:r>
         <w:r>
           <w:rPr>
@@ -452,7 +452,7 @@
           <w14:ligatures w14:val="standardContextual"/>
         </w:rPr>
       </w:pPr>
-      <w:hyperlink w:anchor="_Toc242612905" w:history="1">
+      <w:hyperlink w:anchor="_Toc242646771" w:history="1">
         <w:r>
           <w:rPr>
             <w:rStyle w:val="aff8"/>
@@ -479,7 +479,7 @@
             <w:noProof/>
             <w:webHidden/>
           </w:rPr>
-          <w:instrText xml:space="preserve"> PAGEREF _Toc242612905 \h </w:instrText>
+          <w:instrText xml:space="preserve"> PAGEREF _Toc242646771 \h </w:instrText>
         </w:r>
         <w:r>
           <w:rPr>
@@ -525,7 +525,7 @@
           <w14:ligatures w14:val="standardContextual"/>
         </w:rPr>
       </w:pPr>
-      <w:hyperlink w:anchor="_Toc242612906" w:history="1">
+      <w:hyperlink w:anchor="_Toc242646772" w:history="1">
         <w:r>
           <w:rPr>
             <w:rStyle w:val="aff8"/>
@@ -552,7 +552,7 @@
             <w:noProof/>
             <w:webHidden/>
           </w:rPr>
-          <w:instrText xml:space="preserve"> PAGEREF _Toc242612906 \h </w:instrText>
+          <w:instrText xml:space="preserve"> PAGEREF _Toc242646772 \h </w:instrText>
         </w:r>
         <w:r>
           <w:rPr>
@@ -598,7 +598,7 @@
           <w14:ligatures w14:val="standardContextual"/>
         </w:rPr>
       </w:pPr>
-      <w:hyperlink w:anchor="_Toc242612907" w:history="1">
+      <w:hyperlink w:anchor="_Toc242646773" w:history="1">
         <w:r>
           <w:rPr>
             <w:rStyle w:val="aff8"/>
@@ -625,7 +625,7 @@
             <w:noProof/>
             <w:webHidden/>
           </w:rPr>
-          <w:instrText xml:space="preserve"> PAGEREF _Toc242612907 \h </w:instrText>
+          <w:instrText xml:space="preserve"> PAGEREF _Toc242646773 \h </w:instrText>
         </w:r>
         <w:r>
           <w:rPr>
@@ -671,7 +671,7 @@
           <w14:ligatures w14:val="standardContextual"/>
         </w:rPr>
       </w:pPr>
-      <w:hyperlink w:anchor="_Toc242612908" w:history="1">
+      <w:hyperlink w:anchor="_Toc242646774" w:history="1">
         <w:r>
           <w:rPr>
             <w:rStyle w:val="aff8"/>
@@ -698,7 +698,7 @@
             <w:noProof/>
             <w:webHidden/>
           </w:rPr>
-          <w:instrText xml:space="preserve"> PAGEREF _Toc242612908 \h </w:instrText>
+          <w:instrText xml:space="preserve"> PAGEREF _Toc242646774 \h </w:instrText>
         </w:r>
         <w:r>
           <w:rPr>
@@ -744,7 +744,7 @@
           <w14:ligatures w14:val="standardContextual"/>
         </w:rPr>
       </w:pPr>
-      <w:hyperlink w:anchor="_Toc242612909" w:history="1">
+      <w:hyperlink w:anchor="_Toc242646775" w:history="1">
         <w:r>
           <w:rPr>
             <w:rStyle w:val="aff8"/>
@@ -771,7 +771,7 @@
             <w:noProof/>
             <w:webHidden/>
           </w:rPr>
-          <w:instrText xml:space="preserve"> PAGEREF _Toc242612909 \h </w:instrText>
+          <w:instrText xml:space="preserve"> PAGEREF _Toc242646775 \h </w:instrText>
         </w:r>
         <w:r>
           <w:rPr>
@@ -817,7 +817,7 @@
           <w14:ligatures w14:val="standardContextual"/>
         </w:rPr>
       </w:pPr>
-      <w:hyperlink w:anchor="_Toc242612910" w:history="1">
+      <w:hyperlink w:anchor="_Toc242646776" w:history="1">
         <w:r>
           <w:rPr>
             <w:rStyle w:val="aff8"/>
@@ -844,7 +844,7 @@
             <w:noProof/>
             <w:webHidden/>
           </w:rPr>
-          <w:instrText xml:space="preserve"> PAGEREF _Toc242612910 \h </w:instrText>
+          <w:instrText xml:space="preserve"> PAGEREF _Toc242646776 \h </w:instrText>
         </w:r>
         <w:r>
           <w:rPr>
@@ -890,13 +890,13 @@
           <w14:ligatures w14:val="standardContextual"/>
         </w:rPr>
       </w:pPr>
-      <w:hyperlink w:anchor="_Toc242612911" w:history="1">
+      <w:hyperlink w:anchor="_Toc242646777" w:history="1">
         <w:r>
           <w:rPr>
             <w:rStyle w:val="aff8"/>
             <w:noProof/>
           </w:rPr>
-          <w:t>3 Ответы на контрольные вопросы</w:t>
+          <w:t>3 ОТВЕТЫ НА КОНТРОЛЬНЫЕ ВОПРОСЫ</w:t>
         </w:r>
         <w:r>
           <w:rPr>
@@ -917,7 +917,7 @@
             <w:noProof/>
             <w:webHidden/>
           </w:rPr>
-          <w:instrText xml:space="preserve"> PAGEREF _Toc242612911 \h </w:instrText>
+          <w:instrText xml:space="preserve"> PAGEREF _Toc242646777 \h </w:instrText>
         </w:r>
         <w:r>
           <w:rPr>
@@ -963,13 +963,13 @@
           <w14:ligatures w14:val="standardContextual"/>
         </w:rPr>
       </w:pPr>
-      <w:hyperlink w:anchor="_Toc242612912" w:history="1">
+      <w:hyperlink w:anchor="_Toc242646778" w:history="1">
         <w:r>
           <w:rPr>
             <w:rStyle w:val="aff8"/>
             <w:noProof/>
           </w:rPr>
-          <w:t>Выводы</w:t>
+          <w:t>ВЫВОДЫ</w:t>
         </w:r>
         <w:r>
           <w:rPr>
@@ -990,7 +990,7 @@
             <w:noProof/>
             <w:webHidden/>
           </w:rPr>
-          <w:instrText xml:space="preserve"> PAGEREF _Toc242612912 \h </w:instrText>
+          <w:instrText xml:space="preserve"> PAGEREF _Toc242646778 \h </w:instrText>
         </w:r>
         <w:r>
           <w:rPr>
@@ -1036,13 +1036,13 @@
           <w14:ligatures w14:val="standardContextual"/>
         </w:rPr>
       </w:pPr>
-      <w:hyperlink w:anchor="_Toc242612913" w:history="1">
+      <w:hyperlink w:anchor="_Toc242646779" w:history="1">
         <w:r>
           <w:rPr>
             <w:rStyle w:val="aff8"/>
             <w:noProof/>
           </w:rPr>
-          <w:t>Приложение А (обязательное) Листинги программного кода</w:t>
+          <w:t>ПРИЛОЖЕНИЕ А (ОБЯЗАТЕЛЬНОЕ) ЛИСТИНГИ ПРОГРАММНОГО КОДА</w:t>
         </w:r>
         <w:r>
           <w:rPr>
@@ -1063,7 +1063,7 @@
             <w:noProof/>
             <w:webHidden/>
           </w:rPr>
-          <w:instrText xml:space="preserve"> PAGEREF _Toc242612913 \h </w:instrText>
+          <w:instrText xml:space="preserve"> PAGEREF _Toc242646779 \h </w:instrText>
         </w:r>
         <w:r>
           <w:rPr>
@@ -1109,13 +1109,13 @@
         <w:pStyle w:val="1"/>
         <w:ind w:firstLine="709"/>
       </w:pPr>
-      <w:bookmarkStart w:id="0" w:name="_Toc242612903"/>
+      <w:bookmarkStart w:id="0" w:name="_Toc242646769"/>
       <w:r>
         <w:rPr>
           <w:rFonts w:ascii="Times New Roman" w:hAnsi="Times New Roman"/>
         </w:rPr>
         <w:lastRenderedPageBreak/>
-        <w:t>1 Цель работы</w:t>
+        <w:t>1 ЦЕЛЬ РАБОТЫ</w:t>
       </w:r>
       <w:bookmarkEnd w:id="0"/>
     </w:p>
@@ -1174,13 +1174,13 @@
         <w:pStyle w:val="1"/>
         <w:ind w:firstLine="709"/>
       </w:pPr>
-      <w:bookmarkStart w:id="1" w:name="_Toc242612904"/>
+      <w:bookmarkStart w:id="1" w:name="_Toc242646770"/>
       <w:r>
         <w:rPr>
           <w:rFonts w:ascii="Times New Roman" w:hAnsi="Times New Roman"/>
         </w:rPr>
         <w:lastRenderedPageBreak/>
-        <w:t>2 Ход работы</w:t>
+        <w:t>2 ХОД РАБОТЫ</w:t>
       </w:r>
       <w:bookmarkEnd w:id="1"/>
     </w:p>
@@ -1217,7 +1217,7 @@
         <w:spacing w:before="360"/>
         <w:ind w:firstLine="709"/>
       </w:pPr>
-      <w:bookmarkStart w:id="2" w:name="_Toc242612905"/>
+      <w:bookmarkStart w:id="2" w:name="_Toc242646771"/>
       <w:r>
         <w:rPr>
           <w:rFonts w:ascii="Times New Roman" w:hAnsi="Times New Roman"/>
@@ -1295,7 +1295,7 @@
         <w:spacing w:before="360"/>
         <w:ind w:firstLine="709"/>
       </w:pPr>
-      <w:bookmarkStart w:id="3" w:name="_Toc242612906"/>
+      <w:bookmarkStart w:id="3" w:name="_Toc242646772"/>
       <w:r>
         <w:rPr>
           <w:rFonts w:ascii="Times New Roman" w:hAnsi="Times New Roman"/>
@@ -1382,10 +1382,7 @@
         <w:t>openConnection</w:t>
       </w:r>
       <w:r>
-        <w:t>()</w:t>
-      </w:r>
-      <w:r>
-        <w:t xml:space="preserve"> создает соединение, а метод </w:t>
+        <w:t xml:space="preserve">() создает соединение, а метод </w:t>
       </w:r>
       <w:r>
         <w:rPr>
@@ -1394,10 +1391,7 @@
         <w:t>getInputStream</w:t>
       </w:r>
       <w:r>
-        <w:t>()</w:t>
-      </w:r>
-      <w:r>
-        <w:t xml:space="preserve"> возвращает входной поток, который оборачивается потоковыми классами </w:t>
+        <w:t xml:space="preserve">() возвращает входной поток, который оборачивается потоковыми классами </w:t>
       </w:r>
       <w:r>
         <w:rPr>
@@ -1496,10 +1490,7 @@
         <w:t>uri</w:t>
       </w:r>
       <w:r>
-        <w:t>)</w:t>
-      </w:r>
-      <w:r>
-        <w:t>.</w:t>
+        <w:t>).</w:t>
       </w:r>
     </w:p>
     <w:p>
@@ -1508,7 +1499,7 @@
         <w:spacing w:before="360"/>
         <w:ind w:firstLine="709"/>
       </w:pPr>
-      <w:bookmarkStart w:id="4" w:name="_Toc242612907"/>
+      <w:bookmarkStart w:id="4" w:name="_Toc242646773"/>
       <w:r>
         <w:rPr>
           <w:rFonts w:ascii="Times New Roman" w:hAnsi="Times New Roman"/>
@@ -1671,7 +1662,7 @@
         <w:spacing w:before="360"/>
         <w:ind w:firstLine="709"/>
       </w:pPr>
-      <w:bookmarkStart w:id="5" w:name="_Toc242612908"/>
+      <w:bookmarkStart w:id="5" w:name="_Toc242646774"/>
       <w:r>
         <w:rPr>
           <w:rFonts w:ascii="Times New Roman" w:hAnsi="Times New Roman"/>
@@ -1713,7 +1704,7 @@
         <w:t>source_html</w:t>
       </w:r>
       <w:r>
-        <w:t>. Состав набора данных приведен в таблице 3.1.</w:t>
+        <w:t>. Состав набора данных приведен в таблице 3.1.</w:t>
       </w:r>
     </w:p>
     <w:p>
@@ -1732,7 +1723,7 @@
         <w:t>medicines.txt</w:t>
       </w:r>
       <w:r>
-        <w:t>» приведены в таблице 2.1.</w:t>
+        <w:t>» приведены в таблице 2.1.</w:t>
       </w:r>
     </w:p>
     <w:p>
@@ -1741,7 +1732,7 @@
         <w:spacing w:before="360"/>
       </w:pPr>
       <w:r>
-        <w:t xml:space="preserve">Таблица 2.1 – Набор данных </w:t>
+        <w:t xml:space="preserve">Таблица 2.1 – Набор данных </w:t>
       </w:r>
       <w:r>
         <w:rPr>
@@ -2059,7 +2050,7 @@
         <w:spacing w:before="360"/>
         <w:ind w:firstLine="709"/>
       </w:pPr>
-      <w:bookmarkStart w:id="6" w:name="_Toc242612909"/>
+      <w:bookmarkStart w:id="6" w:name="_Toc242646775"/>
       <w:r>
         <w:rPr>
           <w:rFonts w:ascii="Times New Roman" w:hAnsi="Times New Roman"/>
@@ -2146,7 +2137,7 @@
         <w:spacing w:before="360"/>
         <w:ind w:firstLine="709"/>
       </w:pPr>
-      <w:bookmarkStart w:id="7" w:name="_Toc242612910"/>
+      <w:bookmarkStart w:id="7" w:name="_Toc242646776"/>
       <w:r>
         <w:rPr>
           <w:rFonts w:ascii="Times New Roman" w:hAnsi="Times New Roman"/>
@@ -2162,7 +2153,7 @@
         <w:jc w:val="both"/>
       </w:pPr>
       <w:r>
-        <w:t>Окно приложения после запуска показано на рисунке 2.1.</w:t>
+        <w:t>Окно приложения после запуска показано на рисунке 2.1.</w:t>
       </w:r>
     </w:p>
     <w:p>
@@ -2218,7 +2209,7 @@
         <w:jc w:val="center"/>
       </w:pPr>
       <w:r>
-        <w:t>Рисунок 2.1 – Окно приложения после запуска</w:t>
+        <w:t>Рисунок 2.1 – Окно приложения после запуска</w:t>
       </w:r>
     </w:p>
     <w:p/>
@@ -2255,7 +2246,7 @@
         <w:jc w:val="both"/>
       </w:pPr>
       <w:r>
-        <w:t>В текстовую область введены симптомы «головная боль, высокая температура», как показано на рисунке 2.2.</w:t>
+        <w:t>В текстовую область введены симптомы «головная боль, высокая температура», как показано на рисунке 2.2.</w:t>
       </w:r>
     </w:p>
     <w:p>
@@ -2311,7 +2302,7 @@
         <w:jc w:val="center"/>
       </w:pPr>
       <w:r>
-        <w:t>Рисунок 2.2 – Ввод ключевых слов</w:t>
+        <w:t>Рисунок 2.2 – Ввод ключевых слов</w:t>
       </w:r>
     </w:p>
     <w:p/>
@@ -2330,7 +2321,7 @@
         <w:jc w:val="both"/>
       </w:pPr>
       <w:r>
-        <w:t>Результат поиска показан на рисунках 2.3 и 2.4.</w:t>
+        <w:t>Результат поиска показан на рисунках 2.3 и 2.4.</w:t>
       </w:r>
     </w:p>
     <w:p>
@@ -2386,7 +2377,7 @@
         <w:jc w:val="center"/>
       </w:pPr>
       <w:r>
-        <w:t>Рисунок 2.3 – Результат поиска (начало списка)</w:t>
+        <w:t>Рисунок 2.3 – Результат поиска (начало списка)</w:t>
       </w:r>
     </w:p>
     <w:p/>
@@ -2405,7 +2396,7 @@
         <w:jc w:val="both"/>
       </w:pPr>
       <w:r>
-        <w:t>Конец списка с найденным лекарством показан на рисунке 2.4.</w:t>
+        <w:t>Конец списка с найденным лекарством показан на рисунке 2.4.</w:t>
       </w:r>
     </w:p>
     <w:p>
@@ -2461,7 +2452,7 @@
         <w:jc w:val="center"/>
       </w:pPr>
       <w:r>
-        <w:t>Рисунок 2.4 – Результат поиска (конец списка)</w:t>
+        <w:t>Рисунок 2.4 – Результат поиска (конец списка)</w:t>
       </w:r>
     </w:p>
     <w:p/>
@@ -2489,7 +2480,7 @@
         <w:t>html</w:t>
       </w:r>
       <w:r>
-        <w:t>-документ открывается в браузере, как показано на рисунке 2.5. Снимок страницы получен отдельно, чтобы показать содержимое документа.</w:t>
+        <w:t>-документ открывается в браузере, как показано на рисунке 2.5. Снимок страницы получен отдельно, чтобы показать содержимое документа.</w:t>
       </w:r>
     </w:p>
     <w:p>
@@ -2545,7 +2536,7 @@
         <w:jc w:val="center"/>
       </w:pPr>
       <w:r>
-        <w:t>Рисунок 2.5 – Документ лекарства в браузере</w:t>
+        <w:t>Рисунок 2.5 – Документ лекарства в браузере</w:t>
       </w:r>
     </w:p>
     <w:p/>
@@ -2568,13 +2559,13 @@
         <w:pStyle w:val="1"/>
         <w:ind w:firstLine="709"/>
       </w:pPr>
-      <w:bookmarkStart w:id="8" w:name="_Toc242612911"/>
+      <w:bookmarkStart w:id="8" w:name="_Toc242646777"/>
       <w:r>
         <w:rPr>
           <w:rFonts w:ascii="Times New Roman" w:hAnsi="Times New Roman"/>
         </w:rPr>
         <w:lastRenderedPageBreak/>
-        <w:t>3 Ответы на контрольные вопросы</w:t>
+        <w:t>3 ОТВЕТЫ НА КОНТРОЛЬНЫЕ ВОПРОСЫ</w:t>
       </w:r>
       <w:bookmarkEnd w:id="8"/>
     </w:p>
@@ -2689,10 +2680,7 @@
         <w:t>toURL</w:t>
       </w:r>
       <w:r>
-        <w:t>()</w:t>
-      </w:r>
-      <w:r>
-        <w:t>.</w:t>
+        <w:t>().</w:t>
       </w:r>
     </w:p>
     <w:p>
@@ -2719,10 +2707,7 @@
         <w:t>listFiles</w:t>
       </w:r>
       <w:r>
-        <w:t>()</w:t>
-      </w:r>
-      <w:r>
-        <w:t xml:space="preserve"> объекта </w:t>
+        <w:t xml:space="preserve">() объекта </w:t>
       </w:r>
       <w:r>
         <w:rPr>
@@ -2758,10 +2743,7 @@
         <w:t>listFiles</w:t>
       </w:r>
       <w:r>
-        <w:t>()</w:t>
-      </w:r>
-      <w:r>
-        <w:t xml:space="preserve">. В заготовке методических указаний массив преобразуется в список </w:t>
+        <w:t xml:space="preserve">(). В заготовке методических указаний массив преобразуется в список </w:t>
       </w:r>
       <w:r>
         <w:rPr>
@@ -2779,10 +2761,7 @@
         <w:t>File</w:t>
       </w:r>
       <w:r>
-        <w:t>&gt;</w:t>
-      </w:r>
-      <w:r>
-        <w:t xml:space="preserve"> и обрабатывается в цикле.</w:t>
+        <w:t>&gt; и обрабатывается в цикле.</w:t>
       </w:r>
     </w:p>
     <w:p>
@@ -2836,10 +2815,7 @@
         <w:t>uri</w:t>
       </w:r>
       <w:r>
-        <w:t>)</w:t>
-      </w:r>
-      <w:r>
-        <w:t xml:space="preserve"> открывает указанный адрес в браузере по умолчанию. В программе вызывается </w:t>
+        <w:t xml:space="preserve">) открывает указанный адрес в браузере по умолчанию. В программе вызывается </w:t>
       </w:r>
       <w:r>
         <w:rPr>
@@ -2875,10 +2851,7 @@
         <w:t>toURI</w:t>
       </w:r>
       <w:r>
-        <w:t>())</w:t>
-      </w:r>
-      <w:r>
-        <w:t>.</w:t>
+        <w:t>()).</w:t>
       </w:r>
     </w:p>
     <w:p>
@@ -2905,10 +2878,7 @@
         <w:t>URLConnection.getInputStream</w:t>
       </w:r>
       <w:r>
-        <w:t>()</w:t>
-      </w:r>
-      <w:r>
-        <w:t xml:space="preserve"> возвращает байтовый поток ресурса. Класс </w:t>
+        <w:t xml:space="preserve">() возвращает байтовый поток ресурса. Класс </w:t>
       </w:r>
       <w:r>
         <w:rPr>
@@ -2944,10 +2914,7 @@
         <w:t>readLine</w:t>
       </w:r>
       <w:r>
-        <w:t>()</w:t>
-      </w:r>
-      <w:r>
-        <w:t xml:space="preserve">. Блок </w:t>
+        <w:t xml:space="preserve">(). Блок </w:t>
       </w:r>
       <w:r>
         <w:rPr>
@@ -2969,13 +2936,13 @@
         <w:pStyle w:val="1"/>
         <w:jc w:val="center"/>
       </w:pPr>
-      <w:bookmarkStart w:id="9" w:name="_Toc242612912"/>
+      <w:bookmarkStart w:id="9" w:name="_Toc242646778"/>
       <w:r>
         <w:rPr>
           <w:rFonts w:ascii="Times New Roman" w:hAnsi="Times New Roman"/>
         </w:rPr>
         <w:lastRenderedPageBreak/>
-        <w:t>Выводы</w:t>
+        <w:t>ВЫВОДЫ</w:t>
       </w:r>
       <w:bookmarkEnd w:id="9"/>
     </w:p>
@@ -3016,26 +2983,27 @@
         <w:pStyle w:val="1"/>
         <w:jc w:val="center"/>
       </w:pPr>
-      <w:bookmarkStart w:id="10" w:name="_Toc242612913"/>
-      <w:r>
+      <w:bookmarkStart w:id="10" w:name="_Toc242646779"/>
+      <w:r>
+        <w:rPr>
+          <w:rFonts w:ascii="Times New Roman" w:hAnsi="Times New Roman"/>
+        </w:rPr>
         <w:lastRenderedPageBreak/>
-        <w:t>Приложение А</w:t>
-      </w:r>
-      <w:r>
-        <w:br/>
+        <w:t>ПРИЛОЖЕНИЕ А</w:t>
       </w:r>
       <w:r>
         <w:rPr>
-          <w:caps w:val="0"/>
-        </w:rPr>
-        <w:t>(обязательное)</w:t>
-      </w:r>
-      <w:r>
-        <w:rPr>
-          <w:caps w:val="0"/>
+          <w:rFonts w:ascii="Times New Roman" w:hAnsi="Times New Roman"/>
         </w:rPr>
         <w:br/>
-        <w:t>Листинги программного кода</w:t>
+        <w:t>(ОБЯЗАТЕЛЬНОЕ)</w:t>
+      </w:r>
+      <w:r>
+        <w:rPr>
+          <w:rFonts w:ascii="Times New Roman" w:hAnsi="Times New Roman"/>
+        </w:rPr>
+        <w:br/>
+        <w:t>ЛИСТИНГИ ПРОГРАММНОГО КОДА</w:t>
       </w:r>
       <w:bookmarkEnd w:id="10"/>
     </w:p>
@@ -3678,10 +3646,9 @@
     </w:p>
     <w:p/>
     <w:sectPr>
-      <w:headerReference w:type="default" r:id="rId13"/>
-      <w:footerReference w:type="default" r:id="rId14"/>
+      <w:footerReference w:type="default" r:id="rId13"/>
       <w:pgSz w:w="11906" w:h="16838"/>
-      <w:pgMar w:top="1134" w:right="850" w:bottom="1134" w:left="1701" w:header="720" w:footer="720" w:gutter="0"/>
+      <w:pgMar w:top="1134" w:right="850" w:bottom="1134" w:left="1701" w:header="720" w:footer="567" w:gutter="0"/>
       <w:cols w:space="720"/>
       <w:docGrid w:linePitch="360"/>
     </w:sectPr>
@@ -3763,16 +3730,6 @@
     </w:p>
   </w:footnote>
 </w:footnotes>
-</file>
-
-<file path=word/header1.xml><?xml version="1.0" encoding="utf-8"?>
-<w:hdr xmlns:wpc="http://schemas.microsoft.com/office/word/2010/wordprocessingCanvas" xmlns:cx="http://schemas.microsoft.com/office/drawing/2014/chartex" xmlns:cx1="http://schemas.microsoft.com/office/drawing/2015/9/8/chartex" xmlns:cx2="http://schemas.microsoft.com/office/drawing/2015/10/21/chartex" xmlns:cx3="http://schemas.microsoft.com/office/drawing/2016/5/9/chartex" xmlns:cx4="http://schemas.microsoft.com/office/drawing/2016/5/10/chartex" xmlns:cx5="http://schemas.microsoft.com/office/drawing/2016/5/11/chartex" xmlns:cx6="http://schemas.microsoft.com/office/drawing/2016/5/12/chartex" xmlns:cx7="http://schemas.microsoft.com/office/drawing/2016/5/13/chartex" xmlns:cx8="http://schemas.microsoft.com/office/drawing/2016/5/14/chartex" xmlns:mc="http://schemas.openxmlformats.org/markup-compatibility/2006" xmlns:aink="http://schemas.microsoft.com/office/drawing/2016/ink" xmlns:am3d="http://schemas.microsoft.com/office/drawing/2017/model3d" xmlns:o="urn:schemas-microsoft-com:office:office" xmlns:oel="http://schemas.microsoft.com/office/2019/extlst" xmlns:r="http://schemas.openxmlformats.org/officeDocument/2006/relationships" xmlns:m="http://schemas.openxmlformats.org/officeDocument/2006/math" xmlns:v="urn:schemas-microsoft-com:vml" xmlns:wp14="http://schemas.microsoft.com/office/word/2010/wordprocessingDrawing" xmlns:wp="http://schemas.openxmlformats.org/drawingml/2006/wordprocessingDrawing" xmlns:w10="urn:schemas-microsoft-com:office:word" xmlns:w="http://schemas.openxmlformats.org/wordprocessingml/2006/main" xmlns:w14="http://schemas.microsoft.com/office/word/2010/wordml" xmlns:w15="http://schemas.microsoft.com/office/word/2012/wordml" xmlns:w16cex="http://schemas.microsoft.com/office/word/2018/wordml/cex" xmlns:w16cid="http://schemas.microsoft.com/office/word/2016/wordml/cid" xmlns:w16="http://schemas.microsoft.com/office/word/2018/wordml" xmlns:w16du="http://schemas.microsoft.com/office/word/2023/wordml/word16du" xmlns:w16sdtdh="http://schemas.microsoft.com/office/word/2020/wordml/sdtdatahash" xmlns:w16sdtfl="http://schemas.microsoft.com/office/word/2024/wordml/sdtformatlock" xmlns:w16se="http://schemas.microsoft.com/office/word/2015/wordml/symex" xmlns:wpg="http://schemas.microsoft.com/office/word/2010/wordprocessingGroup" xmlns:wpi="http://schemas.microsoft.com/office/word/2010/wordprocessingInk" xmlns:wne="http://schemas.microsoft.com/office/word/2006/wordml" xmlns:wps="http://schemas.microsoft.com/office/word/2010/wordprocessingShape" mc:Ignorable="w14 w15 w16se w16cid w16 w16cex w16sdtdh w16sdtfl w16du wp14">
-  <w:p>
-    <w:pPr>
-      <w:pStyle w:val="a5"/>
-    </w:pPr>
-  </w:p>
-</w:hdr>
 </file>
 
 <file path=word/numbering.xml><?xml version="1.0" encoding="utf-8"?>
@@ -15404,8 +15361,7 @@
     <w:unhideWhenUsed/>
     <w:rsid w:val="008F07BB"/>
     <w:rPr>
-      <w:color w:val="0000FF" w:themeColor="hyperlink"/>
-      <w:u w:val="single"/>
+      <w:u w:val="none"/>
     </w:rPr>
   </w:style>
 </w:styles>

</xml_diff>